<commit_message>
feat: retire built-in AI image service
</commit_message>
<xml_diff>
--- a/docs/maintenance/AI开发项目_Bug修改规范.docx
+++ b/docs/maintenance/AI开发项目_Bug修改规范.docx
@@ -1512,6 +1512,55 @@
       </w:pPr>
       <w:r>
         <w:t>音频验收至少包含格式、时长、峰值/RMS、短窗口静默、循环接缝、主/回退路径、停止、关闭声音、离线缓存和旧方案禁止断言。自动测试只能验证结构与路由，最终听感必须保留真机试听结论。</w:t>
+      </w:r>
+    </w:p>
+    <w:p/>
+    <w:p>
+      <w:pPr>
+        <w:pStyle w:val="Heading1"/>
+      </w:pPr>
+      <w:r>
+        <w:t>新增规则：下线付费能力必须同时关闭入口、状态和计费端点（v811）</w:t>
+      </w:r>
+    </w:p>
+    <w:p>
+      <w:pPr>
+        <w:pStyle w:val="ListBullet"/>
+      </w:pPr>
+      <w:r>
+        <w:t>下线付费能力时必须同时检查四层：可见 UI、浏览器持久状态、前端路由判断、服务端能力与计费动作。只隐藏按钮或删除说明不等于功能已经下线。</w:t>
+      </w:r>
+    </w:p>
+    <w:p>
+      <w:pPr>
+        <w:pStyle w:val="ListBullet"/>
+      </w:pPr>
+      <w:r>
+        <w:t>服务端必须为旧客户端保留明确的“已下线”响应，并且该响应必须发生在查询余额、创建订单或扣费之前；回归测试要直接断言拒绝逻辑位于 charge 调用之前。</w:t>
+      </w:r>
+    </w:p>
+    <w:p>
+      <w:pPr>
+        <w:pStyle w:val="ListBullet"/>
+      </w:pPr>
+      <w:r>
+        <w:t>不得为了下线新订单而删除历史账单、消费类型映射或未完成订单的补偿退款。新业务入口和历史财务善后必须分开处理。</w:t>
+      </w:r>
+    </w:p>
+    <w:p>
+      <w:pPr>
+        <w:pStyle w:val="ListBullet"/>
+      </w:pPr>
+      <w:r>
+        <w:t>同类名称可能包含不同能力时必须先划清边界。例如“内置图片生成”下线不等于删除外部 AI真图、角色识图、聊天图片或付款凭证上传；测试需要同时验证删除项消失与保留项仍可用。</w:t>
+      </w:r>
+    </w:p>
+    <w:p>
+      <w:pPr>
+        <w:pStyle w:val="ListBullet"/>
+      </w:pPr>
+      <w:r>
+        <w:t>涉及旧 Service Worker 或缓存页面时必须提升发布缓存版本，避免用户继续看到并调用已经下线的旧入口。</w:t>
       </w:r>
     </w:p>
     <w:sectPr>

</xml_diff>

<commit_message>
feat: add autonomous WeChat mode and electronic pet
</commit_message>
<xml_diff>
--- a/docs/maintenance/AI开发项目_Bug修改规范.docx
+++ b/docs/maintenance/AI开发项目_Bug修改规范.docx
@@ -1561,6 +1561,128 @@
       </w:pPr>
       <w:r>
         <w:t>涉及旧 Service Worker 或缓存页面时必须提升发布缓存版本，避免用户继续看到并调用已经下线的旧入口。</w:t>
+      </w:r>
+    </w:p>
+    <w:p>
+      <w:r>
+        <w:br w:type="page"/>
+      </w:r>
+    </w:p>
+    <w:p>
+      <w:pPr>
+        <w:pStyle w:val="Heading1"/>
+      </w:pPr>
+      <w:r>
+        <w:t>新增规则：AI 自主模式必须同时隔离提示、状态和后处理（v812）</w:t>
+      </w:r>
+    </w:p>
+    <w:p>
+      <w:pPr>
+        <w:pStyle w:val="Heading2"/>
+      </w:pPr>
+      <w:r>
+        <w:t>规则</w:t>
+      </w:r>
+    </w:p>
+    <w:p>
+      <w:pPr>
+        <w:pStyle w:val="ListBullet"/>
+      </w:pPr>
+      <w:r>
+        <w:t>出现“角色像人机、系统替角色做决定”时，先按历史版本对比定位新增控制层。至少核对系统提示、动态状态、回复后强制改写和事件触发四层，不能只改表面一句文案。</w:t>
+      </w:r>
+    </w:p>
+    <w:p>
+      <w:pPr>
+        <w:pStyle w:val="ListBullet"/>
+      </w:pPr>
+      <w:r>
+        <w:t>实验/自然模式必须有单一明确开关，并同时隔离亲密度、心情值、持续情绪、猜疑、关系策略、行为规划及其状态写入。稳定模式默认行为不得顺带改变。</w:t>
+      </w:r>
+    </w:p>
+    <w:p>
+      <w:pPr>
+        <w:pStyle w:val="ListBullet"/>
+      </w:pPr>
+      <w:r>
+        <w:t>模型兜底只能恢复完成当前功能所需的能力规则，绝不能因为 allModules 或 fallback 绕过自然模式清理，重新注入心情、关系或强制反应控制器。</w:t>
+      </w:r>
+    </w:p>
+    <w:p>
+      <w:pPr>
+        <w:pStyle w:val="ListBullet"/>
+      </w:pPr>
+      <w:r>
+        <w:t>电话未接、拒接、挂断等事件应以 system 事实提供；反应属于角色本人选择。除非产品明确要求，禁止把“必须质问、必须回拨、必须发消息”写进事件提示；允许角色选择沉默时必须提供不可见的安全出口。</w:t>
+      </w:r>
+    </w:p>
+    <w:p>
+      <w:pPr>
+        <w:pStyle w:val="ListBullet"/>
+      </w:pPr>
+      <w:r>
+        <w:t>功能规则采用按话题恢复：普通聊天不加载锁软件、钱包、任务、社交等大段说明；明确谈到相关功能时再恢复完整规则。能力提示可以懒加载，真实执行链、授权校验和稳定 ID 不能删。</w:t>
+      </w:r>
+    </w:p>
+    <w:p>
+      <w:pPr>
+        <w:pStyle w:val="ListBullet"/>
+      </w:pPr>
+      <w:r>
+        <w:t>人名边界不能把语言检测当身份判断。已在人设、资料、记忆或聊天中建立的英文/外文名可以使用；设备名、App 名和玩家名必须分别取证，禁止凭一个字符串猜身份。</w:t>
+      </w:r>
+    </w:p>
+    <w:p>
+      <w:r>
+        <w:br w:type="page"/>
+      </w:r>
+    </w:p>
+    <w:p>
+      <w:pPr>
+        <w:pStyle w:val="Heading1"/>
+      </w:pPr>
+      <w:r>
+        <w:t>新增规则：代码绘制装扮必须同时登记商品和渲染实现（v812）</w:t>
+      </w:r>
+    </w:p>
+    <w:p>
+      <w:pPr>
+        <w:pStyle w:val="Heading2"/>
+      </w:pPr>
+      <w:r>
+        <w:t>规则</w:t>
+      </w:r>
+    </w:p>
+    <w:p>
+      <w:pPr>
+        <w:pStyle w:val="ListBullet"/>
+      </w:pPr>
+      <w:r>
+        <w:t>代码原生 SVG 装扮新增时必须同时完成商品目录、所属部位、价格、实时预览渲染和持久化选择；只添加商城名称不算完成。</w:t>
+      </w:r>
+    </w:p>
+    <w:p>
+      <w:pPr>
+        <w:pStyle w:val="ListBullet"/>
+      </w:pPr>
+      <w:r>
+        <w:t>同一部位超过两款装扮后应使用独立渲染函数或映射，不要继续堆叠难以审查的多层三元表达式。</w:t>
+      </w:r>
+    </w:p>
+    <w:p>
+      <w:pPr>
+        <w:pStyle w:val="ListBullet"/>
+      </w:pPr>
+      <w:r>
+        <w:t>装扮测试至少覆盖品类数量、关键商品名称、渲染函数接入和实际页面选中状态；涉及视觉布局时必须再做一次浏览器全身预览。</w:t>
+      </w:r>
+    </w:p>
+    <w:p>
+      <w:pPr>
+        <w:pStyle w:val="ListBullet"/>
+      </w:pPr>
+      <w:r>
+        <w:t>新增独立资源或脚本后必须同步主页面版本参数、Service Worker 预缓存和发布缓存名，避免新代码加载旧资源。</w:t>
       </w:r>
     </w:p>
     <w:sectPr>

</xml_diff>

<commit_message>
fix: preserve WeChat role autonomy
</commit_message>
<xml_diff>
--- a/docs/maintenance/AI开发项目_Bug修改规范.docx
+++ b/docs/maintenance/AI开发项目_Bug修改规范.docx
@@ -1683,6 +1683,95 @@
       </w:pPr>
       <w:r>
         <w:t>新增独立资源或脚本后必须同步主页面版本参数、Service Worker 预缓存和发布缓存名，避免新代码加载旧资源。</w:t>
+      </w:r>
+    </w:p>
+    <w:p>
+      <w:r>
+        <w:br w:type="page"/>
+      </w:r>
+    </w:p>
+    <w:p>
+      <w:pPr>
+        <w:pStyle w:val="Heading1"/>
+      </w:pPr>
+      <w:r>
+        <w:t>新增规则：事实注入不得升级为角色行为指令（2026-08-06）</w:t>
+      </w:r>
+    </w:p>
+    <w:p>
+      <w:r>
+        <w:t>自然/自主类模式必须把“真实发生了什么”和“角色应该怎样反应”分开。系统可以保证时间、方向、权限和执行结果准确，但不能把事实自动升级为特定情绪、动作、关系判断或追问任务。</w:t>
+      </w:r>
+    </w:p>
+    <w:p>
+      <w:pPr>
+        <w:pStyle w:val="ListBullet"/>
+      </w:pPr>
+      <w:r>
+        <w:t>时间间隔只能说明时间先后，不能默认写成冷落、失联、欠回复或要求角色翻旧账。</w:t>
+      </w:r>
+    </w:p>
+    <w:p>
+      <w:pPr>
+        <w:pStyle w:val="ListBullet"/>
+      </w:pPr>
+      <w:r>
+        <w:t>主动联系只能提供机会窗口；查岗、分享、发图、定位、来电和保持安静必须由角色选择，不能由随机数或数值性格预选。</w:t>
+      </w:r>
+    </w:p>
+    <w:p>
+      <w:pPr>
+        <w:pStyle w:val="ListBullet"/>
+      </w:pPr>
+      <w:r>
+        <w:t>后台定时器、外部事件桥、通话专用提示、输出重写器和状态后处理必须与主提示词一起审计，不能只检查 buildSystem。</w:t>
+      </w:r>
+    </w:p>
+    <w:p>
+      <w:pPr>
+        <w:pStyle w:val="ListBullet"/>
+      </w:pPr>
+      <w:r>
+        <w:t>自然模式下系统备注必须使用 system 角色，禁止伪装为 user 消息。</w:t>
+      </w:r>
+    </w:p>
+    <w:p>
+      <w:pPr>
+        <w:pStyle w:val="ListBullet"/>
+      </w:pPr>
+      <w:r>
+        <w:t>功能能力与行为控制必须解耦：可保留锁软件、来电、卡片等标签能力，但不得强迫角色使用。</w:t>
+      </w:r>
+    </w:p>
+    <w:p>
+      <w:pPr>
+        <w:pStyle w:val="ListBullet"/>
+      </w:pPr>
+      <w:r>
+        <w:t>修改后至少验证：普通聊天、久未回复、主动联系、电话静默、拒接/挂断、软件锁和稳定模式兼容性。</w:t>
+      </w:r>
+    </w:p>
+    <w:p>
+      <w:pPr>
+        <w:pStyle w:val="Heading2"/>
+      </w:pPr>
+      <w:r>
+        <w:t>新增规则：审计所有绕过主回复链的后台生成入口</w:t>
+      </w:r>
+    </w:p>
+    <w:p>
+      <w:r>
+        <w:t>自然模式修改不能只检查普通微信回复；还要检查节日、日历、电话事件、每日心情、追问定时器和标签后处理等独立入口。</w:t>
+      </w:r>
+    </w:p>
+    <w:p>
+      <w:r>
+        <w:t>事实型、用户明确配置的提醒可以保留；系统自行触发且指定角色必须祝福、发红包、吃醋、生气、催促、记仇或回拨的行为，在自然模式必须停用或改为角色可选择沉默的事实提示。</w:t>
+      </w:r>
+    </w:p>
+    <w:p>
+      <w:r>
+        <w:t>任何调整都不得绕开软件锁、远控授权、通话方向和安全边界。</w:t>
       </w:r>
     </w:p>
     <w:sectPr>

</xml_diff>

<commit_message>
docs: require version reporting after changes
</commit_message>
<xml_diff>
--- a/docs/maintenance/AI开发项目_Bug修改规范.docx
+++ b/docs/maintenance/AI开发项目_Bug修改规范.docx
@@ -1772,6 +1772,29 @@
     <w:p>
       <w:r>
         <w:t>任何调整都不得绕开软件锁、远控授权、通话方向和安全边界。</w:t>
+      </w:r>
+    </w:p>
+    <w:p>
+      <w:pPr>
+        <w:pStyle w:val="Heading2"/>
+      </w:pPr>
+      <w:r>
+        <w:t>新增规则：每次修改完成必须报告版本号</w:t>
+      </w:r>
+    </w:p>
+    <w:p>
+      <w:r>
+        <w:t>每次代码、功能、修复或维护资料修改完成后，交付说明必须明确写出当前版本号；不能只报告提交号、分支名或测试结果。</w:t>
+      </w:r>
+    </w:p>
+    <w:p>
+      <w:r>
+        <w:t>如果本轮没有升级版本号，应明确写“当前版本仍为 vXXX”；如果已经升级，应同时说明从哪个版本升级到哪个版本。</w:t>
+      </w:r>
+    </w:p>
+    <w:p>
+      <w:r>
+        <w:t>版本号必须与页面、缓存、Service Worker 及测试中实际使用的版本一致，禁止猜测或沿用过期版本。</w:t>
       </w:r>
     </w:p>
     <w:sectPr>

</xml_diff>

<commit_message>
v824 replace incoming ringtones with distinct chimes
</commit_message>
<xml_diff>
--- a/docs/maintenance/AI开发项目_Bug修改规范.docx
+++ b/docs/maintenance/AI开发项目_Bug修改规范.docx
@@ -2011,6 +2011,39 @@
       </w:pPr>
       <w:r>
         <w:t>软件锁、好友拉黑等已经按账号稳定隔离的核心链路不得因修复记忆串号而重构；先证明影响边界，再做最小范围修改。</w:t>
+      </w:r>
+    </w:p>
+    <w:p>
+      <w:pPr>
+        <w:pStyle w:val="Heading1"/>
+      </w:pPr>
+      <w:r>
+        <w:t>v824 新增规范：可选铃声必须声学可区分并验证循环接缝（2026-08-06）</w:t>
+      </w:r>
+    </w:p>
+    <w:p>
+      <w:r>
+        <w:t>多款铃声不能只改名称、频率小数或表面旋律；至少要在音高走向、双响节奏、音色谐波或整体包络中有两项明确差异，并用两两相关度或同等客观指标证明不是同一听感。</w:t>
+      </w:r>
+    </w:p>
+    <w:p>
+      <w:r>
+        <w:t>用户要求“提示音式”时禁止加入持续和弦铺底、长旋律或背景音乐结构；来电铃可以重复短提示组合，但单次循环内不得退化为每隔一秒孤立响一下的警报式纯音。</w:t>
+      </w:r>
+    </w:p>
+    <w:p>
+      <w:r>
+        <w:t>本地来电素材继续走独立 Audio/WAV 路线，不得为了复用消息提示音而把来电改回 WebAudio 振荡器；消息提示、主动拨号、来电和通话媒体必须保持互不抢占的职责边界。</w:t>
+      </w:r>
+    </w:p>
+    <w:p>
+      <w:r>
+        <w:t>每次替换循环音频必须验证：格式与时长、舒适峰值和 RMS、最长静默段、文件首尾采样跳变、三款差异、Service Worker 离线清单与新缓存版本。首次失败素材不得因‘已经能听见’而直接推送。</w:t>
+      </w:r>
+    </w:p>
+    <w:p>
+      <w:r>
+        <w:t>保留已有铃声 key 和路径可以兼容用户旧选择；若必须改路径，必须提供迁移和缓存失效策略。铃声改动不得顺带重构电话状态、角色自主决策或软件锁。</w:t>
       </w:r>
     </w:p>
     <w:sectPr>

</xml_diff>

<commit_message>
release: v1011 align AI and role model routes
</commit_message>
<xml_diff>
--- a/docs/maintenance/AI开发项目_Bug修改规范.docx
+++ b/docs/maintenance/AI开发项目_Bug修改规范.docx
@@ -8599,6 +8599,34 @@
           <w:sz w:val="21"/>
         </w:rPr>
         <w:t>Windows 自动化不能替代 Mac／Xcode 编译与真实 iPhone 验收；对已收到的某次 APNs 通知可以记录用户实测，但不得外推为全新安装包全链路已通过。</w:t>
+      </w:r>
+    </w:p>
+    <w:p>
+      <w:pPr>
+        <w:pStyle w:val="Heading1"/>
+      </w:pPr>
+      <w:r>
+        <w:t>v1011 新增规范：项目鉴权、场景模型路线与后台生成释放（2026-08-21）</w:t>
+      </w:r>
+    </w:p>
+    <w:p>
+      <w:r>
+        <w:t>Supabase Edge Function 地址和 apikey／Authorization 必须属于同一项目。迁移 endpoint 时禁止只替换 URL 或把所有兼容地址一律硬换成新 Key；应通过唯一的 endpoint→Key 选择器处理，并以新地址＋新 Key、新地址＋旧 Key、旧兼容映射三组自动测试锁定。</w:t>
+      </w:r>
+    </w:p>
+    <w:p>
+      <w:r>
+        <w:t>所有角色可见生成场景必须继承该角色实际主／副模型选择。普通微信、朋友圈、电话、共同生活或后台任务若存在独立调用点，必须逐一核对 aux／routeIndex，而不能因共用 chatAPI 就假设线路相同。</w:t>
+      </w:r>
+    </w:p>
+    <w:p>
+      <w:r>
+        <w:t>朋友圈失败不得通过固定句、旧回复复制或本地伪造掩盖。应保留真实错误，模型已有真实可见输出仅因兼容解析误清空时可以回收原始可见正文，但 JSON／控制外壳不得直接展示。</w:t>
+      </w:r>
+    </w:p>
+    <w:p>
+      <w:r>
+        <w:t>显式后台测试失败应在一次有界任务内尝试已同步的外置线路并立即释放；不得用分钟级重复任务长期占用前台同一模型。入队、模型生成、outbox 持久化、APNs 接受和客户端入聊必须分别记录，任何前一层成功都不能冒充后一层送达。</w:t>
       </w:r>
     </w:p>
     <w:sectPr>

</xml_diff>

<commit_message>
fix: stabilize v1012 voice moments album and companion
</commit_message>
<xml_diff>
--- a/docs/maintenance/AI开发项目_Bug修改规范.docx
+++ b/docs/maintenance/AI开发项目_Bug修改规范.docx
@@ -8627,6 +8627,34 @@
     <w:p>
       <w:r>
         <w:t>显式后台测试失败应在一次有界任务内尝试已同步的外置线路并立即释放；不得用分钟级重复任务长期占用前台同一模型。入队、模型生成、outbox 持久化、APNs 接受和客户端入聊必须分别记录，任何前一层成功都不能冒充后一层送达。</w:t>
+      </w:r>
+    </w:p>
+    <w:p>
+      <w:pPr>
+        <w:pStyle w:val="Heading1"/>
+      </w:pPr>
+      <w:r>
+        <w:t>v1012 新增规范：成功链保护、原生回执和位置语义（2026-08-21）</w:t>
+      </w:r>
+    </w:p>
+    <w:p>
+      <w:r>
+        <w:t>用户已经真机确认成功的朋友圈回复与后台通知属于受保护基线。后续性能修复只能替换局部渲染、加载状态或回执等待，禁止重新设计模型路由、伪造角色内容或用旧逻辑覆盖已成功链路。</w:t>
+      </w:r>
+    </w:p>
+    <w:p>
+      <w:r>
+        <w:t>原生设备命令只有收到 ok=true 且 stage=executed 才能记为成功。可以对明确短暂错误做一次有界重试；授权、稳定 ID、参数或不支持错误不得重试。控制回执不得被无关健康、屏幕时间或定位刷新阻塞。</w:t>
+      </w:r>
+    </w:p>
+    <w:p>
+      <w:r>
+        <w:t>前台读取超时必须与原生异步回调和总桥接时限协调。多个独立读取应并行，不能把每项截止串行相加；后台稍后成功而前台先失败时，应先检查前台等待窗口和读取顺序，不能误判为权限完全失效。</w:t>
+      </w:r>
+    </w:p>
+    <w:p>
+      <w:r>
+        <w:t>家庭位置必须来自真实新鲜坐标，不得写死地址或把旧缓存伪装成当前定位。只有在考虑 accuracy 后仍确定超出家庭半径，角色才可说用户在别处；前台、普通角色上下文和服务器主动消息必须使用同一算法。</w:t>
       </w:r>
     </w:p>
     <w:sectPr>

</xml_diff>

<commit_message>
fix: make North role control reviewable
</commit_message>
<xml_diff>
--- a/docs/maintenance/AI开发项目_Bug修改规范.docx
+++ b/docs/maintenance/AI开发项目_Bug修改规范.docx
@@ -8655,6 +8655,44 @@
     <w:p>
       <w:r>
         <w:t>家庭位置必须来自真实新鲜坐标，不得写死地址或把旧缓存伪装成当前定位。只有在考虑 accuracy 后仍确定超出家庭半径，角色才可说用户在别处；前台、普通角色上下文和服务器主动消息必须使用同一算法。</w:t>
+      </w:r>
+    </w:p>
+    <w:p>
+      <w:pPr>
+        <w:pStyle w:val="Heading1"/>
+      </w:pPr>
+      <w:r>
+        <w:t>公开 North 审核访问与核心远程功能透明规范（2026-08-21）</w:t>
+      </w:r>
+    </w:p>
+    <w:p>
+      <w:r>
+        <w:t>公开 App 的核心能力依赖外部控制端、账号、角色或配对时，Review Notes 必须提供永久可用的演示登录、无需审核员自行注册的预创建数据、可重复生成的新短时配对码和从授权到设备回执的逐步操作。只解释功能存在但不给可执行访问，视为审核链路未完成。</w:t>
+      </w:r>
+    </w:p>
+    <w:p>
+      <w:r>
+        <w:t>不得通过删除角色远程控制来换取通过，也不得上传私人完整小手机替代公开 North。公开 North、私人小手机和网页版的产品边界、Bundle ID、控制器租约、云项目及用户数据必须保持隔离；公开 North 与私人小手机不得同时控制同一台本人设备。</w:t>
+      </w:r>
+    </w:p>
+    <w:p>
+      <w:r>
+        <w:t>审核友好不能通过审核设备识别、TestFlight 判断、地区／日期开关、隐藏手势、固定万能码或仅审核时出现的界面实现。产品正常用户与审核员应看到同一项“角色远程管理”能力；差别只允许是审核员使用单独的受保护演示账号和预配置测试数据。</w:t>
+      </w:r>
+    </w:p>
+    <w:p>
+      <w:r>
+        <w:t>审核登录不得把邮箱、密码、owner secret、device secret、service-role key、JWT 或永久配对码写入前端、文档仓库或 App 二进制。浏览器只保留当前内存会话；服务端按 auth.uid() 限定一个预配置目标；配对码继续单次、短时失效。</w:t>
+      </w:r>
+    </w:p>
+    <w:p>
+      <w:r>
+        <w:t>角色远程命令必须区分服务器排队与设备执行。控制台、App 和 Review Notes 都要明确：只有设备应用 Managed Settings 后回传终态和新快照，才能显示完成；pending、queued 或 APNs 接受均不能冒充锁定／解锁成功。</w:t>
+      </w:r>
+    </w:p>
+    <w:p>
+      <w:r>
+        <w:t>在 PWA 根作用域新增审核入口时，必须测试已被旧 Service Worker 控制的首次导航。仅修改新 Worker 白名单不足以修复旧 Worker 的第一次拦截；优先复用历史版本已经放行的稳定公共路径，或提供不依赖旧 Worker 更新的网络入口，并用旧缓存环境实际验证。</w:t>
       </w:r>
     </w:p>
     <w:sectPr>

</xml_diff>

<commit_message>
fix: lock down North review RPC access
</commit_message>
<xml_diff>
--- a/docs/maintenance/AI开发项目_Bug修改规范.docx
+++ b/docs/maintenance/AI开发项目_Bug修改规范.docx
@@ -8693,6 +8693,24 @@
     <w:p>
       <w:r>
         <w:t>在 PWA 根作用域新增审核入口时，必须测试已被旧 Service Worker 控制的首次导航。仅修改新 Worker 白名单不足以修复旧 Worker 的第一次拦截；优先复用历史版本已经放行的稳定公共路径，或提供不依赖旧 Worker 更新的网络入口，并用旧缓存环境实际验证。</w:t>
+      </w:r>
+    </w:p>
+    <w:p>
+      <w:pPr>
+        <w:pStyle w:val="Heading1"/>
+      </w:pPr>
+      <w:r>
+        <w:t>Supabase Security Definer RPC 权限验收规范（2026-08-21）</w:t>
+      </w:r>
+    </w:p>
+    <w:p>
+      <w:r>
+        <w:t>新建 security definer RPC 时不得假设 REVOKE FROM PUBLIC 等价于禁止 anon。Hosted 项目可能通过 default privileges 直接给 anon EXECUTE；迁移应显式 REVOKE ALL ON FUNCTION ... FROM PUBLIC, anon，再向所需角色精确 GRANT。</w:t>
+      </w:r>
+    </w:p>
+    <w:p>
+      <w:r>
+        <w:t>部署完成必须在真实远端使用 has_function_privilege 分别核对 anon 与 authenticated，而不能只看 SQL 文本、RLS 状态或函数是否存在。审核账号绑定类 RPC 的合格条件是 anon=false、authenticated=true，并且所有数据选择继续以 auth.uid() 约束。</w:t>
       </w:r>
     </w:p>
     <w:sectPr>

</xml_diff>

<commit_message>
feat: add real delivery wallets and order tracking
</commit_message>
<xml_diff>
--- a/docs/maintenance/AI开发项目_Bug修改规范.docx
+++ b/docs/maintenance/AI开发项目_Bug修改规范.docx
@@ -8711,6 +8711,44 @@
     <w:p>
       <w:r>
         <w:t>部署完成必须在真实远端使用 has_function_privilege 分别核对 anon 与 authenticated，而不能只看 SQL 文本、RLS 状态或函数是否存在。审核账号绑定类 RPC 的合格条件是 anon=false、authenticated=true，并且所有数据选择继续以 auth.uid() 约束。</w:t>
+      </w:r>
+    </w:p>
+    <w:p>
+      <w:r>
+        <w:br w:type="page"/>
+      </w:r>
+    </w:p>
+    <w:p>
+      <w:r>
+        <w:rPr>
+          <w:b/>
+        </w:rPr>
+        <w:t>v1029｜真实世界副作用的双模式隔离与回执规则（2026-08-21）</w:t>
+      </w:r>
+    </w:p>
+    <w:p>
+      <w:r>
+        <w:t>凡功能同时存在虚拟剧情与真实世界副作用（下单、支付、配送、门锁、设备控制等），必须使用显式且默认关闭的真实模式开关。真实模式开启后，任何连接失败、字段缺失或授权不足都不得静默回退到虚拟结果，也不得复用虚拟成功文案。</w:t>
+      </w:r>
+    </w:p>
+    <w:p>
+      <w:r>
+        <w:t>真实搜索和展示只能显示上游实际返回字段。不得用随机数、种子、模型或前端默认值补造评分、评论数、销量、优惠券、库存、运费、配送距离、预计送达或骑手状态；缺字段就不显示。</w:t>
+      </w:r>
+    </w:p>
+    <w:p>
+      <w:r>
+        <w:t>创建订单、付款、退款、设备动作等真实副作用必须以服务端／渠道回执为最终事实。客户端发起请求、拿到付款链接或显示处理中都不等于成功；只有明确终态回执才能扣额度、写成功账单、通知角色或展示已完成。</w:t>
+      </w:r>
+    </w:p>
+    <w:p>
+      <w:r>
+        <w:t>角色可见语言继续由角色真实模型结合人设生成。系统只提供能力、权限、候选与真实结果事实，不写固定角色台词；生成失败时允许保持安静，但不得用系统模板冒充角色。角色模型无权修改消费额度、真实模式、自动付款开关、地址授权或支付授权。</w:t>
+      </w:r>
+    </w:p>
+    <w:p>
+      <w:r>
+        <w:t>金融自动化必须至少有总开关、单笔上限、周期总上限、可用额度、地址确认、价格复验、重复检测和上游风控。任一不满足时只能保留可核验的待本人处理状态。密钥、平台 Cookie、支付令牌、完整地址和银行卡资料永不进入网页源码、Bundle、日志或 Git。</w:t>
       </w:r>
     </w:p>
     <w:sectPr>

</xml_diff>

<commit_message>
feat: refine WeChat home visuals
</commit_message>
<xml_diff>
--- a/docs/maintenance/AI开发项目_Bug修改规范.docx
+++ b/docs/maintenance/AI开发项目_Bug修改规范.docx
@@ -8749,6 +8749,39 @@
     <w:p>
       <w:r>
         <w:t>金融自动化必须至少有总开关、单笔上限、周期总上限、可用额度、地址确认、价格复验、重复检测和上游风控。任一不满足时只能保留可核验的待本人处理状态。密钥、平台 Cookie、支付令牌、完整地址和银行卡资料永不进入网页源码、Bundle、日志或 Git。</w:t>
+      </w:r>
+    </w:p>
+    <w:p>
+      <w:r>
+        <w:br w:type="page"/>
+      </w:r>
+    </w:p>
+    <w:p>
+      <w:r>
+        <w:rPr>
+          <w:b/>
+        </w:rPr>
+        <w:t>v1029｜微信主界面视觉层与数据层隔离规则（2026-08-21）</w:t>
+      </w:r>
+    </w:p>
+    <w:p>
+      <w:r>
+        <w:t>仿真社交软件首页时，视觉重构必须限定在外框、专属类名、图标和展示层；不得用静态假聊天替换正式联系人、群聊、消息排序、未读、朋友圈或点击动作。预览数据只能在 NORTH_PREVIEW 路径存在。</w:t>
+      </w:r>
+    </w:p>
+    <w:p>
+      <w:r>
+        <w:t>固定磨砂导航不能只写透明色和 backdrop-filter。滚动内容必须真实延伸到导航后方，同时用固定 z-index 保证标题和按钮不移动，才能形成可验证的透视层次。</w:t>
+      </w:r>
+    </w:p>
+    <w:p>
+      <w:r>
+        <w:t>底栏选中态应由同一数据状态驱动，未选中和选中 SVG 必须成对存在；用户明确不需要的红点不得根据其他数据自动模拟。人物实心图的头部与肩部应保留可见空隙。</w:t>
+      </w:r>
+    </w:p>
+    <w:p>
+      <w:r>
+        <w:t>并行脏工作区需要单独上线时，必须从最新 origin/main 建立干净隔离工作树，只重放目标功能，更新独立缓存标识，完整测试并逐文件审查后再推送；禁止整文件暂存包含其他工作的混合文件。</w:t>
       </w:r>
     </w:p>
     <w:sectPr>

</xml_diff>

<commit_message>
release: v1031 WeChat home update
</commit_message>
<xml_diff>
--- a/docs/maintenance/AI开发项目_Bug修改规范.docx
+++ b/docs/maintenance/AI开发项目_Bug修改规范.docx
@@ -8782,6 +8782,34 @@
     <w:p>
       <w:r>
         <w:t>并行脏工作区需要单独上线时，必须从最新 origin/main 建立干净隔离工作树，只重放目标功能，更新独立缓存标识，完整测试并逐文件审查后再推送；禁止整文件暂存包含其他工作的混合文件。</w:t>
+      </w:r>
+    </w:p>
+    <w:p>
+      <w:r>
+        <w:br w:type="page"/>
+      </w:r>
+    </w:p>
+    <w:p>
+      <w:r>
+        <w:rPr>
+          <w:b/>
+        </w:rPr>
+        <w:t>v1031｜用户可见发布必须递增 BUILD（2026-08-21）</w:t>
+      </w:r>
+    </w:p>
+    <w:p>
+      <w:r>
+        <w:t>需要已安装用户看到“发现新版本”时，只更改 hotfix、Service Worker cache 或查询参数不够；APP_VER、BUILD、__NORTH_SHELL_BUILD__、入口／修复页和私人内嵌网页标识必须使用同一个更大数字。</w:t>
+      </w:r>
+    </w:p>
+    <w:p>
+      <w:r>
+        <w:t>多工作区并行时，发布前必须同时检查远端基线和其他工作区已占用的未发布版本号。已占用号不得重复赋予另一功能；选择下一个未占用号后，后续并行发布也必须顺延，不得降版。</w:t>
+      </w:r>
+    </w:p>
+    <w:p>
+      <w:r>
+        <w:t>网页版本递增不等于私人 iOS build 必须递增。未做 Mac 编译和签名时，可仅升网页，但 PhoneWebBundleInfo 和内嵌网页内容仍须与共享网页一致，并在文档中明确写出 iOS build 未变。</w:t>
       </w:r>
     </w:p>
     <w:sectPr>

</xml_diff>

<commit_message>
release: package private iOS 1.0.152
</commit_message>
<xml_diff>
--- a/docs/maintenance/AI开发项目_Bug修改规范.docx
+++ b/docs/maintenance/AI开发项目_Bug修改规范.docx
@@ -8810,6 +8810,34 @@
     <w:p>
       <w:r>
         <w:t>网页版本递增不等于私人 iOS build 必须递增。未做 Mac 编译和签名时，可仅升网页，但 PhoneWebBundleInfo 和内嵌网页内容仍须与共享网页一致，并在文档中明确写出 iOS build 未变。</w:t>
+      </w:r>
+    </w:p>
+    <w:p>
+      <w:r>
+        <w:br w:type="page"/>
+      </w:r>
+    </w:p>
+    <w:p>
+      <w:r>
+        <w:rPr>
+          <w:b/>
+        </w:rPr>
+        <w:t>v1031｜跨工作树私人包合入规则（2026-08-21）</w:t>
+      </w:r>
+    </w:p>
+    <w:p>
+      <w:r>
+        <w:t>私人包只会包含打包工作树当前实际文件，不会因另一分支已提交或已推送而自动合入。打包人必须先确认 HEAD 已包含目标提交，再重建 PhoneWeb.bundle。</w:t>
+      </w:r>
+    </w:p>
+    <w:p>
+      <w:r>
+        <w:t>并行版本已占用私人 iOS build 时，新交付使用下一个未占用 build，不得为两套不同源码发布相同 build。本次因 151 已占用而使用 152。</w:t>
+      </w:r>
+    </w:p>
+    <w:p>
+      <w:r>
+        <w:t>交付目录只保留一个最终 ZIP；必须在压缩后再检查网页版本、iOS marketing/build、PhoneWeb.bundle/index.html 数量、说明文件数量、嵌套 ZIP、临时缓存、文件数与 SHA-256。</w:t>
       </w:r>
     </w:p>
     <w:sectPr>

</xml_diff>

<commit_message>
feat: complete real delivery checkout connector
</commit_message>
<xml_diff>
--- a/docs/maintenance/AI开发项目_Bug修改规范.docx
+++ b/docs/maintenance/AI开发项目_Bug修改规范.docx
@@ -8749,6 +8749,44 @@
     <w:p>
       <w:r>
         <w:t>金融自动化必须至少有总开关、单笔上限、周期总上限、可用额度、地址确认、价格复验、重复检测和上游风控。任一不满足时只能保留可核验的待本人处理状态。密钥、平台 Cookie、支付令牌、完整地址和银行卡资料永不进入网页源码、Bundle、日志或 Git。</w:t>
+      </w:r>
+    </w:p>
+    <w:p>
+      <w:r>
+        <w:br w:type="page"/>
+      </w:r>
+    </w:p>
+    <w:p>
+      <w:r>
+        <w:rPr>
+          <w:b/>
+        </w:rPr>
+        <w:t>v1030｜异步金融回执、幂等与退款规范（2026-08-21）</w:t>
+      </w:r>
+    </w:p>
+    <w:p>
+      <w:r>
+        <w:t>任何可能先返回处理中、后由查询或 Webhook 确认终态的真实支付，都必须把结算逻辑放在统一回执处理器中；发起请求的同步分支和后续状态同步必须共用同一结算器。不得把拿到付款链接、HTTP 成功或处理中当作 paid。</w:t>
+      </w:r>
+    </w:p>
+    <w:p>
+      <w:r>
+        <w:t>创建订单、付款和退款必须使用稳定幂等请求号。请求号应在真实副作用发出前持久保存；超时重试复用原号。服务端必须按用户、订单归属和请求号去重，客户端幂等标记不能替代服务端幂等。</w:t>
+      </w:r>
+    </w:p>
+    <w:p>
+      <w:r>
+        <w:t>自动付款必须绑定用户已确认的地址指纹和授权金额。服务端支付前重验真实应付金额，严禁扣除高于授权金额的款项；客户端发现异常回执时必须停止后续自动付款、保留真实订单状态并要求人工核对。</w:t>
+      </w:r>
+    </w:p>
+    <w:p>
+      <w:r>
+        <w:t>钱包账目只由支付渠道终态回执改变：paid 首次扣款，refunded 首次返还。重复、乱序和倒退回执不得重复记账或让配送状态倒退。取消和失败不等于退款。</w:t>
+      </w:r>
+    </w:p>
+    <w:p>
+      <w:r>
+        <w:t>所有外部跳转和媒体地址必须使用明确协议白名单。平台密钥、Cookie、支付令牌、完整地址和银行卡资料不得进入网页、Bundle、Git、可见日志或角色模型上下文。</w:t>
       </w:r>
     </w:p>
     <w:sectPr>

</xml_diff>

<commit_message>
feat: complete v1037 WeChat suite and restore native input
</commit_message>
<xml_diff>
--- a/docs/maintenance/AI开发项目_Bug修改规范.docx
+++ b/docs/maintenance/AI开发项目_Bug修改规范.docx
@@ -8838,6 +8838,49 @@
     <w:p>
       <w:r>
         <w:t>交付目录只保留一个最终 ZIP；必须在压缩后再检查网页版本、iOS marketing/build、PhoneWeb.bundle/index.html 数量、说明文件数量、嵌套 ZIP、临时缓存、文件数与 SHA-256。</w:t>
+      </w:r>
+    </w:p>
+    <w:p>
+      <w:r>
+        <w:br w:type="page"/>
+      </w:r>
+    </w:p>
+    <w:p>
+      <w:r>
+        <w:rPr>
+          <w:b/>
+        </w:rPr>
+        <w:t>v1037｜移动输入控件与微信页面回归规范（2026-08-22）</w:t>
+      </w:r>
+    </w:p>
+    <w:p>
+      <w:r>
+        <w:t>移动端输入问题不得通过替换 textarea/input 元素、强制重新聚焦或固定输入区高度来修复视觉光标。优先保持原控件类型、事件绑定、selection、自动高度和系统键盘生命周期；纯视觉需求只能采用不改变交互语义的 CSS。</w:t>
+      </w:r>
+    </w:p>
+    <w:p>
+      <w:r>
+        <w:t>聊天页删除分隔背景时必须区分内容控件与承载层：保留心情气泡、回复按钮及其点击能力，只让不需要的整行容器透明、无边框、非满宽。旧好友、新好友、角色聊天和小手机好友聊天必须分别回归。</w:t>
+      </w:r>
+    </w:p>
+    <w:p>
+      <w:r>
+        <w:t>匿名好友占位头像必须走统一组件，不能因入口不同而显示 emoji、首字母或不同颜色。附近好友的性格多样化只改变虚拟资料和对话提示，不得绕过骚扰拦截、拉黑、举报或隐私边界。</w:t>
+      </w:r>
+    </w:p>
+    <w:p>
+      <w:r>
+        <w:t>微信深浅主题应作为群聊与新建群聊的全局基底；单角色气泡设置优先于全局气泡设置。浅色主题必须保留容器层次和边界，避免纯白页面与卡片完全融合。</w:t>
+      </w:r>
+    </w:p>
+    <w:p>
+      <w:r>
+        <w:t>新增微信独立页面时必须维持调用栈返回：从发现进入的听一听、搜一搜或云程应返回发现，从主页进入才返回主页。不得把微信设置与 API、模型或外置语音密钥混在同一页面。</w:t>
+      </w:r>
+    </w:p>
+    <w:p>
+      <w:r>
+        <w:t>任何涉及角色回复的改动都必须保留真实模型生成、普通回复、朋友圈回复、后台通知和外置语音配置；失败时不得伪造角色台词或用系统固定文本冒充角色。</w:t>
       </w:r>
     </w:p>
     <w:sectPr>

</xml_diff>

<commit_message>
revert: withdraw unauthorized v1037 WeChat release
</commit_message>
<xml_diff>
--- a/docs/maintenance/AI开发项目_Bug修改规范.docx
+++ b/docs/maintenance/AI开发项目_Bug修改规范.docx
@@ -8838,49 +8838,6 @@
     <w:p>
       <w:r>
         <w:t>交付目录只保留一个最终 ZIP；必须在压缩后再检查网页版本、iOS marketing/build、PhoneWeb.bundle/index.html 数量、说明文件数量、嵌套 ZIP、临时缓存、文件数与 SHA-256。</w:t>
-      </w:r>
-    </w:p>
-    <w:p>
-      <w:r>
-        <w:br w:type="page"/>
-      </w:r>
-    </w:p>
-    <w:p>
-      <w:r>
-        <w:rPr>
-          <w:b/>
-        </w:rPr>
-        <w:t>v1037｜移动输入控件与微信页面回归规范（2026-08-22）</w:t>
-      </w:r>
-    </w:p>
-    <w:p>
-      <w:r>
-        <w:t>移动端输入问题不得通过替换 textarea/input 元素、强制重新聚焦或固定输入区高度来修复视觉光标。优先保持原控件类型、事件绑定、selection、自动高度和系统键盘生命周期；纯视觉需求只能采用不改变交互语义的 CSS。</w:t>
-      </w:r>
-    </w:p>
-    <w:p>
-      <w:r>
-        <w:t>聊天页删除分隔背景时必须区分内容控件与承载层：保留心情气泡、回复按钮及其点击能力，只让不需要的整行容器透明、无边框、非满宽。旧好友、新好友、角色聊天和小手机好友聊天必须分别回归。</w:t>
-      </w:r>
-    </w:p>
-    <w:p>
-      <w:r>
-        <w:t>匿名好友占位头像必须走统一组件，不能因入口不同而显示 emoji、首字母或不同颜色。附近好友的性格多样化只改变虚拟资料和对话提示，不得绕过骚扰拦截、拉黑、举报或隐私边界。</w:t>
-      </w:r>
-    </w:p>
-    <w:p>
-      <w:r>
-        <w:t>微信深浅主题应作为群聊与新建群聊的全局基底；单角色气泡设置优先于全局气泡设置。浅色主题必须保留容器层次和边界，避免纯白页面与卡片完全融合。</w:t>
-      </w:r>
-    </w:p>
-    <w:p>
-      <w:r>
-        <w:t>新增微信独立页面时必须维持调用栈返回：从发现进入的听一听、搜一搜或云程应返回发现，从主页进入才返回主页。不得把微信设置与 API、模型或外置语音密钥混在同一页面。</w:t>
-      </w:r>
-    </w:p>
-    <w:p>
-      <w:r>
-        <w:t>任何涉及角色回复的改动都必须保留真实模型生成、普通回复、朋友圈回复、后台通知和外置语音配置；失败时不得伪造角色台词或用系统固定文本冒充角色。</w:t>
       </w:r>
     </w:p>
     <w:sectPr>

</xml_diff>

<commit_message>
release: publish v1042 memory and delivery verification fixes
</commit_message>
<xml_diff>
--- a/docs/maintenance/AI开发项目_Bug修改规范.docx
+++ b/docs/maintenance/AI开发项目_Bug修改规范.docx
@@ -8838,6 +8838,27 @@
     <w:p>
       <w:r>
         <w:t>交付目录只保留一个最终 ZIP；必须在压缩后再检查网页版本、iOS marketing/build、PhoneWeb.bundle/index.html 数量、说明文件数量、嵌套 ZIP、临时缓存、文件数与 SHA-256。</w:t>
+      </w:r>
+    </w:p>
+    <w:p/>
+    <w:p>
+      <w:r>
+        <w:t>v1042｜受保护外部平台人工验证与有限重试规范（2026-08-22）</w:t>
+      </w:r>
+    </w:p>
+    <w:p>
+      <w:r>
+        <w:t>浏览器自动化遇到平台滑块、图片选择、短信验证码或风控页时，只能检测、暂停、把窗口交给用户并在用户完成后继续；禁止自动识别、代点、绕过验证码或加入反检测规避。</w:t>
+      </w:r>
+    </w:p>
+    <w:p>
+      <w:r>
+        <w:t>每个外部操作必须同时有净自动耗时上限、人工处理上限和跨重开的任务终止上限。超时或失败只能生成一个真实终态；不得由模型回执、定时器、页面重开或副模型再次触发同一指令。下一轮必须有终态之后的新用户明确消息。</w:t>
+      </w:r>
+    </w:p>
+    <w:p>
+      <w:r>
+        <w:t>外部任务的进行中／终态提示只能约束对应功能标签，不得堵塞普通聊天；普通聊天的主模型失败后切换副模型仍按原路线执行。系统事实只供角色模型自然表达，不得用固定客服文字冒充角色。</w:t>
       </w:r>
     </w:p>
     <w:sectPr>

</xml_diff>

<commit_message>
feat: release v1043 wechat search and delivery route
</commit_message>
<xml_diff>
--- a/docs/maintenance/AI开发项目_Bug修改规范.docx
+++ b/docs/maintenance/AI开发项目_Bug修改规范.docx
@@ -8859,6 +8859,38 @@
     <w:p>
       <w:r>
         <w:t>外部任务的进行中／终态提示只能约束对应功能标签，不得堵塞普通聊天；普通聊天的主模型失败后切换副模型仍按原路线执行。系统事实只供角色模型自然表达，不得用固定客服文字冒充角色。</w:t>
+      </w:r>
+    </w:p>
+    <w:p/>
+    <w:p>
+      <w:r>
+        <w:t>v1042 补充｜真实商品入口缓存规范（2026-08-22）</w:t>
+      </w:r>
+    </w:p>
+    <w:p>
+      <w:r>
+        <w:t>可以在受控本机 profile 中缓存用户本人已经成功走通的真实商家／商品入口，以减少重复全平台搜索；不得缓存或复用价格、库存、规格、优惠和配送时效，进入后必须从当前页面重新读取。</w:t>
+      </w:r>
+    </w:p>
+    <w:p>
+      <w:r>
+        <w:t>路线键只能忽略糖度、冰度、温度、杯型等本轮偏好，不能把不同商品或不同品牌合并。路线必须设置有效期并在入口失效时删除；直达页一旦出现验证，只能暂停交给本人，禁止转入另一搜索入口反复触发风控。</w:t>
+      </w:r>
+    </w:p>
+    <w:p/>
+    <w:p>
+      <w:r>
+        <w:t>v1043｜多工作区网页／私人包一致性与外部路线缓存规范（2026-08-22）</w:t>
+      </w:r>
+    </w:p>
+    <w:p>
+      <w:r>
+        <w:t>共享网页和私人PhoneWeb.bundle同时存在改动时，发布前必须从共享清单重建私人包并执行私人转换，再逐项校验关键函数和版本号；不得用简单文件覆盖破坏私人专用转换。</w:t>
+      </w:r>
+    </w:p>
+    <w:p>
+      <w:r>
+        <w:t>受控本机只允许缓存本人已经成功走通的真实商家／商品入口，不缓存价格、库存、优惠和规格。每次直达必须重读当前页面；验证出现时停止一次，禁止为了规避验证改入口或自动代点。</w:t>
       </w:r>
     </w:p>
     <w:sectPr>

</xml_diff>

<commit_message>
feat: release v1045 wechat steps and delivery routes
</commit_message>
<xml_diff>
--- a/docs/maintenance/AI开发项目_Bug修改规范.docx
+++ b/docs/maintenance/AI开发项目_Bug修改规范.docx
@@ -8891,6 +8891,44 @@
     <w:p>
       <w:r>
         <w:t>受控本机只允许缓存本人已经成功走通的真实商家／商品入口，不缓存价格、库存、优惠和规格。每次直达必须重读当前页面；验证出现时停止一次，禁止为了规避验证改入口或自动代点。</w:t>
+      </w:r>
+    </w:p>
+    <w:p>
+      <w:r>
+        <w:br w:type="page"/>
+      </w:r>
+    </w:p>
+    <w:p>
+      <w:r>
+        <w:rPr>
+          <w:b/>
+        </w:rPr>
+        <w:t>v1045 维护规范补充：真实设备数据、本地图片与外卖路线</w:t>
+      </w:r>
+    </w:p>
+    <w:p>
+      <w:r>
+        <w:t>真实步数必须来自 DeviceMotion 或原生真实能力；不得用定时器或随机数模拟。启停、跨日归零和保存必须沿用同一份用户数据。</w:t>
+      </w:r>
+    </w:p>
+    <w:p>
+      <w:r>
+        <w:t>通话头像或背景可能是 idb 引用，渲染和回放导出前必须先解析为可显示资源；不得把 raw idb 标识直接写入 img src 或 CSS url。</w:t>
+      </w:r>
+    </w:p>
+    <w:p>
+      <w:r>
+        <w:t>角色外卖自动流程不得通过扩大搜索、绕过验证或替换商品来追求成功率。只可使用本人登记的真实直达路线；需重新核对营业、价格、商品和规格。全部路线打烊时停止并提供真实事实。</w:t>
+      </w:r>
+    </w:p>
+    <w:p>
+      <w:r>
+        <w:t>商品精确匹配只能接受候选等于保存商品，或候选完整包含保存商品；禁止用保存商品包含候选的反向规则，以免普通拿铁替代生椰拿铁。用户当次明确要求始终高于长期偏好。</w:t>
+      </w:r>
+    </w:p>
+    <w:p>
+      <w:r>
+        <w:t>失败诊断留在系统提示；角色可基于真实事实按人设自然表达，但不得用固定台词冒充模型，也不得声称已经下单、付款或配送。普通聊天主副模型回退、朋友圈、后台通知和外置语音配置不得被相邻修复覆盖。</w:t>
       </w:r>
     </w:p>
     <w:sectPr>

</xml_diff>

<commit_message>
feat: publish v1048 delivery and private mirror sync
</commit_message>
<xml_diff>
--- a/docs/maintenance/AI开发项目_Bug修改规范.docx
+++ b/docs/maintenance/AI开发项目_Bug修改规范.docx
@@ -8929,6 +8929,44 @@
     <w:p>
       <w:r>
         <w:t>失败诊断留在系统提示；角色可基于真实事实按人设自然表达，但不得用固定台词冒充模型，也不得声称已经下单、付款或配送。普通聊天主副模型回退、朋友圈、后台通知和外置语音配置不得被相邻修复覆盖。</w:t>
+      </w:r>
+    </w:p>
+    <w:p>
+      <w:r>
+        <w:br w:type="page"/>
+      </w:r>
+    </w:p>
+    <w:p>
+      <w:r>
+        <w:rPr>
+          <w:b/>
+        </w:rPr>
+        <w:t>v1048｜主设备镜像与平台验证处理规范（2026-08-23）</w:t>
+      </w:r>
+    </w:p>
+    <w:p>
+      <w:r>
+        <w:t>多端整份状态同步必须明确主设备。快照至少携带 source、revision、capturedAt/updatedAt 和版本；revision 只增不减。旧端不得自动覆盖主设备，新端首次绑定不得静默选择任一端。</w:t>
+      </w:r>
+    </w:p>
+    <w:p>
+      <w:r>
+        <w:t>检测到并发改动时，先保留本机状态并明确提示；应用远端快照前必须保存可撤回的完整快照。写云端时使用服务端条件更新或等价并发保护，条件不匹配就停止，禁止最后写入者无条件获胜。</w:t>
+      </w:r>
+    </w:p>
+    <w:p>
+      <w:r>
+        <w:t>状态同步文案必须如实区分业务状态和大型媒体。没有进入 fullBackupState 或超过云端容量的原生视频、系统媒体原文件，必须明确写为不在镜像范围内。</w:t>
+      </w:r>
+    </w:p>
+    <w:p>
+      <w:r>
+        <w:t>浏览器自动化不得隐藏、绕过或规避平台验证码和风控。允许的处理是使用真实可见浏览器、复用已登录会话、降低无意义重复搜索、暂停当前操作等待本人验证、验证完成后继续同一任务，并在超时后有限冷却。</w:t>
+      </w:r>
+    </w:p>
+    <w:p>
+      <w:r>
+        <w:t>真实外卖搜索必须有有界停止条件。已验证路线优先；门店打烊应尝试下一条匹配路线并通知最终结果；不得把第一家、第一项或模糊命中的商品当作用户指定商品，不得用角色台词掩盖系统失败。</w:t>
       </w:r>
     </w:p>
     <w:sectPr>

</xml_diff>

<commit_message>
fix: publish v1049 delivery autonomy and chat bubbles
</commit_message>
<xml_diff>
--- a/docs/maintenance/AI开发项目_Bug修改规范.docx
+++ b/docs/maintenance/AI开发项目_Bug修改规范.docx
@@ -8967,6 +8967,39 @@
     <w:p>
       <w:r>
         <w:t>真实外卖搜索必须有有界停止条件。已验证路线优先；门店打烊应尝试下一条匹配路线并通知最终结果；不得把第一家、第一项或模糊命中的商品当作用户指定商品，不得用角色台词掩盖系统失败。</w:t>
+      </w:r>
+    </w:p>
+    <w:p>
+      <w:r>
+        <w:br w:type="page"/>
+      </w:r>
+    </w:p>
+    <w:p>
+      <w:r>
+        <w:rPr>
+          <w:b/>
+        </w:rPr>
+        <w:t>v1049｜执行检索词与用户硬条件隔离规范（2026-08-23）</w:t>
+      </w:r>
+    </w:p>
+    <w:p>
+      <w:r>
+        <w:t>任何由角色或执行器为了搜索生成的 query、关键词、候选名和规格提示，都不得反向当作用户原话或用户硬条件。必须同时保留真实用户消息与执行检索词，并在选择阶段明确标注来源。</w:t>
+      </w:r>
+    </w:p>
+    <w:p>
+      <w:r>
+        <w:t>“随便点、你选、都可以、都喜欢、按你想的”等明确自主授权应视为完整选择答案。获得授权后不得继续机械追问品牌、商品、口味、糖度、温度或规格；角色可按人设和平台现有候选决定，但过敏与忌口不得放宽。</w:t>
+      </w:r>
+    </w:p>
+    <w:p>
+      <w:r>
+        <w:t>用户亲口明确指定的品牌、商品和具体规格仍必须严格匹配。缺失时错误信息要写明具体缺少项和当前真实可选项，禁止只写笼统的“规格不能满足”，也禁止暗中替换。</w:t>
+      </w:r>
+    </w:p>
+    <w:p>
+      <w:r>
+        <w:t>聊天头像与可变高度气泡不得使用整块垂直居中。多行消息应以顶部为稳定基线；气泡尖角的位置必须相对气泡顶部固定，并分别检查一行、多行、双方和黑白主题。</w:t>
       </w:r>
     </w:p>
     <w:sectPr>

</xml_diff>

<commit_message>
fix: stabilize structured real delivery flow
</commit_message>
<xml_diff>
--- a/docs/maintenance/AI开发项目_Bug修改规范.docx
+++ b/docs/maintenance/AI开发项目_Bug修改规范.docx
@@ -9000,6 +9000,59 @@
     <w:p>
       <w:r>
         <w:t>聊天头像与可变高度气泡不得使用整块垂直居中。多行消息应以顶部为稳定基线；气泡尖角的位置必须相对气泡顶部固定，并分别检查一行、多行、双方和黑白主题。</w:t>
+      </w:r>
+    </w:p>
+    <w:p>
+      <w:r>
+        <w:br w:type="page"/>
+      </w:r>
+    </w:p>
+    <w:p>
+      <w:pPr>
+        <w:pStyle w:val="Heading1"/>
+      </w:pPr>
+      <w:r>
+        <w:t>v1054：真实外卖当前回合授权、同任务续接与结算终检规范（2026-08-24）</w:t>
+      </w:r>
+    </w:p>
+    <w:p>
+      <w:r>
+        <w:t>授权不得从最近聊天拼接文本中反推。只有当前 actionMeta.userText 的明确用户授权，或当前真实模型返回的结构化自主点单动作，才可创建新 taskId；“饿了、没吃饭、想吃东西”等普通关键词、旧消息、页面重绘和后台恢复均不得新建任务。</w:t>
+      </w:r>
+    </w:p>
+    <w:p>
+      <w:r>
+        <w:t>客户端和服务端必须共同校验 taskId、authorizationSource、roleId、accountId、sessionId、turnId、messageId、createdAt、intentSummary、status、revision 与用户约束。同一 taskId 同一 revision 的搜索和创建必须幂等；任务进入 completed、canceled、expired 或 failed 后不得恢复。</w:t>
+      </w:r>
+    </w:p>
+    <w:p>
+      <w:r>
+        <w:t>商品或规格未找到不等于授权任务立即终结。客户端需要追问时，把任务置为 awaiting_clarification；用户回答后只提高原 taskId 的 revision，并从原门店、原商品和原清单进度继续。服务端搜索异常不得先把授权记录永久标为 failed，否则合法澄清会被错误拒绝。</w:t>
+      </w:r>
+    </w:p>
+    <w:p>
+      <w:r>
+        <w:t>结构化商品清单是执行权威源。自然聊天原文只提供明确规格、禁选、口味和自主范围，绝不能覆盖或改写已解析商品清单；门店、商品和规格必须分层传递。相似短词可以命中带修饰词的真实单品，但不得跨类别、套餐、双杯、两份装或无关首卡。</w:t>
+      </w:r>
+    </w:p>
+    <w:p>
+      <w:r>
+        <w:t>所有品类共用结算终检：明确商品与规格全部完成、购物车数量正确且无禁止项、达到起送价、优惠券检查得到 applied 或 none 四项缺一不可。平台控件异步出现时应等待并重读；不能因为金额足够就提前提交，也不能用重复主商品凑单。</w:t>
+      </w:r>
+    </w:p>
+    <w:p>
+      <w:r>
+        <w:t>平台可能把同一套餐规格字幕完整重复两遍。只允许折叠完全相同且覆盖整段的重复文本，不得模糊删除相似但不同的规格；最终订单卡片、聊天结果和偏好记忆都使用规范化后的真实规格。</w:t>
+      </w:r>
+    </w:p>
+    <w:p>
+      <w:r>
+        <w:t>训练状态必须如实描述。奶茶、咖啡、麦当劳、KFC、粥可作为当前高成功率随机池；水果、甜品和其他食物仍可按明确要求或角色具体判断尝试，但不得标成已训练稳定，也不得为了提高表面成功率删除能力或伪造结果。</w:t>
+      </w:r>
+    </w:p>
+    <w:p>
+      <w:r>
+        <w:t>私人包同步不得使用过时转换回退已确认的共享功能。每次重新 stage 后必须检查网页／私人 app.js 与 delivery.js 内容一致、PhoneWeb.bundle 入口唯一，并逐项核对 manifest 中新增运行时资源；资源只在网页存在而未进入 bundle 也属于 P0 发布回归。</w:t>
       </w:r>
     </w:p>
     <w:sectPr>

</xml_diff>

<commit_message>
fix: stabilize shared life pet battery and transfers
</commit_message>
<xml_diff>
--- a/docs/maintenance/AI开发项目_Bug修改规范.docx
+++ b/docs/maintenance/AI开发项目_Bug修改规范.docx
@@ -9053,6 +9053,39 @@
     <w:p>
       <w:r>
         <w:t>私人包同步不得使用过时转换回退已确认的共享功能。每次重新 stage 后必须检查网页／私人 app.js 与 delivery.js 内容一致、PhoneWeb.bundle 入口唯一，并逐项核对 manifest 中新增运行时资源；资源只在网页存在而未进入 bundle 也属于 P0 发布回归。</w:t>
+      </w:r>
+    </w:p>
+    <w:p>
+      <w:pPr>
+        <w:pStyle w:val="Heading1"/>
+      </w:pPr>
+      <w:r>
+        <w:t>v1057／1.0.180 共同生活、宠物、电量与微信转账整合规范（2026-08-24）</w:t>
+      </w:r>
+    </w:p>
+    <w:p>
+      <w:r>
+        <w:t>触摸与点击规范：拖拽、长按或 pointer 捕获结束后，必须考虑浏览器额外派发的 click。对同一动作使用短时去重闸门；闸门只吞掉合成重复动作，真正点击和程序化调用必须保留。交互入口优先使用真实 button，并补齐 type、aria-label 和默认边框／内边距复位。</w:t>
+      </w:r>
+    </w:p>
+    <w:p>
+      <w:r>
+        <w:t>网页电量规范：只有 navigator.getBattery 可用时才能声明网页读取到真实电量。BatteryManager 必须在 pageshow、focus 和 visibilitychange 恢复时刷新，并避免重复监听。不支持 Battery API 的 Safari 不得用固定百分比冒充真实值。私人原生桥电量与网页 Battery API 是两条独立能力，文案和测试不得混淆。</w:t>
+      </w:r>
+    </w:p>
+    <w:p>
+      <w:r>
+        <w:t>转账状态规范：pending、received、refunded 必须由同一消息对象和幂等字段驱动；存档指纹需覆盖状态、时间与钱包结算标记。卡片点击只进入明细，不能直接改变余额；收款或退还只允许执行一次，历史辅助回执不得重复渲染。</w:t>
+      </w:r>
+    </w:p>
+    <w:p>
+      <w:r>
+        <w:t>并行同步规范：当根网页仍可能被另一项任务收尾时，不能把旧 Bundle 反向覆盖根文件。每次发布前重新做根／私人逐行比较；任何晚到的根网页有效改动都要精确同步，然后重新运行受影响专项和全量测试。</w:t>
+      </w:r>
+    </w:p>
+    <w:p>
+      <w:r>
+        <w:t>发布规范：版本号、Service Worker BUILD／HOTFIX、入口资源查询参数、PhoneWeb.bundle Info.plist、Xcode build／marketing version、原生 build marker、测试断言和安装说明必须同批更新。MacReady ZIP 只表示源码结构已检查；未在 Mac 编译签名和真机安装时必须明确写未验证。</w:t>
       </w:r>
     </w:p>
     <w:sectPr>

</xml_diff>

<commit_message>
fix: stabilize cohab calls storage transfers and offline input
</commit_message>
<xml_diff>
--- a/docs/maintenance/AI开发项目_Bug修改规范.docx
+++ b/docs/maintenance/AI开发项目_Bug修改规范.docx
@@ -9086,6 +9086,44 @@
     <w:p>
       <w:r>
         <w:t>发布规范：版本号、Service Worker BUILD／HOTFIX、入口资源查询参数、PhoneWeb.bundle Info.plist、Xcode build／marketing version、原生 build marker、测试断言和安装说明必须同批更新。MacReady ZIP 只表示源码结构已检查；未在 Mac 编译签名和真机安装时必须明确写未验证。</w:t>
+      </w:r>
+    </w:p>
+    <w:p>
+      <w:pPr>
+        <w:pStyle w:val="Heading1"/>
+      </w:pPr>
+      <w:r>
+        <w:t>v1058／1.0.181 共同生活、存储散热、转账回复与约会输入修复规范（2026-08-24）</w:t>
+      </w:r>
+    </w:p>
+    <w:p>
+      <w:r>
+        <w:t>共同生活交互规范：入口、开关、测试和返回必须可单独点击，不能由角色地点或上班／在家状态阻断。触摸与合成 click 必须做短时幂等；状态变更立即保存。共同生活只提供上下文，不等于来电授权。</w:t>
+      </w:r>
+    </w:p>
+    <w:p>
+      <w:r>
+        <w:t>主动来电规范：必须同时满足当前用户消息明确要求角色打来、当前真实模型结构化决定来电、账号／角色／会话／当前回合一致。旧消息、页面重绘、后台恢复、定时器和普通聊天不得创建来电；模型可选择不打，系统不得代替模型伪造决定。</w:t>
+      </w:r>
+    </w:p>
+    <w:p>
+      <w:r>
+        <w:t>性能与存储规范：异步批处理失败必须有上限、退避和可恢复条件，不能在前台循环重试造成发热。浏览器 localStorage／IndexedDB 配额、原生应用容器容量和整机剩余空间必须分别描述；拿不到原生容量时不得用 5MB 等网页配额冒充手机总空间。</w:t>
+      </w:r>
+    </w:p>
+    <w:p>
+      <w:r>
+        <w:t>角色事件规范：转账收下或退还等事实通过既有真实模型路由传递，事件方向必须写清楚，重复动作只能产生一次状态变化和一次回复。真实模型没有输出时允许既有的一次有限重试，但禁止固定假话冒充角色。</w:t>
+      </w:r>
+    </w:p>
+    <w:p>
+      <w:r>
+        <w:t>多行输入规范：textarea 应按 scrollHeight 自适应但必须设最小／最大高度；达到上限后只允许内部滚动，按钮底对齐，正文滚动区不能被覆盖。监听必须覆盖首次动态渲染，样式和脚本应同时同步到网页、私人小手机入口和私人 index。</w:t>
+      </w:r>
+    </w:p>
+    <w:p>
+      <w:r>
+        <w:t>发布规范：版本、Service Worker BUILD／HOTFIX、资源查询参数、Bundle Info、Xcode build／marketing version、原生 marker、测试断言、安装说明和私人 ZIP 必须同批更新。MacReady 只代表源码结构与打包检查通过；没有 Mac 编译、签名和真机安装就必须明确写未验证。</w:t>
       </w:r>
     </w:p>
     <w:sectPr>

</xml_diff>

<commit_message>
release: v1059 delivery matching and life integration
</commit_message>
<xml_diff>
--- a/docs/maintenance/AI开发项目_Bug修改规范.docx
+++ b/docs/maintenance/AI开发项目_Bug修改规范.docx
@@ -9124,6 +9124,34 @@
     <w:p>
       <w:r>
         <w:t>发布规范：版本、Service Worker BUILD／HOTFIX、资源查询参数、Bundle Info、Xcode build／marketing version、原生 marker、测试断言、安装说明和私人 ZIP 必须同批更新。MacReady 只代表源码结构与打包检查通过；没有 Mac 编译、签名和真机安装就必须明确写未验证。</w:t>
+      </w:r>
+    </w:p>
+    <w:p>
+      <w:pPr>
+        <w:pStyle w:val="Heading1"/>
+      </w:pPr>
+      <w:r>
+        <w:t>v1059／1.0.182 真实外卖匹配与生活功能整合修复规范（2026-08-25）</w:t>
+      </w:r>
+    </w:p>
+    <w:p>
+      <w:r>
+        <w:t>商品匹配规范：普通餐食可接受用户明确给出的至少两个连续核心字；奶茶、咖啡等已训练饮品不得借此绕过规格。用户说出的套餐、份数、口味等限制必须逐项存在于真实标题或真实规格中。</w:t>
+      </w:r>
+    </w:p>
+    <w:p>
+      <w:r>
+        <w:t>多商品规范：主商品与每个附加商品必须来自结构化清单并逐个搜索、加购、核验。自然语言说明不能创造额外商品；达到起送价不能提前结束；除明确允许的零食凑单外，同名商品不得重复。</w:t>
+      </w:r>
+    </w:p>
+    <w:p>
+      <w:r>
+        <w:t>状态与支付规范：每次合法启动绑定唯一 taskId、角色、账号、会话和回合；旧消息与页面恢复只能恢复未结束任务。结算前必须同时满足明确商品全部完成、达到起送价和优惠券已核验；最终付款只由本人完成。</w:t>
+      </w:r>
+    </w:p>
+    <w:p>
+      <w:r>
+        <w:t>发布规范：网页、私人 Bundle、电脑自动化服务、测试、版本号、安装说明和部署源码包必须同批更新。部署包不得包含 .env、Cookie、profile、验证码、支付资料、日志或私人云密钥。没有 Mac 编译和真机验收时必须如实标注。</w:t>
       </w:r>
     </w:p>
     <w:sectPr>

</xml_diff>

<commit_message>
release: v1060 busy role and delivery clarification
</commit_message>
<xml_diff>
--- a/docs/maintenance/AI开发项目_Bug修改规范.docx
+++ b/docs/maintenance/AI开发项目_Bug修改规范.docx
@@ -9152,6 +9152,34 @@
     <w:p>
       <w:r>
         <w:t>发布规范：网页、私人 Bundle、电脑自动化服务、测试、版本号、安装说明和部署源码包必须同批更新。部署包不得包含 .env、Cookie、profile、验证码、支付资料、日志或私人云密钥。没有 Mac 编译和真机验收时必须如实标注。</w:t>
+      </w:r>
+    </w:p>
+    <w:p>
+      <w:pPr>
+        <w:pStyle w:val="Heading1"/>
+      </w:pPr>
+      <w:r>
+        <w:t>v1060／1.0.183 微信忙碌与外卖澄清续接规范（2026-08-25）</w:t>
+      </w:r>
+    </w:p>
+    <w:p>
+      <w:r>
+        <w:t>忙碌规范：测试开关只延后普通用户消息的回复；功能事件仍走原可靠链路。关闭时必须使用真实模型按角色人设回应，生成失败保留待回复消息，禁止固定话术冒充角色。</w:t>
+      </w:r>
+    </w:p>
+    <w:p>
+      <w:r>
+        <w:t>澄清规范：自然答案只能续接当前角色、账号、会话下已有且未结束的 minimum_order 任务。候选必须来自角色本轮真实可见列举；单选只取明确名称，全部选择必须有都要、两个都要、全加等明确表达。</w:t>
+      </w:r>
+    </w:p>
+    <w:p>
+      <w:r>
+        <w:t>幂等规范：续接沿用原 taskId 和原主商品；同一 messageId 不得二次执行。已完成、失败、取消、过期任务以及普通聊天关键词均不得由补偿逻辑重新启动。</w:t>
+      </w:r>
+    </w:p>
+    <w:p>
+      <w:r>
+        <w:t>发布规范：网页、私人 Bundle、测试、版本号和安装包同批更新。未做 Mac 编译、签名和真机验收时，交付说明必须明确标注。</w:t>
       </w:r>
     </w:p>
     <w:sectPr>

</xml_diff>

<commit_message>
release: v1061 delivery consent and autonomy
</commit_message>
<xml_diff>
--- a/docs/maintenance/AI开发项目_Bug修改规范.docx
+++ b/docs/maintenance/AI开发项目_Bug修改规范.docx
@@ -9180,6 +9180,34 @@
     <w:p>
       <w:r>
         <w:t>发布规范：网页、私人 Bundle、测试、版本号和安装包同批更新。未做 Mac 编译、签名和真机验收时，交付说明必须明确标注。</w:t>
+      </w:r>
+    </w:p>
+    <w:p>
+      <w:pPr>
+        <w:pStyle w:val="Heading1"/>
+      </w:pPr>
+      <w:r>
+        <w:t>v1061／1.0.184 外卖同意直传与角色自主发起规范（2026-08-25）</w:t>
+      </w:r>
+    </w:p>
+    <w:p>
+      <w:r>
+        <w:t>自然回复规范：角色可见回复必须继续来自真实模型。结构化动作缺失时最多补判一次，补判结果只用于动作，不显示固定或伪造台词。</w:t>
+      </w:r>
+    </w:p>
+    <w:p>
+      <w:r>
+        <w:t>授权规范：新任务必须绑定当前角色、账号、会话、消息与回合；角色自主点单必须是当前真实模型明确输出的结构化主动关心动作，不能由饿了、没吃饭等关键词直接启动。</w:t>
+      </w:r>
+    </w:p>
+    <w:p>
+      <w:r>
+        <w:t>续接规范：已有澄清先于新任务补判，回答必须沿用原 taskId 和原进度。同一 messageId 重复调用不得二次启动、二次搜索或重复加购。</w:t>
+      </w:r>
+    </w:p>
+    <w:p>
+      <w:r>
+        <w:t>发布规范：网页、私人 Bundle、测试、版本号、维护文档和安装包同批更新。未做 Mac 编译、签名和真机验收时必须如实标注。</w:t>
       </w:r>
     </w:p>
     <w:sectPr>

</xml_diff>

<commit_message>
fix: resume delivery clarifications from role approvals
</commit_message>
<xml_diff>
--- a/docs/maintenance/AI开发项目_Bug修改规范.docx
+++ b/docs/maintenance/AI开发项目_Bug修改规范.docx
@@ -9208,6 +9208,34 @@
     <w:p>
       <w:r>
         <w:t>发布规范：网页、私人 Bundle、测试、版本号、维护文档和安装包同批更新。未做 Mac 编译、签名和真机验收时必须如实标注。</w:t>
+      </w:r>
+    </w:p>
+    <w:p>
+      <w:pPr>
+        <w:pStyle w:val="Heading1"/>
+      </w:pPr>
+      <w:r>
+        <w:t>v1062／1.0.185 外卖结构化动作兼容规范（2026-08-25）</w:t>
+      </w:r>
+    </w:p>
+    <w:p>
+      <w:r>
+        <w:t>解析规范：前置动作检测与最终执行器必须接受同一组括号和分隔符格式。任何新增标签格式都必须用端到端测试证明从检测、规范化到执行完整可达。</w:t>
+      </w:r>
+    </w:p>
+    <w:p>
+      <w:r>
+        <w:t>续接规范：起送价候选必须绑定原 taskId、角色、账号和会话。用户回答“都要”只能选择该任务里由角色明确列出的候选，不能把普通聊天食物名或平台任意商品当作授权。</w:t>
+      </w:r>
+    </w:p>
+    <w:p>
+      <w:r>
+        <w:t>幂等规范：同一 messageId 重复处理不得二次搜索、二次加购或新建任务；完成、取消、过期任务不得恢复。</w:t>
+      </w:r>
+    </w:p>
+    <w:p>
+      <w:r>
+        <w:t>保护规范：外卖修复不得改变普通角色回复、朋友圈回复、后台通知、远控字幕、共同生活或外置语音配置；未完成 Mac 与真机验证时必须如实标注。</w:t>
       </w:r>
     </w:p>
     <w:sectPr>

</xml_diff>

<commit_message>
fix: restore delivery starts after role approval
</commit_message>
<xml_diff>
--- a/docs/maintenance/AI开发项目_Bug修改规范.docx
+++ b/docs/maintenance/AI开发项目_Bug修改规范.docx
@@ -9236,6 +9236,34 @@
     <w:p>
       <w:r>
         <w:t>保护规范：外卖修复不得改变普通角色回复、朋友圈回复、后台通知、远控字幕、共同生活或外置语音配置；未完成 Mac 与真机验证时必须如实标注。</w:t>
+      </w:r>
+    </w:p>
+    <w:p>
+      <w:pPr>
+        <w:pStyle w:val="Heading1"/>
+      </w:pPr>
+      <w:r>
+        <w:t>v1063／1.0.186 外卖角色同意直传规范（2026-08-25）</w:t>
+      </w:r>
+    </w:p>
+    <w:p>
+      <w:r>
+        <w:t>触发规范：当前用户消息明确提出点吃的，当前真实角色回复明确同意，即可直接交给自动化。允许常见口语、只说商品和多件清单；不得要求固定完整商品名或固定一句同意词。</w:t>
+      </w:r>
+    </w:p>
+    <w:p>
+      <w:r>
+        <w:t>安全规范：宽松只放在语言识别层，不放宽授权身份层。角色、账号、会话、turnId、messageId、当前消息和任务状态必须一致；普通聊天、明确拒绝、旧消息、重绘与后台恢复不能创建新任务。</w:t>
+      </w:r>
+    </w:p>
+    <w:p>
+      <w:r>
+        <w:t>幂等规范：每次合法启动只生成一个 taskId；同 messageId 或同 actionKey 重复处理不得再次搜索、加购或新建任务。澄清回答续接原 taskId，不重新执行首单意图。</w:t>
+      </w:r>
+    </w:p>
+    <w:p>
+      <w:r>
+        <w:t>回归规范：必须用可执行模拟覆盖从角色自然同意到真实 search 请求的整条链路，不能只断言函数或提示词存在。发布前同时检查普通角色回复、朋友圈回复、后台通知、远控字幕和外置语音配置未改路由。</w:t>
       </w:r>
     </w:p>
     <w:sectPr>

</xml_diff>

<commit_message>
fix delivery clarification resume and gateway recovery
</commit_message>
<xml_diff>
--- a/docs/maintenance/AI开发项目_Bug修改规范.docx
+++ b/docs/maintenance/AI开发项目_Bug修改规范.docx
@@ -9264,6 +9264,34 @@
     <w:p>
       <w:r>
         <w:t>回归规范：必须用可执行模拟覆盖从角色自然同意到真实 search 请求的整条链路，不能只断言函数或提示词存在。发布前同时检查普通角色回复、朋友圈回复、后台通知、远控字幕和外置语音配置未改路由。</w:t>
+      </w:r>
+    </w:p>
+    <w:p>
+      <w:pPr>
+        <w:pStyle w:val="Heading1"/>
+      </w:pPr>
+      <w:r>
+        <w:t>v1064／1.0.187 外卖续单与网关恢复规范（2026-08-25）</w:t>
+      </w:r>
+    </w:p>
+    <w:p>
+      <w:r>
+        <w:t>续单规范：用户对起送价澄清的回答必须绑定原 taskId，保留原门店、原主商品和完成清单；不得重新执行首单意图，不得重复添加已完成商品。</w:t>
+      </w:r>
+    </w:p>
+    <w:p>
+      <w:r>
+        <w:t>页面规范：平台加购、关闭购物车或切换规格后可能异步重绘。自动化必须先做有上限的被动重读，只有权威页面状态稳定后才能继续加购或结算；被动重读不得转化成新的搜索。</w:t>
+      </w:r>
+    </w:p>
+    <w:p>
+      <w:r>
+        <w:t>金额规范：短缺金额不是起送门槛。存在购物车实付和短缺时，门槛为二者之和；没有可靠金额时应暂停说明，不能伪造阈值。</w:t>
+      </w:r>
+    </w:p>
+    <w:p>
+      <w:r>
+        <w:t>网关规范：仅对通用、无具体业务错误的 HTTP 502 做一次同体同 taskId 重试；支付、取消和其他不可安全重复动作不得自动重试。发布前必须验证普通回复、朋友圈、后台通知、远控字幕和外置语音配置未受影响。</w:t>
       </w:r>
     </w:p>
     <w:sectPr>

</xml_diff>

<commit_message>
fix(delivery): keep clarification revisions continuous
</commit_message>
<xml_diff>
--- a/docs/maintenance/AI开发项目_Bug修改规范.docx
+++ b/docs/maintenance/AI开发项目_Bug修改规范.docx
@@ -9292,6 +9292,34 @@
     <w:p>
       <w:r>
         <w:t>网关规范：仅对通用、无具体业务错误的 HTTP 502 做一次同体同 taskId 重试；支付、取消和其他不可安全重复动作不得自动重试。发布前必须验证普通回复、朋友圈、后台通知、远控字幕和外置语音配置未受影响。</w:t>
+      </w:r>
+    </w:p>
+    <w:p>
+      <w:pPr>
+        <w:pStyle w:val="Heading1"/>
+      </w:pPr>
+      <w:r>
+        <w:t>v1065／1.0.188 外卖任务修订与错误分类规范（2026-08-25）</w:t>
+      </w:r>
+    </w:p>
+    <w:p>
+      <w:r>
+        <w:t>修订规范：创建任务时修订为 1；每次系统新发出一个澄清问题只增加一次；用户回答该问题时沿用当前修订，不得再次增加。适配器应接受同修订的幂等重试或严格 +1 的新阶段，拒绝跳级。</w:t>
+      </w:r>
+    </w:p>
+    <w:p>
+      <w:r>
+        <w:t>续单规范：澄清回答必须复用原 taskId、角色、账号、会话、门店、商品进度和已完成清单；不得重新执行 roleRequestIntent，不得重复主商品，不得从旧消息或页面恢复中创建新任务。</w:t>
+      </w:r>
+    </w:p>
+    <w:p>
+      <w:r>
+        <w:t>错误规范：任务、修订、澄清、约束和状态冲突属于 HTTP 409；只有真实上游无响应或网关故障才是 502。界面必须保留可执行原因，不能把程序状态错误说成平台搜索不到。</w:t>
+      </w:r>
+    </w:p>
+    <w:p>
+      <w:r>
+        <w:t>发布规范：至少测试同 taskId 幂等、完成/过期/取消不可恢复、普通聊天不触发、当前回合结构化动作可触发、澄清不新建任务，以及普通回复、朋友圈、后台通知、远控字幕和外置语音配置隔离。</w:t>
       </w:r>
     </w:p>
     <w:sectPr>

</xml_diff>

<commit_message>
release: v1066 companion date formatter thermal repair
</commit_message>
<xml_diff>
--- a/docs/maintenance/AI开发项目_Bug修改规范.docx
+++ b/docs/maintenance/AI开发项目_Bug修改规范.docx
@@ -9320,6 +9320,39 @@
     <w:p>
       <w:r>
         <w:t>发布规范：至少测试同 taskId 幂等、完成/过期/取消不可恢复、普通聊天不触发、当前回合结构化动作可触发、澄清不新建任务，以及普通回复、朋友圈、后台通知、远控字幕和外置语音配置隔离。</w:t>
+      </w:r>
+    </w:p>
+    <w:p>
+      <w:pPr>
+        <w:pStyle w:val="Heading1"/>
+      </w:pPr>
+      <w:r>
+        <w:t>v1066／1.0.189 WebContent 性能取证与修复规范（2026-08-25）</w:t>
+      </w:r>
+    </w:p>
+    <w:p>
+      <w:r>
+        <w:t>取证规范：偶发卡顿和发热必须优先取得 Instruments Time Profiler、Hangs 与 Thermal State；使用官方导出的表格或已符号化调用栈。未经符号化的原始地址不得直接映射为项目函数。</w:t>
+      </w:r>
+    </w:p>
+    <w:p>
+      <w:r>
+        <w:t>因果规范：修改前必须同时给出热点调用链、首次出现时间与代码调度时间。只有三者吻合才进入修复；没有新变量时禁止重复放慢全部定时器、关闭后台能力或重写稳定链路。</w:t>
+      </w:r>
+    </w:p>
+    <w:p>
+      <w:r>
+        <w:t>实现规范：高频或延迟定时器内不得重复构造 Intl formatter、正则、解析器或大对象；可由同设备本地日期完成时走无 Intl 快速路径，确需时区格式化时按稳定键缓存。不得用旧快照或伪数据冒充实时结果。</w:t>
+      </w:r>
+    </w:p>
+    <w:p>
+      <w:r>
+        <w:t>保护规范：性能修复不得改变真实模型回复、朋友圈、APNs 与消息落库、远控字幕、伴生真实数据、通话、外置语音配置和共同相册。系统进度或固定文本不得冒充角色回复。</w:t>
+      </w:r>
+    </w:p>
+    <w:p>
+      <w:r>
+        <w:t>发布规范：自动测试只能证明源码回归边界；MacReady 不等于已编译或真机已修好。版本、Bundle、Xcode build、安装说明、维护记录和 ZIP 必须一致，真机结果需单独记录。</w:t>
       </w:r>
     </w:p>
     <w:sectPr>

</xml_diff>

<commit_message>
release: v1067 private Intl WebContent recovery
</commit_message>
<xml_diff>
--- a/docs/maintenance/AI开发项目_Bug修改规范.docx
+++ b/docs/maintenance/AI开发项目_Bug修改规范.docx
@@ -9353,6 +9353,39 @@
     <w:p>
       <w:r>
         <w:t>发布规范：自动测试只能证明源码回归边界；MacReady 不等于已编译或真机已修好。版本、Bundle、Xcode build、安装说明、维护记录和 ZIP 必须一致，真机结果需单独记录。</w:t>
+      </w:r>
+    </w:p>
+    <w:p>
+      <w:pPr>
+        <w:pStyle w:val="Heading1"/>
+      </w:pPr>
+      <w:r>
+        <w:t>v1067／1.0.190 私人 WebContent 性能修复规范（2026-08-25）</w:t>
+      </w:r>
+    </w:p>
+    <w:p>
+      <w:r>
+        <w:t>证据门槛：偶发卡顿发热必须以同一安装版本的 Time Profiler、Hangs 和 Thermal State 为准；调用栈、持续时间和用户复现时间必须能互相对应。没有新证据时禁止重复修改同一处。</w:t>
+      </w:r>
+    </w:p>
+    <w:p>
+      <w:r>
+        <w:t>完整性门槛：修复某个 Intl 入口后，必须静态搜索和动态拦截私人 App 的其余 Intl/toLocaleString 热路径；只修一处但仍有同类入口时，不得称为根因已修复。网页版需要的国际化能力应单独保留。</w:t>
+      </w:r>
+    </w:p>
+    <w:p>
+      <w:r>
+        <w:t>恢复门槛：WKWebView WebContent 终止可以重载，但必须限制次数、保留原生权威存档并禁止清数据；禁止无上限重载造成更严重发热和闪屏。</w:t>
+      </w:r>
+    </w:p>
+    <w:p>
+      <w:r>
+        <w:t>保护边界：不得修改真实模型回复、朋友圈真实回复、APNs 与消息落库、远控真实字幕、伴生真实数据、通话、内外置语音配置、共同相册和私人/网页能力隔离。系统文字不得冒充 AI，旧快照不得冒充实时数据。</w:t>
+      </w:r>
+    </w:p>
+    <w:p>
+      <w:r>
+        <w:t>发布门槛：版本号、网页壳、私人 Bundle、Xcode marketing/build、维护记录、自动测试和 ZIP 必须一致；使用显式文件列表提交，禁止 git add -A、git clean、reset --hard 和整版旧文件覆盖。MacReady 不等于 Mac 编译或真机验证。</w:t>
       </w:r>
     </w:p>
     <w:sectPr>

</xml_diff>

<commit_message>
fix: stabilize private WebContent recovery
</commit_message>
<xml_diff>
--- a/docs/maintenance/AI开发项目_Bug修改规范.docx
+++ b/docs/maintenance/AI开发项目_Bug修改规范.docx
@@ -9386,6 +9386,39 @@
     <w:p>
       <w:r>
         <w:t>发布门槛：版本号、网页壳、私人 Bundle、Xcode marketing/build、维护记录、自动测试和 ZIP 必须一致；使用显式文件列表提交，禁止 git add -A、git clean、reset --hard 和整版旧文件覆盖。MacReady 不等于 Mac 编译或真机验证。</w:t>
+      </w:r>
+    </w:p>
+    <w:p>
+      <w:r>
+        <w:br w:type="page"/>
+      </w:r>
+    </w:p>
+    <w:p>
+      <w:r>
+        <w:rPr>
+          <w:b/>
+        </w:rPr>
+        <w:t>v1069／私人 1.0.193 WKWebView 卡顿发热修改规范（2026-08-25）</w:t>
+      </w:r>
+    </w:p>
+    <w:p>
+      <w:r>
+        <w:t>私人 App 出现混合页面、白屏和屏保跳转时，先区分 WebContent 终止恢复、内存增长、同步大数据扫描和页面本身未统一改版；不得把视觉差异直接写成缓存命中。</w:t>
+      </w:r>
+    </w:p>
+    <w:p>
+      <w:r>
+        <w:t>WebContent 恢复必须重新打开当前安装包内确定的本地入口，且自动恢复次数和时间窗口必须有硬上限。禁止连续 reload、无界重试或用重建 WKWebView 掩盖根因。</w:t>
+      </w:r>
+    </w:p>
+    <w:p>
+      <w:r>
+        <w:t>性能修复只能释放可重建的内存副本，禁止删除真实聊天、图片、语音、共同相册、朋友圈、外置语音配置、后台消息回执或原生主存档。存储诊断不得为了计算大小遍历并反序列化全部媒体值。</w:t>
+      </w:r>
+    </w:p>
+    <w:p>
+      <w:r>
+        <w:t>所有共享 app.js 变更必须由私人原生环境门控，公开网页执行原路线。发布前必须校验根 app.js 与 PhoneWeb.bundle/app.js、完整自动测试、明确 iOS 构建号；Windows 通过不能代替 Mac 编译和真实 iPhone 长时间验收。</w:t>
       </w:r>
     </w:p>
     <w:sectPr>

</xml_diff>

<commit_message>
release: v1070 private iOS 1.0.194
</commit_message>
<xml_diff>
--- a/docs/maintenance/AI开发项目_Bug修改规范.docx
+++ b/docs/maintenance/AI开发项目_Bug修改规范.docx
@@ -9419,6 +9419,29 @@
     <w:p>
       <w:r>
         <w:t>所有共享 app.js 变更必须由私人原生环境门控，公开网页执行原路线。发布前必须校验根 app.js 与 PhoneWeb.bundle/app.js、完整自动测试、明确 iOS 构建号；Windows 通过不能代替 Mac 编译和真实 iPhone 长时间验收。</w:t>
+      </w:r>
+    </w:p>
+    <w:p>
+      <w:r>
+        <w:br w:type="page"/>
+      </w:r>
+    </w:p>
+    <w:p>
+      <w:r>
+        <w:rPr>
+          <w:b/>
+        </w:rPr>
+        <w:t>v1070／私人 1.0.194 发布编号规范（2026-08-25）</w:t>
+      </w:r>
+    </w:p>
+    <w:p>
+      <w:r>
+        <w:t>已经公开给用户识别或已经生成安装包的候选版本，不得再次沿用同一网页版本和同一私人 iOS 构建号。纠正包必须同时拥有新的网页核心号、iOS marketing version、build number、缓存号、安装说明和独立交付目录。</w:t>
+      </w:r>
+    </w:p>
+    <w:p>
+      <w:r>
+        <w:t>纯版本纠正只能做机械标识更新和回归测试，不得混入业务逻辑修改。旧安装包、Git 提交和维护记录必须保留，禁止用同名新包静默覆盖历史恢复资料。</w:t>
       </w:r>
     </w:p>
     <w:sectPr>

</xml_diff>

<commit_message>
Release v1078 time memory and friend chat fixes
</commit_message>
<xml_diff>
--- a/docs/maintenance/AI开发项目_Bug修改规范.docx
+++ b/docs/maintenance/AI开发项目_Bug修改规范.docx
@@ -9442,6 +9442,39 @@
     <w:p>
       <w:r>
         <w:t>纯版本纠正只能做机械标识更新和回归测试，不得混入业务逻辑修改。旧安装包、Git 提交和维护记录必须保留，禁止用同名新包静默覆盖历史恢复资料。</w:t>
+      </w:r>
+    </w:p>
+    <w:p>
+      <w:pPr>
+        <w:pStyle w:val="Heading1"/>
+      </w:pPr>
+      <w:r>
+        <w:t>2026-08-27 v1078 时间、约会承接、记忆与真人聊天修复</w:t>
+      </w:r>
+    </w:p>
+    <w:p>
+      <w:r>
+        <w:t>时间事实规则：只给当前时间提示词不等于已防住瞎编。微信和通话在发送/播放前还必须核对当前时刻和最近可见聊天的真实间隔；短间隔不能省略，允许 1–2 分钟自然误差，只有超过 2 分钟才纠正；纠正仍明显错误时宁可静默，不能用程序台词冒充角色。</w:t>
+      </w:r>
+    </w:p>
+    <w:p>
+      <w:r>
+        <w:t>转账方向规则：_transferReceipt 是结算结果，不是新转账。任何模型历史、线下统一时间线或查手机上下文都应把它标为 system/event，并明确原始付款方、收款或退还结果；禁止仅依据 receipt.role 套用“我给你转了”。</w:t>
+      </w:r>
+    </w:p>
+    <w:p>
+      <w:r>
+        <w:t>一次性约会规则：结束操作必须同时写入 endedAt 持久事实、保存、退出现场并调度真实模型线上承接；共同生活仍是独立长期模式。约会承接模型失败时可同路线纠正一次，但不得使用固定深情台词兜底。</w:t>
+      </w:r>
+    </w:p>
+    <w:p>
+      <w:r>
+        <w:t>主动记忆规则：频率档位是每日上限而非每日任务。只有真实发生的当前聊天且内容具有长期承接价值才计数；无聊天、无重要事实、纯操作日志、重复项均不得为凑数写入。明确要求“记住”可按用户指令处理，但仍走冲突和重复检查。</w:t>
+      </w:r>
+    </w:p>
+    <w:p>
+      <w:r>
+        <w:t>真人群聊规则：成员退出和群主解散必须分开。退出 RPC 必须验证本人 secret、锁定群资料、拒绝群主自退，只删除本人 membership；客户端成功后才清理本人本地群数据，不能影响其他成员。</w:t>
       </w:r>
     </w:p>
     <w:sectPr>

</xml_diff>

<commit_message>
feat: add photo text cards and points coupon redemption
</commit_message>
<xml_diff>
--- a/docs/maintenance/AI开发项目_Bug修改规范.docx
+++ b/docs/maintenance/AI开发项目_Bug修改规范.docx
@@ -9475,6 +9475,39 @@
     <w:p>
       <w:r>
         <w:t>真人群聊规则：成员退出和群主解散必须分开。退出 RPC 必须验证本人 secret、锁定群资料、拒绝群主自退，只删除本人 membership；客户端成功后才清理本人本地群数据，不能影响其他成员。</w:t>
+      </w:r>
+    </w:p>
+    <w:p>
+      <w:r>
+        <w:br w:type="page"/>
+      </w:r>
+    </w:p>
+    <w:p>
+      <w:r>
+        <w:rPr>
+          <w:b/>
+        </w:rPr>
+        <w:t>v1079｜描述卡完整显示与积分红包确认规范（2026-08-27）</w:t>
+      </w:r>
+    </w:p>
+    <w:p>
+      <w:r>
+        <w:t>图文照片卡不得用固定高度、max-height、line-clamp、ellipsis 或隐藏溢出截断正文。标题可以固定高度，但正文必须参与卡片自动布局；超出当前屏幕时由聊天容器滚动，不能让后半段文字不可见。</w:t>
+      </w:r>
+    </w:p>
+    <w:p>
+      <w:r>
+        <w:t>图文描述是图片事实，不是普通文本占位。模型历史必须明确 image/textCard 语义，并限制角色只依据描述回应；有真实生图配置时不得降级成图文卡。</w:t>
+      </w:r>
+    </w:p>
+    <w:p>
+      <w:r>
+        <w:t>积分兑换券只有在真实卡片明确显示未兑换、且真实兑换弹窗出现时才能点击兑换。必须优先点精确 DOM 控件，不能误点吸底栏或装饰子元素；没有弹窗不得猜测兑换。</w:t>
+      </w:r>
+    </w:p>
+    <w:p>
+      <w:r>
+        <w:t>红包兑换、选中、返回结算和总价核验是同一事务。任一步失败、状态不确定或平台报错都必须停止，绝不能为了完成点单而按原价继续进入提交或支付。</w:t>
       </w:r>
     </w:p>
     <w:sectPr>

</xml_diff>

<commit_message>
fix: preserve real delivery role acknowledgement
</commit_message>
<xml_diff>
--- a/docs/maintenance/AI开发项目_Bug修改规范.docx
+++ b/docs/maintenance/AI开发项目_Bug修改规范.docx
@@ -9508,6 +9508,39 @@
     <w:p>
       <w:r>
         <w:t>红包兑换、选中、返回结算和总价核验是同一事务。任一步失败、状态不确定或平台报错都必须停止，绝不能为了完成点单而按原价继续进入提交或支付。</w:t>
+      </w:r>
+    </w:p>
+    <w:p>
+      <w:r>
+        <w:br w:type="page"/>
+      </w:r>
+    </w:p>
+    <w:p>
+      <w:r>
+        <w:rPr>
+          <w:b/>
+        </w:rPr>
+        <w:t>v1080｜订单卡片后角色回执与付款真值规范（2026-08-27）</w:t>
+      </w:r>
+    </w:p>
+    <w:p>
+      <w:r>
+        <w:t>真实订单卡片和角色自然回复是两个职责：卡片负责展示真实订单字段，角色回复负责以本人第一人称承认自己完成点单。不得用“卡片已展示结果”诱导模型沉默。</w:t>
+      </w:r>
+    </w:p>
+    <w:p>
+      <w:r>
+        <w:t>订单提交事实必须走不会被普通 proactive 忙碌门禁丢弃的可靠功能事件队列；允许延后，不允许伪造固定台词。真实模型首次空输出时最多按现有机制重试一次。</w:t>
+      </w:r>
+    </w:p>
+    <w:p>
+      <w:r>
+        <w:t>automatic:false 或 pending_payment 不能改写成 paid。只有平台 status 达到 paid 或后续配送状态，才允许角色声称付款完成；否则只能说已点好或已下单。</w:t>
+      </w:r>
+    </w:p>
+    <w:p>
+      <w:r>
+        <w:t>角色回执严禁发出“自己去付款”“快去付款”等命令，不得暴露卡片、二维码、付款入口、收银台或待付款等内部界面词。</w:t>
       </w:r>
     </w:p>
     <w:sectPr>

</xml_diff>

<commit_message>
fix: parse natural delivery requests and KFC homepage bundle
</commit_message>
<xml_diff>
--- a/docs/maintenance/AI开发项目_Bug修改规范.docx
+++ b/docs/maintenance/AI开发项目_Bug修改规范.docx
@@ -9541,6 +9541,39 @@
     <w:p>
       <w:r>
         <w:t>角色回执严禁发出“自己去付款”“快去付款”等命令，不得暴露卡片、二维码、付款入口、收银台或待付款等内部界面词。</w:t>
+      </w:r>
+    </w:p>
+    <w:p>
+      <w:r>
+        <w:br w:type="page"/>
+      </w:r>
+    </w:p>
+    <w:p>
+      <w:r>
+        <w:rPr>
+          <w:b/>
+        </w:rPr>
+        <w:t>v1081｜自然外卖意图与首页套餐边界规范（2026-08-27）</w:t>
+      </w:r>
+    </w:p>
+    <w:p>
+      <w:r>
+        <w:t>自然外卖解析应支持通用“品牌的商品，规格”结构，不得靠单一品牌白名单；只有当前角色点单回合、商品具有食物语义且尾部规格属于受限白名单时才能直接启动或补全残缺动作。</w:t>
+      </w:r>
+    </w:p>
+    <w:p>
+      <w:r>
+        <w:t>历史陈述、否定/取消和评价询问必须在显式解析与隐藏补判之前共同拦截。不能因为句子含品牌、饮品或食物名就创建真实任务。</w:t>
+      </w:r>
+    </w:p>
+    <w:p>
+      <w:r>
+        <w:t>首页限定套餐必须优先使用首页真实卡片，不得在店内搜索套餐名。工作流说明、禁止重复单点等文字不能被解析成独立加购；只有套餐未覆盖的明确食品项才允许继续搜索。</w:t>
+      </w:r>
+    </w:p>
+    <w:p>
+      <w:r>
+        <w:t>自动测试通过只能证明解析和页面状态机约束。门店打烊时未执行的真实规格选择必须写成待验收，禁止把九珍果汁饮料或爆汁三柠茶的“选规格”写成已完成。</w:t>
       </w:r>
     </w:p>
     <w:sectPr>

</xml_diff>

<commit_message>
fix: keep companion messages live and use exact clock
</commit_message>
<xml_diff>
--- a/docs/maintenance/AI开发项目_Bug修改规范.docx
+++ b/docs/maintenance/AI开发项目_Bug修改规范.docx
@@ -9574,6 +9574,39 @@
     <w:p>
       <w:r>
         <w:t>自动测试通过只能证明解析和页面状态机约束。门店打烊时未执行的真实规格选择必须写成待验收，禁止把九珍果汁饮料或爆汁三柠茶的“选规格”写成已完成。</w:t>
+      </w:r>
+    </w:p>
+    <w:p>
+      <w:r>
+        <w:br w:type="page"/>
+      </w:r>
+    </w:p>
+    <w:p>
+      <w:r>
+        <w:rPr>
+          <w:b/>
+        </w:rPr>
+        <w:t>v1082｜伴生消息送达与后台时间规范（2026-08-27）</w:t>
+      </w:r>
+    </w:p>
+    <w:p>
+      <w:r>
+        <w:t>共同生活状态不能作为伴生后台文字消息的服务器暂停条件或客户端收件阻塞条件。已生成消息必须先成功写入并持久化，再确认服务器收件；不得留在队列中等待用户关闭共同生活。</w:t>
+      </w:r>
+    </w:p>
+    <w:p>
+      <w:r>
+        <w:t>文字畅通与场景事实必须分离：共同生活期间允许伴生文字送到线上聊天，但角色仍必须知道双方正在共同生活，不能虚构异地、分居、久未见、等待落地或催回复。此规则不授权后台自行来电。</w:t>
+      </w:r>
+    </w:p>
+    <w:p>
+      <w:r>
+        <w:t>角色当前时间必须来自本轮实际读取的后台时钟，不得沿用系统提示、聊天记录、旧消息时间戳或模型猜测。初次生成前和最终发送前都要读取最新值，并按角色时区换算。</w:t>
+      </w:r>
+    </w:p>
+    <w:p>
+      <w:r>
+        <w:t>当前几点或经过多久的误差在一至两分钟内允许自然表达；超过两分钟、提前跳整点或跨小时必须在发送前拦截，并只做一次真实模型纠正。纠正失败不得用固定台词冒充角色。日程、约定和未来时间不能被误判为当前时间。</w:t>
       </w:r>
     </w:p>
     <w:sectPr>

</xml_diff>

<commit_message>
fix: execute accepted natural delivery choices
</commit_message>
<xml_diff>
--- a/docs/maintenance/AI开发项目_Bug修改规范.docx
+++ b/docs/maintenance/AI开发项目_Bug修改规范.docx
@@ -9607,6 +9607,39 @@
     <w:p>
       <w:r>
         <w:t>当前几点或经过多久的误差在一至两分钟内允许自然表达；超过两分钟、提前跳整点或跨小时必须在发送前拦截，并只做一次真实模型纠正。纠正失败不得用固定台词冒充角色。日程、约定和未来时间不能被误判为当前时间。</w:t>
+      </w:r>
+    </w:p>
+    <w:p>
+      <w:r>
+        <w:br w:type="page"/>
+      </w:r>
+    </w:p>
+    <w:p>
+      <w:r>
+        <w:rPr>
+          <w:b/>
+        </w:rPr>
+        <w:t>v1090｜自然外卖口头承诺与执行一致性规范（2026-08-27）</w:t>
+      </w:r>
+    </w:p>
+    <w:p>
+      <w:r>
+        <w:t>门店和商品由角色自由选择的外卖请求不能被当成信息不足直接静默。角色可以按人设拒绝或追问；但一旦本回合已经明确答应去找、去选或去点，可见承诺就是当前决定，必须在同一授权回合生成可执行的具体门店、具体商品和明确规格。</w:t>
+      </w:r>
+    </w:p>
+    <w:p>
+      <w:r>
+        <w:t>用户明确的糖度、冰度、温度等规格是硬条件，补判和严格纠正均不得漏掉或改写。用户未给规格时才允许角色根据真实可用项选择，不能把“你现在选定的”之类占位文字发送给自动化。</w:t>
+      </w:r>
+    </w:p>
+    <w:p>
+      <w:r>
+        <w:t>动作补判最多一次普通补判加一次严格格式纠正。两次都失败必须 fail-closed 并给出非角色系统诊断，明确没有连接后台或下单；不得无限重试、不得制造固定角色台词，也不得把角色拒绝改成同意。</w:t>
+      </w:r>
+    </w:p>
+    <w:p>
+      <w:r>
+        <w:t>测试必须同时覆盖接受、拒绝、普通聊天、用户硬规格、首次无效后的单次纠正和两次失败的显式停止；真实后台、真实下单和付款验证必须与无副作用模拟结论分开记录。</w:t>
       </w:r>
     </w:p>
     <w:sectPr>

</xml_diff>

<commit_message>
release: v1091 busy time and music repair
</commit_message>
<xml_diff>
--- a/docs/maintenance/AI开发项目_Bug修改规范.docx
+++ b/docs/maintenance/AI开发项目_Bug修改规范.docx
@@ -9640,6 +9640,44 @@
     <w:p>
       <w:r>
         <w:t>测试必须同时覆盖接受、拒绝、普通聊天、用户硬规格、首次无效后的单次纠正和两次失败的显式停止；真实后台、真实下单和付款验证必须与无副作用模拟结论分开记录。</w:t>
+      </w:r>
+    </w:p>
+    <w:p>
+      <w:r>
+        <w:br w:type="page"/>
+      </w:r>
+    </w:p>
+    <w:p>
+      <w:r>
+        <w:rPr>
+          <w:b/>
+        </w:rPr>
+        <w:t>v1091｜忙碌门禁、时间线与媒体导入稳定规范（2026-08-27）</w:t>
+      </w:r>
+    </w:p>
+    <w:p>
+      <w:r>
+        <w:t>忙碌功能必须在模型调用前拦截：角色没有明确报出未来恢复时间时不得进入忙碌；进入后，到点前的新消息只登记等待 ID，前台普通回复、后台主动任务和手动回复均不能先调用模型再丢弃。关闭开关不得改变普通聊天、主动消息、通话内普通前台回复或真实功能事件的既有语义。</w:t>
+      </w:r>
+    </w:p>
+    <w:p>
+      <w:r>
+        <w:t>到点回复必须使用真实角色模型和当前上下文，并且是同一忙碌会话的幂等恢复。可进行一次受限真实模型重试；两次仍无可见回复时保留 return_pending，待下一次安全唤醒重试，不得清空等待消息、假装已回复或插入固定系统台词。</w:t>
+      </w:r>
+    </w:p>
+    <w:p>
+      <w:r>
+        <w:t>当前时间和聊天间隔必须在每次生成前从后台真实时间及可见消息时间戳重新计算，不能使用旧上下文里的时间。时间事实只作为隐藏依据，不强迫每句报时；允许一到两分钟自然误差。未满一小时不得主动把正常间隔描述为被冷落，达到一小时才可按人设自然提及；用户直接问时必须精确回答。</w:t>
+      </w:r>
+    </w:p>
+    <w:p>
+      <w:r>
+        <w:t>视频不能以原始 video Blob 直接冒充音乐音频。必须先验证存在可支持音轨，再提取/解码、持久化并回读校验；失败时保留原歌单和歌词，不写空文件。旧记录的自修复也必须复用相同验证路径。</w:t>
+      </w:r>
+    </w:p>
+    <w:p>
+      <w:r>
+        <w:t>版本机械替换必须使用文件白名单，禁止把媒体频率、分辨率或其他业务数字当作发布号替换。发布后必须在新缓存键下实际打开页面，不能只依据源文件断言新 UI 已加载。</w:t>
       </w:r>
     </w:p>
     <w:sectPr>

</xml_diff>

<commit_message>
release: add call video memory guard and agent 0.1.3
</commit_message>
<xml_diff>
--- a/docs/maintenance/AI开发项目_Bug修改规范.docx
+++ b/docs/maintenance/AI开发项目_Bug修改规范.docx
@@ -9678,6 +9678,74 @@
     <w:p>
       <w:r>
         <w:t>版本机械替换必须使用文件白名单，禁止把媒体频率、分辨率或其他业务数字当作发布号替换。发布后必须在新缓存键下实际打开页面，不能只依据源文件断言新 UI 已加载。</w:t>
+      </w:r>
+    </w:p>
+    <w:p/>
+    <w:p>
+      <w:r>
+        <w:rPr>
+          <w:rFonts w:ascii="Microsoft YaHei" w:hAnsi="Microsoft YaHei" w:eastAsia="Microsoft YaHei"/>
+          <w:b/>
+          <w:sz w:val="22"/>
+        </w:rPr>
+        <w:t>v1116：本机通话视频与自动记忆证据规范（2026-08-30）</w:t>
+      </w:r>
+    </w:p>
+    <w:p>
+      <w:r>
+        <w:rPr>
+          <w:rFonts w:ascii="Microsoft YaHei" w:hAnsi="Microsoft YaHei" w:eastAsia="Microsoft YaHei"/>
+        </w:rPr>
+        <w:t>角色通话循环视频不得进入核心 JSON、localStorage 大对象、云快照或 base64；必须使用当前设备 IndexedDB Blob。替换时先写入并回读核对大小，再保存引用，最后删除旧 Blob；任一步失败都恢复旧引用并保留旧文件。</w:t>
+      </w:r>
+    </w:p>
+    <w:p>
+      <w:r>
+        <w:rPr>
+          <w:rFonts w:ascii="Microsoft YaHei" w:hAnsi="Microsoft YaHei" w:eastAsia="Microsoft YaHei"/>
+        </w:rPr>
+        <w:t>通话画面视频必须永久 muted、defaultMuted、volume=0，并在可用时关闭 audioTracks；不得创建或修改 AudioContext、扬声器路由、角色 TTS、麦克风、摄像头或屏幕共享状态。页面隐藏只暂停视觉视频，恢复时只恢复同一通话、同一角色、同一资源；异步加载必须使用令牌和资源身份阻止旧 Blob 回写。</w:t>
+      </w:r>
+    </w:p>
+    <w:p>
+      <w:r>
+        <w:rPr>
+          <w:rFonts w:ascii="Microsoft YaHei" w:hAnsi="Microsoft YaHei" w:eastAsia="Microsoft YaHei"/>
+        </w:rPr>
+        <w:t>自动长期记忆不得把模型的 [记住|...] 标签当作可信事实直接落盘。线上、共同生活和通话必须共用同一重要性、完整性和当前轮证据校验；疑问句、截断句、复述原话、粗口、操作事件、无当前证据的数字和推断一律拒绝。不得为补记忆额外调用模型，也不得自动清理用户已有记忆。</w:t>
+      </w:r>
+    </w:p>
+    <w:p>
+      <w:r>
+        <w:rPr>
+          <w:rFonts w:ascii="Microsoft YaHei" w:hAnsi="Microsoft YaHei" w:eastAsia="Microsoft YaHei"/>
+        </w:rPr>
+        <w:t>验证必须同时覆盖有效偏好、纪念日、宠物等可核事实，以及疑问句、半截粗口、无证据数字和仅标签无可见回复等拒绝样例；还要核对根网页与私人 Bundle 业务文件逐字一致，并用实际浏览器点按设置入口和视频通话大小画面。</w:t>
+      </w:r>
+    </w:p>
+    <w:p/>
+    <w:p>
+      <w:r>
+        <w:rPr>
+          <w:b/>
+        </w:rPr>
+        <w:t>朋友伴生程序 app.asar.unpacked 依赖规范（2026-08-30）</w:t>
+      </w:r>
+    </w:p>
+    <w:p>
+      <w:r>
+        <w:rPr>
+          <w:rFonts w:ascii="Microsoft YaHei" w:hAnsi="Microsoft YaHei" w:eastAsia="Microsoft YaHei"/>
+        </w:rPr>
+        <w:t>任何位于 app.asar.unpacked 的可更新运行代码都不得依赖只存在于 app.asar 的裸 npm 包。安装器必须显式 asarUnpack 所有运行时裸导入依赖，并把依赖加入 files；验收必须从正式解包目录实际触发动态 import，而不是只检查 package.json 或文件存在。</w:t>
+      </w:r>
+    </w:p>
+    <w:p>
+      <w:r>
+        <w:rPr>
+          <w:rFonts w:ascii="Microsoft YaHei" w:hAnsi="Microsoft YaHei" w:eastAsia="Microsoft YaHei"/>
+        </w:rPr>
+        <w:t>朋友账号、完整地址和 Cookie 的现场验收只能在朋友自己的电脑、配对和专用 Edge 中完成。维护端可以证明安装结构、签名和模块解析，但不能用模拟 CDP 或维护端未配对界面冒充朋友真实地址确认成功。</w:t>
       </w:r>
     </w:p>
     <w:sectPr>

</xml_diff>

<commit_message>
feat: add social reply controls and worldbook categories
</commit_message>
<xml_diff>
--- a/docs/maintenance/AI开发项目_Bug修改规范.docx
+++ b/docs/maintenance/AI开发项目_Bug修改规范.docx
@@ -9746,6 +9746,40 @@
           <w:rFonts w:ascii="Microsoft YaHei" w:hAnsi="Microsoft YaHei" w:eastAsia="Microsoft YaHei"/>
         </w:rPr>
         <w:t>朋友账号、完整地址和 Cookie 的现场验收只能在朋友自己的电脑、配对和专用 Edge 中完成。维护端可以证明安装结构、签名和模块解析，但不能用模拟 CDP 或维护端未配对界面冒充朋友真实地址确认成功。</w:t>
+      </w:r>
+    </w:p>
+    <w:p/>
+    <w:p>
+      <w:pPr>
+        <w:pStyle w:val="Heading1"/>
+      </w:pPr>
+      <w:r>
+        <w:t>v1127｜社交回复、设置持久化与世界书组织规范（2026-09-01）</w:t>
+      </w:r>
+    </w:p>
+    <w:p>
+      <w:r>
+        <w:t>设置保存规范：任何显示“已保存”的时间段或角色设置都必须等待真实持久化成功；失败时恢复该次操作前的全部相关字段。跨午夜时间段可以存在，但开始与结束相同、时间格式无效或目标记录已删除时不得写入。</w:t>
+      </w:r>
+    </w:p>
+    <w:p>
+      <w:r>
+        <w:t>公开社交回复规范：让角色回复网友时，只能携带当前公开帖子、目标公开评论、公开社交资料与用户明确配置的回复风格。私人备注、完整隐藏人设、私人聊天历史和其他联系人资料不得为提高拟人程度而泄露。可见回复必须来自角色当前真实模型和真实所选路线，失败时保留诊断，不得用固定台词冒充。</w:t>
+      </w:r>
+    </w:p>
+    <w:p>
+      <w:r>
+        <w:t>作者识别与并发规范：历史本人评论应通过公开昵称或公开头像兼容识别；发送前后均需复核帖子、评论、角色和页面仍存在。相同评论同一时刻只允许一个角色回复请求，重复结果不得再次落盘。</w:t>
+      </w:r>
+    </w:p>
+    <w:p>
+      <w:r>
+        <w:t>组织元数据规范：世界书分类只用于查看和管理，不得改变角色作用范围、条目排序、命中规则、注入正文或模型提示。删除分类只能解除归类，不能删除或重排条目；导入内容默认进入未分类。</w:t>
+      </w:r>
+    </w:p>
+    <w:p>
+      <w:r>
+        <w:t>网页同版本热修复规范：保持用户要求的版本号时，必须同步更新 Service Worker 缓存键、hotfix 标识和所有网页入口查询参数，并在推送后从线上实际读取新标识与关键功能；只检查本地源码或 Git 提交不能证明旧缓存已更新。</w:t>
       </w:r>
     </w:p>
     <w:sectPr>

</xml_diff>

<commit_message>
fix(web): publish v1148 Android startup and route diagnostics
</commit_message>
<xml_diff>
--- a/docs/maintenance/AI开发项目_Bug修改规范.docx
+++ b/docs/maintenance/AI开发项目_Bug修改规范.docx
@@ -9780,6 +9780,34 @@
     <w:p>
       <w:r>
         <w:t>网页同版本热修复规范：保持用户要求的版本号时，必须同步更新 Service Worker 缓存键、hotfix 标识和所有网页入口查询参数，并在推送后从线上实际读取新标识与关键功能；只检查本地源码或 Git 提交不能证明旧缓存已更新。</w:t>
+      </w:r>
+    </w:p>
+    <w:p>
+      <w:pPr>
+        <w:pStyle w:val="Heading1"/>
+      </w:pPr>
+      <w:r>
+        <w:t>安卓网页启动与模型路线诊断规范（2026-09-02）</w:t>
+      </w:r>
+    </w:p>
+    <w:p>
+      <w:r>
+        <w:t>公开网页兼容规范：单一关键脚本必须通过旧安卓解析门槛，不得引入可选链、空值合并或正则后向断言等会在执行前阻断整份脚本的语法；需要 flatMap、matchAll 等较新运行时能力时，必须先提供有界回退并增加静态回归测试。</w:t>
+      </w:r>
+    </w:p>
+    <w:p>
+      <w:r>
+        <w:t>存档启动规范：任何 IndexedDB 打开都不能无限等待；启动恢复必须有明确终止、有限重试和可诊断原因。核心存档或安卓孤立存档尚未完成恢复时，所有自动 saveNow 必须被拦截。无法证明原存档为空时宁可停止启动并提示用户重开，也不得把新建空白状态写回。</w:t>
+      </w:r>
+    </w:p>
+    <w:p>
+      <w:r>
+        <w:t>路线诊断规范：必须分开显示全局默认路线、角色独立路线、当前配置路线和最近实际请求路线。改变配置本身不等于已经发起请求；切换后旧实际记录必须清除或清楚标注为切换前结果。角色已有独立路线时，设置页默认路线不得被描述为覆盖该角色。</w:t>
+      </w:r>
+    </w:p>
+    <w:p>
+      <w:r>
+        <w:t>发布范围规范：本类公开网页专属修复只更新网页入口、网页缓存身份和对应测试，不同步私人 PhoneWeb.bundle，也不得把网页自动测试写成私人安装包交付证据。</w:t>
       </w:r>
     </w:p>
     <w:sectPr>

</xml_diff>

<commit_message>
fix(web): publish v1149 stable top mood
</commit_message>
<xml_diff>
--- a/docs/maintenance/AI开发项目_Bug修改规范.docx
+++ b/docs/maintenance/AI开发项目_Bug修改规范.docx
@@ -9808,6 +9808,34 @@
     <w:p>
       <w:r>
         <w:t>发布范围规范：本类公开网页专属修复只更新网页入口、网页缓存身份和对应测试，不同步私人 PhoneWeb.bundle，也不得把网页自动测试写成私人安装包交付证据。</w:t>
+      </w:r>
+    </w:p>
+    <w:p>
+      <w:pPr>
+        <w:pStyle w:val="Heading1"/>
+      </w:pPr>
+      <w:r>
+        <w:t>顶部状态连续性规范（2026-09-02）</w:t>
+      </w:r>
+    </w:p>
+    <w:p>
+      <w:r>
+        <w:t>顶部心情、状态条等持续型界面不得把一次辅助模型请求失败解释为状态已不存在。已有最后确认值时继续显示；只有新的有效结果可以替换，用户主动关闭或明确清空才能隐藏。</w:t>
+      </w:r>
+    </w:p>
+    <w:p>
+      <w:r>
+        <w:t>失败时间、错误原因和重试状态属于诊断元数据，不得直接充当业务值的删除条件。需要防止旧值冒充本轮新结果时，应保留值并区分时间来源，而不是制造闪烁。</w:t>
+      </w:r>
+    </w:p>
+    <w:p>
+      <w:r>
+        <w:t>持续显示不得制造固定角色内容。若从未取得有效角色心声，界面保持空白；若已有有效心声，显示时不得声称它是本轮刚产生的内容。</w:t>
+      </w:r>
+    </w:p>
+    <w:p>
+      <w:r>
+        <w:t>网页和私人版本共有修复可以同步代码，但发布顺序必须服从用户确认。本轮网页先推送，私人候选不推送、不打包，不能用网页线上成功代替私人安装包验收。</w:t>
       </w:r>
     </w:p>
     <w:sectPr>

</xml_diff>

<commit_message>
feat: add cohabitation multi-character theater v1171
</commit_message>
<xml_diff>
--- a/docs/maintenance/AI开发项目_Bug修改规范.docx
+++ b/docs/maintenance/AI开发项目_Bug修改规范.docx
@@ -9836,6 +9836,68 @@
     <w:p>
       <w:r>
         <w:t>网页和私人版本共有修复可以同步代码，但发布顺序必须服从用户确认。本轮网页先推送，私人候选不推送、不打包，不能用网页线上成功代替私人安装包验收。</w:t>
+      </w:r>
+    </w:p>
+    <w:p>
+      <w:r>
+        <w:br w:type="page"/>
+      </w:r>
+    </w:p>
+    <w:p>
+      <w:pPr>
+        <w:pStyle w:val="Heading1"/>
+      </w:pPr>
+      <w:r>
+        <w:rPr>
+          <w:rFonts w:ascii="Microsoft YaHei" w:hAnsi="Microsoft YaHei"/>
+          <w:sz w:val="32"/>
+        </w:rPr>
+        <w:t>新增规则｜共同生活多人说话人与来客记忆</w:t>
+      </w:r>
+    </w:p>
+    <w:p>
+      <w:r>
+        <w:rPr>
+          <w:rFonts w:ascii="Microsoft YaHei" w:hAnsi="Microsoft YaHei"/>
+          <w:sz w:val="21"/>
+        </w:rPr>
+        <w:t>1. 多人现场不得继续使用“非 user 即主角”的二元推断。每条消息必须保存稳定 actorType；渲染、摘要、日记、后台主动消息和跨渠道承接必须使用同一说话人映射。</w:t>
+      </w:r>
+    </w:p>
+    <w:p>
+      <w:r>
+        <w:rPr>
+          <w:rFonts w:ascii="Microsoft YaHei" w:hAnsi="Microsoft YaHei"/>
+          <w:sz w:val="21"/>
+        </w:rPr>
+        <w:t>2. 多人模式关闭时，正常两人共同生活必须调用原发送与渲染链；待演人物不能获得 joinedSeq，也不能读到关闭期间的内容。存在历史配角消息时必须继续显示历史署名，禁止为恢复旧界面而抹掉说话人。</w:t>
+      </w:r>
+    </w:p>
+    <w:p>
+      <w:r>
+        <w:rPr>
+          <w:rFonts w:ascii="Microsoft YaHei" w:hAnsi="Microsoft YaHei"/>
+          <w:sz w:val="21"/>
+        </w:rPr>
+        <w:t>3. 微信来客记忆只允许覆盖一次真实入场区间，使用 episodeId 幂等写入该来客自己的长期总结；未正式入场、空现场、角色已删除均不得编造总结。失败可以重试，但不能以系统固定文字伪装成角色记忆。</w:t>
+      </w:r>
+    </w:p>
+    <w:p>
+      <w:r>
+        <w:rPr>
+          <w:rFonts w:ascii="Microsoft YaHei" w:hAnsi="Microsoft YaHei"/>
+          <w:sz w:val="21"/>
+        </w:rPr>
+        <w:t>4. 主角优先和配角上限必须在执行层验证：没有本轮主角真实气泡就不生成配角；每轮最多一名配角；配角台词字符数不得超过本轮主角真实台词总字符数。提示词只能补充，不能代替硬门禁。</w:t>
+      </w:r>
+    </w:p>
+    <w:p>
+      <w:r>
+        <w:rPr>
+          <w:rFonts w:ascii="Microsoft YaHei" w:hAnsi="Microsoft YaHei"/>
+          <w:sz w:val="21"/>
+        </w:rPr>
+        <w:t>5. 共享功能先私人交付时，根目录与 PhoneWeb.bundle 必须包含同字节功能脚本并使用同一新网页候选版本；可以不上传网页，但不得用“私人专属”掩盖网页版缺失。私人包还必须反向核对并保留上一个私人修复链。</w:t>
       </w:r>
     </w:p>
     <w:sectPr>

</xml_diff>

<commit_message>
feat: stabilize shared cohabitation theater v1176
</commit_message>
<xml_diff>
--- a/docs/maintenance/AI开发项目_Bug修改规范.docx
+++ b/docs/maintenance/AI开发项目_Bug修改规范.docx
@@ -9898,6 +9898,105 @@
           <w:sz w:val="21"/>
         </w:rPr>
         <w:t>5. 共享功能先私人交付时，根目录与 PhoneWeb.bundle 必须包含同字节功能脚本并使用同一新网页候选版本；可以不上传网页，但不得用“私人专属”掩盖网页版缺失。私人包还必须反向核对并保留上一个私人修复链。</w:t>
+      </w:r>
+    </w:p>
+    <w:p>
+      <w:r>
+        <w:br w:type="page"/>
+      </w:r>
+    </w:p>
+    <w:p>
+      <w:r>
+        <w:rPr>
+          <w:rFonts w:ascii="等线" w:hAnsi="等线" w:eastAsia="等线"/>
+          <w:b/>
+          <w:sz w:val="28"/>
+        </w:rPr>
+        <w:t>2026-09-04：多人共同生活界面、顺序与语言校验规范</w:t>
+      </w:r>
+    </w:p>
+    <w:p>
+      <w:pPr>
+        <w:pStyle w:val="ListBullet"/>
+      </w:pPr>
+      <w:r>
+        <w:rPr>
+          <w:rFonts w:ascii="等线" w:hAnsi="等线" w:eastAsia="等线"/>
+          <w:sz w:val="21"/>
+        </w:rPr>
+        <w:t>可选多人模式不得永久压缩聊天区。完整管理必须收进共同生活设置；关闭后必须直接调用原双人 renderCohab，不能仅用 CSS 隐藏新元素。</w:t>
+      </w:r>
+    </w:p>
+    <w:p>
+      <w:pPr>
+        <w:pStyle w:val="ListBullet"/>
+      </w:pPr>
+      <w:r>
+        <w:rPr>
+          <w:rFonts w:ascii="等线" w:hAnsi="等线" w:eastAsia="等线"/>
+          <w:sz w:val="21"/>
+        </w:rPr>
+        <w:t>说话顺序由执行层按本轮 addressTo 重排：主角/所有人目标由主角先答；来客/路人目标由被点名者先答。提示词只能补充语义，不能代替执行层约束。</w:t>
+      </w:r>
+    </w:p>
+    <w:p>
+      <w:pPr>
+        <w:pStyle w:val="ListBullet"/>
+      </w:pPr>
+      <w:r>
+        <w:rPr>
+          <w:rFonts w:ascii="等线" w:hAnsi="等线" w:eastAsia="等线"/>
+          <w:sz w:val="21"/>
+        </w:rPr>
+        <w:t>配角生成结果必须进入和主角相同的消息队列、逐字显示与持久化流程；不得在模型返回后直接另行插入完整段落。配角可见台词长度必须以主角本轮真实可见台词为上限。</w:t>
+      </w:r>
+    </w:p>
+    <w:p>
+      <w:pPr>
+        <w:pStyle w:val="ListBullet"/>
+      </w:pPr>
+      <w:r>
+        <w:rPr>
+          <w:rFonts w:ascii="等线" w:hAnsi="等线" w:eastAsia="等线"/>
+          <w:sz w:val="21"/>
+        </w:rPr>
+        <w:t>人物关系必须同时携带“该角色是谁”和“该角色如何称呼对方”。昵称只做身份定位，不得替代丈母娘/女婿等关系视角；退场总结要从来客第一人称复核人物归属。</w:t>
+      </w:r>
+    </w:p>
+    <w:p>
+      <w:pPr>
+        <w:pStyle w:val="ListBullet"/>
+      </w:pPr>
+      <w:r>
+        <w:rPr>
+          <w:rFonts w:ascii="等线" w:hAnsi="等线" w:eastAsia="等线"/>
+          <w:sz w:val="21"/>
+        </w:rPr>
+        <w:t>用户撤销气泡配色后，应删除可见颜色控件和气泡内联颜色覆盖，沿用原 CSS 模板；兼容旧存档字段可以读取但不得继续影响界面。</w:t>
+      </w:r>
+    </w:p>
+    <w:p>
+      <w:pPr>
+        <w:pStyle w:val="ListBullet"/>
+      </w:pPr>
+      <w:r>
+        <w:rPr>
+          <w:rFonts w:ascii="等线" w:hAnsi="等线" w:eastAsia="等线"/>
+          <w:sz w:val="21"/>
+        </w:rPr>
+        <w:t>非普通话语音的模型提示与输出校验要成对实现。粤语每一句原文都必须紧跟一行普通话翻译；一次真实纠正仍不合格时显示明确失败，禁止用系统固定文本冒充角色。</w:t>
+      </w:r>
+    </w:p>
+    <w:p>
+      <w:pPr>
+        <w:pStyle w:val="ListBullet"/>
+      </w:pPr>
+      <w:r>
+        <w:rPr>
+          <w:rFonts w:ascii="等线" w:hAnsi="等线" w:eastAsia="等线"/>
+          <w:sz w:val="21"/>
+        </w:rPr>
+        <w:t>网页可见诊断能力必须反向核对私人 Bundle 的入口、脚本加载顺序与实际按钮；私人版不得因独立 Bundle 结构遗漏网页已有功能。</w:t>
       </w:r>
     </w:p>
     <w:sectPr>

</xml_diff>

<commit_message>
fix: stabilize proactive delivery and cohab targets v1177
</commit_message>
<xml_diff>
--- a/docs/maintenance/AI开发项目_Bug修改规范.docx
+++ b/docs/maintenance/AI开发项目_Bug修改规范.docx
@@ -9997,6 +9997,34 @@
           <w:sz w:val="21"/>
         </w:rPr>
         <w:t>网页可见诊断能力必须反向核对私人 Bundle 的入口、脚本加载顺序与实际按钮；私人版不得因独立 Bundle 结构遗漏网页已有功能。</w:t>
+      </w:r>
+    </w:p>
+    <w:p>
+      <w:pPr>
+        <w:pStyle w:val="Heading1"/>
+      </w:pPr>
+      <w:r>
+        <w:t>2026-09-05：主动消息轮次、异步对象与显式清单防复发规则</w:t>
+      </w:r>
+    </w:p>
+    <w:p>
+      <w:r>
+        <w:t>主动消息不得仅凭最后一条 user 文本判断待回复。必须同时核对该 user 之后是否已有角色回复、该轮是否已标记完成、消息时间是否可解析，以及采用的上下文来源是否为更新版本。scheduled 的重复补答最多真实纠正一次后静默；reply_handoff 必须作为真实未完成回复单独验证，禁止共用静默分支。</w:t>
+      </w:r>
+    </w:p>
+    <w:p>
+      <w:r>
+        <w:t>任何允许用户在生成期间继续切换的对象选择器，都不得在异步回调里重新读取全局当前值。发送动作必须生成不可变轮次快照，提示词、执行对象、首答顺序、持久化和错误提示使用同一个快照。快照目标失效时应明确停止，不得悄悄替换成默认角色。</w:t>
+      </w:r>
+    </w:p>
+    <w:p>
+      <w:r>
+        <w:t>外卖中的显式商品清单优先级高于套餐推荐和自主启发式。每个清单项须单独搜索、单独取得可验证候选并按品类去重；单品请求必须排除套餐、多件装和模糊同类。没有精确证据时失败关闭，不能为了继续流程擅自替换。</w:t>
+      </w:r>
+    </w:p>
+    <w:p>
+      <w:r>
+        <w:t>共享发布必须反向核对网页入口和私人 PhoneWeb.bundle 的脚本、样式、版本参数及可见行为。每次使用新网页版本和新私人构建号；原生 API 未变化时不得无理由抬高桥协议。发布报告必须把云端部署、Windows 测试、Mac 编译、真机验收和真实平台操作分开表述。</w:t>
       </w:r>
     </w:p>
     <w:sectPr>

</xml_diff>

<commit_message>
fix: isolate private cohab keyboard handling
</commit_message>
<xml_diff>
--- a/docs/maintenance/AI开发项目_Bug修改规范.docx
+++ b/docs/maintenance/AI开发项目_Bug修改规范.docx
@@ -10025,6 +10025,34 @@
     <w:p>
       <w:r>
         <w:t>共享发布必须反向核对网页入口和私人 PhoneWeb.bundle 的脚本、样式、版本参数及可见行为。每次使用新网页版本和新私人构建号；原生 API 未变化时不得无理由抬高桥协议。发布报告必须把云端部署、Windows 测试、Mac 编译、真机验收和真实平台操作分开表述。</w:t>
+      </w:r>
+    </w:p>
+    <w:p>
+      <w:pPr>
+        <w:pStyle w:val="Heading1"/>
+      </w:pPr>
+      <w:r>
+        <w:t>新增规则：私人键盘修复必须限定目标输入框并反向验证共享页面</w:t>
+      </w:r>
+    </w:p>
+    <w:p>
+      <w:r>
+        <w:t>任何键盘 Bug 修改前，先列出共享 WKWebView、SwiftUI 根视图、viewport、滚动容器和焦点状态的全部消费者；明确目标页、非目标页和恢复路径。不能用局部页面现象推导全局壳层都需要改动。</w:t>
+      </w:r>
+    </w:p>
+    <w:p>
+      <w:r>
+        <w:t>只有共同生活输入框异常时，不得全局替换 WKWebView 容器约束，不得给根视图新增全局键盘忽略规则，不得监听并强制重写 contentOffset，也不得修改所有页面共用的 visualViewport 行为。优先以稳定基线恢复非目标页面，再对目标 DOM 输入框做可撤销、可验证的最小作用域处理。</w:t>
+      </w:r>
+    </w:p>
+    <w:p>
+      <w:r>
+        <w:t>每个临时状态必须覆盖正常结束和异常结束：blur、切换到另一输入框、键盘交互式隐藏、页面退出和 WebView 销毁都要恢复。测试必须证明状态只由目标输入框开启，且不会泄漏到微信、通话或其他编辑框。</w:t>
+      </w:r>
+    </w:p>
+    <w:p>
+      <w:r>
+        <w:t>私人包发布门槛新增双向回归：共同生活至少重复三轮打开／收起／旁白切换；微信至少重复一轮进入聊天、打开键盘、输入、收起和再次打开。Windows 代码测试只能证明约束和作用域，真实 iPhone 动画没有验收时必须明确标为 Mac 待编译、真机待确认。</w:t>
       </w:r>
     </w:p>
     <w:sectPr>

</xml_diff>

<commit_message>
fix: restore private v1179 keyboard baseline
</commit_message>
<xml_diff>
--- a/docs/maintenance/AI开发项目_Bug修改规范.docx
+++ b/docs/maintenance/AI开发项目_Bug修改规范.docx
@@ -10053,6 +10053,34 @@
     <w:p>
       <w:r>
         <w:t>私人包发布门槛新增双向回归：共同生活至少重复三轮打开／收起／旁白切换；微信至少重复一轮进入聊天、打开键盘、输入、收起和再次打开。Windows 代码测试只能证明约束和作用域，真实 iPhone 动画没有验收时必须明确标为 Mac 待编译、真机待确认。</w:t>
+      </w:r>
+    </w:p>
+    <w:p>
+      <w:pPr>
+        <w:pStyle w:val="Heading1"/>
+      </w:pPr>
+      <w:r>
+        <w:t>新增规则 键盘基线对照与最后消息验收</w:t>
+      </w:r>
+    </w:p>
+    <w:p>
+      <w:r>
+        <w:t>修复键盘问题前必须建立逐版本矩阵，至少记录宿主安全区、viewport、fixed 或 absolute 定位、原生键盘约束、焦点调用和滚动控制。不得只拿一个旧版本整版覆盖，也不得在失败方案上继续叠加补丁。</w:t>
+      </w:r>
+    </w:p>
+    <w:p>
+      <w:r>
+        <w:t>选择最终方案时，应从已知正常版本恢复一条完整布局链，再逐项保留后来与布局无关且已验证有效的改动。每个保留项必须说明它解决的现象及为什么不会重新引入共享页面回归。</w:t>
+      </w:r>
+    </w:p>
+    <w:p>
+      <w:r>
+        <w:t>输入框验收不只看位置。聚焦前消息区必须位于最后一条；键盘出现时应由最后一条消息和输入栏一起稳定上移；收起时键盘、输入栏和内容应在同一系统动画内复位；首次与后续操作都不得出现额外弹跳、黑屏或停在旧消息。</w:t>
+      </w:r>
+    </w:p>
+    <w:p>
+      <w:r>
+        <w:t>私人键盘修改必须反向检查微信、共同生活、线下约会、旁白切换和其他输入页。公开网页不在修复范围时必须保持字节零改动；私人包内也不得用共享原生容器对所有页面追加键盘通知、滚动开关、偏移重写或第二套动画时间线。</w:t>
       </w:r>
     </w:p>
     <w:sectPr>

</xml_diff>

<commit_message>
fix: restore native offline keyboard flow
</commit_message>
<xml_diff>
--- a/docs/maintenance/AI开发项目_Bug修改规范.docx
+++ b/docs/maintenance/AI开发项目_Bug修改规范.docx
@@ -10081,6 +10081,34 @@
     <w:p>
       <w:r>
         <w:t>私人键盘修改必须反向检查微信、共同生活、线下约会、旁白切换和其他输入页。公开网页不在修复范围时必须保持字节零改动；私人包内也不得用共享原生容器对所有页面追加键盘通知、滚动开关、偏移重写或第二套动画时间线。</w:t>
+      </w:r>
+    </w:p>
+    <w:p>
+      <w:pPr>
+        <w:pStyle w:val="Heading1"/>
+      </w:pPr>
+      <w:r>
+        <w:t>新增规则 禁止在输入命中阶段改写滚动位置</w:t>
+      </w:r>
+    </w:p>
+    <w:p>
+      <w:r>
+        <w:t>iOS WKWebView 的 textarea 在 touchstart、pointerdown 和原生 caret hit testing 完成前，不得同步改写任何祖先消息区或外层页面的 scrollTop、contentOffset、transform、bottom 或高度。</w:t>
+      </w:r>
+    </w:p>
+    <w:p>
+      <w:r>
+        <w:t>同一物理触摸可能依次产生 touchstart、pointerdown 和 click；不得让多个入口重复执行布局或滚动副作用。去重不只检查业务动作次数，还必须检查几何状态是否被重复写入。</w:t>
+      </w:r>
+    </w:p>
+    <w:p>
+      <w:r>
+        <w:t>需要默认显示最后一条消息时，应在页面进入或消息渲染完成阶段处理，不得把滚动校正塞进输入框触摸阶段。若用户主动停在旧消息，是否跳到底部应作为独立交互规则验证。</w:t>
+      </w:r>
+    </w:p>
+    <w:p>
+      <w:r>
+        <w:t>私人线下修复不得复制微信整页布局。只能复用已证明与 DOM 结构无关的原则；修改前要核对消息滚动容器、输入栏兄弟关系、旁白或目标控件、fixed 或 absolute 祖先及宿主键盘策略。</w:t>
       </w:r>
     </w:p>
     <w:sectPr>

</xml_diff>

<commit_message>
fix(private): stabilize cohabitation keyboard coordinates
</commit_message>
<xml_diff>
--- a/docs/maintenance/AI开发项目_Bug修改规范.docx
+++ b/docs/maintenance/AI开发项目_Bug修改规范.docx
@@ -10109,6 +10109,34 @@
     <w:p>
       <w:r>
         <w:t>私人线下修复不得复制微信整页布局。只能复用已证明与 DOM 结构无关的原则；修改前要核对消息滚动容器、输入栏兄弟关系、旁白或目标控件、fixed 或 absolute 祖先及宿主键盘策略。</w:t>
+      </w:r>
+    </w:p>
+    <w:p>
+      <w:pPr>
+        <w:pStyle w:val="Heading1"/>
+      </w:pPr>
+      <w:r>
+        <w:t>新增规则 同机正常输入区应先做坐标系差分</w:t>
+      </w:r>
+    </w:p>
+    <w:p>
+      <w:r>
+        <w:t>同一 WKWebView 内若微信输入正常而共同生活异常，优先比较从 html、body、phone、page 到 textarea 的 fixed、absolute、transform、overflow 和 flex 链；在找出差分前不得继续叠加原生键盘通知或动画延时。</w:t>
+      </w:r>
+    </w:p>
+    <w:p>
+      <w:r>
+        <w:t>修复光标坐标时，应让异常输入区复用正常输入区的几何原则，不复制业务 DOM 或视觉样式。必须证明公开网页、微信消息逻辑和其他页面没有被改写。</w:t>
+      </w:r>
+    </w:p>
+    <w:p>
+      <w:r>
+        <w:t>键盘打开与收起出现两拍位移时，视为存在两个几何所有者。只保留 WebKit 与一个稳定祖先坐标基准；禁止同时使用 visualViewport、键盘 frame、scrollTop、contentOffset 或重复 focus 做补偿。</w:t>
+      </w:r>
+    </w:p>
+    <w:p>
+      <w:r>
+        <w:t>输入栏按钮在键盘重排时必须阻止事件穿透。除 touchstart 或 pointerdown 去重外，还要覆盖 iOS 延迟 synthetic click，并仅在刚发生输入栏触摸时拦截后方消息，不能影响正常消息编辑。</w:t>
       </w:r>
     </w:p>
     <w:sectPr>

</xml_diff>

<commit_message>
feat: add opt-in couple chat and app supervision v1190
</commit_message>
<xml_diff>
--- a/docs/maintenance/AI开发项目_Bug修改规范.docx
+++ b/docs/maintenance/AI开发项目_Bug修改规范.docx
@@ -10137,6 +10137,39 @@
     <w:p>
       <w:r>
         <w:t>输入栏按钮在键盘重排时必须阻止事件穿透。除 touchstart 或 pointerdown 去重外，还要覆盖 iOS 延迟 synthetic click，并仅在刚发生输入栏触摸时拦截后方消息，不能影响正常消息编辑。</w:t>
+      </w:r>
+    </w:p>
+    <w:p>
+      <w:r>
+        <w:br w:type="page"/>
+      </w:r>
+    </w:p>
+    <w:p>
+      <w:pPr>
+        <w:pStyle w:val="Heading1"/>
+      </w:pPr>
+      <w:r>
+        <w:t>2026 09 06 v1190 情侣空间聊天与软件监管</w:t>
+      </w:r>
+    </w:p>
+    <w:p>
+      <w:r>
+        <w:t>停留监管必须基于前台连续会话，不能把多次短停留相加；重绘不算重新进入；同一软件内换子页面不算再次打开，参与对象变化必须重置等待。计数与连续停留分开，且按设备本地日期清零。</w:t>
+      </w:r>
+    </w:p>
+    <w:p>
+      <w:r>
+        <w:t>只知道对象和软件名称的权限不得读取对方正文或草稿。角色身份必须来自当前活动结构化参与者，不允许用软件名称或曾选过的默认角色推断伴侣在场。</w:t>
+      </w:r>
+    </w:p>
+    <w:p>
+      <w:r>
+        <w:t>异步生成必须在实际发送前复查开关、绑定对象、账号、前台页面、参与者及新消息。权限关闭、页面退出或上下文改变使旧结果永久失效；不自动补发或用固定台词代替失败模型。</w:t>
+      </w:r>
+    </w:p>
+    <w:p>
+      <w:r>
+        <w:t>非当前页面角色发起的独立反应须明确使用该角色模型路线，不能被游戏页面的模型选择覆盖。公共与私人脚本保持同字节，新资源必须加入两端入口、离线缓存及私人资源清单。</w:t>
       </w:r>
     </w:p>
     <w:sectPr>

</xml_diff>

<commit_message>
fix: restore couple supervision triggers in web v1191
</commit_message>
<xml_diff>
--- a/docs/maintenance/AI开发项目_Bug修改规范.docx
+++ b/docs/maintenance/AI开发项目_Bug修改规范.docx
@@ -10170,6 +10170,24 @@
     <w:p>
       <w:r>
         <w:t>非当前页面角色发起的独立反应须明确使用该角色模型路线，不能被游戏页面的模型选择覆盖。公共与私人脚本保持同字节，新资源必须加入两端入口、离线缓存及私人资源清单。</w:t>
+      </w:r>
+    </w:p>
+    <w:p>
+      <w:pPr>
+        <w:pStyle w:val="Heading2"/>
+      </w:pPr>
+      <w:r>
+        <w:t>2026-09-06 · v1191 网页监管触发修复</w:t>
+      </w:r>
+    </w:p>
+    <w:p>
+      <w:r>
+        <w:t>具体已授权事件不应套用普通自主闲聊的所有门禁；只对真实并发操作保持互斥。区分停留前取消与已观察事件生成后的切页；撤权必须使用修订号防止关闭再打开复活旧请求。回归须覆盖真实时钟、真实模型接口解析及旧存档末条 user 状态；模拟 HTTP 服务通过不能冒充真实模型/真机验收。此次用户明确仅网页发布，版本包含检查只为网页1191/私人1190开放精确例外，下次私人发布须包含补丁。</w:t>
+      </w:r>
+    </w:p>
+    <w:p>
+      <w:r>
+        <w:t>详见 v1191_监管触发修复验收.md。维护记录仅追加；本机缺少 LibreOffice，DOCX 页面渲染尚未验证。推送及部署状态以实际 Git/线上检查为准。</w:t>
       </w:r>
     </w:p>
     <w:sectPr>

</xml_diff>

<commit_message>
fix: set web chat supervision interval to 10-60 seconds
</commit_message>
<xml_diff>
--- a/docs/maintenance/AI开发项目_Bug修改规范.docx
+++ b/docs/maintenance/AI开发项目_Bug修改规范.docx
@@ -10188,6 +10188,29 @@
     <w:p>
       <w:r>
         <w:t>详见 v1191_监管触发修复验收.md。维护记录仅追加；本机缺少 LibreOffice，DOCX 页面渲染尚未验证。推送及部署状态以实际 Git/线上检查为准。</w:t>
+      </w:r>
+    </w:p>
+    <w:p>
+      <w:pPr>
+        <w:pStyle w:val="Heading2"/>
+      </w:pPr>
+      <w:r>
+        <w:t>2026-09-06 · v1192 聊天监管 10–60 秒</w:t>
+      </w:r>
+    </w:p>
+    <w:p>
+      <w:r>
+        <w:t>2026-09-06，网页 v1192：按用户最后指令，聊天监管改为随机 10–60 秒；软件监管保持 20–60 秒。未到阈值离开重计、每日清零、关闭权限撤销、伴侣自身及共同活动排除均保留。本次只提交网页，私人仍为 v1190 / iOS316 / 桥35，不修改、不打包。</w:t>
+      </w:r>
+    </w:p>
+    <w:p>
+      <w:r>
+        <w:t>用户确认 v1191 普通微信另一角色聊天停留一分钟仍无消息，但软件已能触发。补测 v1191 真实浏览器保持另一角色聊天页，约58.2秒发起一次请求，四条模型正文保存、顶部横幅可见。模型 HTTP 为模拟服务，尚未复现用户真实模型/设备的聊天失败，不能把调整阈值当作剩余故障已修复。v1192 全仓 Windows 1500/1500 通过；新脚本 scripts/check_v1192_chat_watch.cjs 验证九秒离开不触发、重入重新计时及一直留在另一聊天页的通知。最终浏览器与推送结果以实际执行记录为准。</w:t>
+      </w:r>
+    </w:p>
+    <w:p>
+      <w:r>
+        <w:t>工程规则：未复现的用户反馈必须明确保留为待验收，不用模拟模型成功推断用户环境已修复。用户最终要求10秒，撤销临时3秒方案。维护记录仅追加；本机缺少LibreOffice，未完成页面渲染。</w:t>
       </w:r>
     </w:p>
     <w:sectPr>

</xml_diff>

<commit_message>
fix: accept canonical inner thoughts in couple supervision replies
</commit_message>
<xml_diff>
--- a/docs/maintenance/AI开发项目_Bug修改规范.docx
+++ b/docs/maintenance/AI开发项目_Bug修改规范.docx
@@ -10211,6 +10211,34 @@
     <w:p>
       <w:r>
         <w:t>工程规则：未复现的用户反馈必须明确保留为待验收，不用模拟模型成功推断用户环境已修复。用户最终要求10秒，撤销临时3秒方案。维护记录仅追加；本机缺少LibreOffice，未完成页面渲染。</w:t>
+      </w:r>
+    </w:p>
+    <w:p>
+      <w:pPr>
+        <w:pStyle w:val="Heading2"/>
+      </w:pPr>
+      <w:r>
+        <w:t>2026-09-06 · v1193 监管内心标签解析</w:t>
+      </w:r>
+    </w:p>
+    <w:p>
+      <w:r>
+        <w:t>2026-09-06 网页 v1193：修复监管已调用模型却丢弃正常回复的解析错误。buildSystem 明确要求 [内心|…]，旧监管解析器只移除心情等标签，漏掉标准内心标签，随后方括号过滤整轮拒收。新增回归在旧代码失败；现复用普通聊天 stripHiddenThoughtTags 和 wechatInnerThoughtValue，合法正文送达，确认授权及消息新鲜度后才更新角色心情。未解除操作标签/出戏拦截，未增加模型请求或伪造回复。</w:t>
+      </w:r>
+    </w:p>
+    <w:p>
+      <w:r>
+        <w:t>聊天保持10–60秒、软件20–60秒。用户明确只发布网页，私人仍v1190/iOS316/桥35，不修改、不打包。专项45/45，全仓Windows1502/1502通过。新浏览器脚本 scripts/check_v1193_watch_thought.cjs 使用真实时钟与真实提示词构造，仅模拟HTTP模型，返回标准内心标签，检查聊天和抖音的消息、通知、心情更新及重进页面。测试不等于用户真实模型和真机已验收。</w:t>
+      </w:r>
+    </w:p>
+    <w:p>
+      <w:r>
+        <w:t>顶部心情消失反馈仍待定位：扫描显示开关和内心写入路径，当前普通提取失败已保留旧值，未发现再次清空已确认内心的路径。不把监管内心解析修复宣称为所有心情消失已解决；还需确认用户是整栏消失还是内容空白，以及顶部心情开关状态。此前模拟响应只用心情标签，与真实提示词强制内心标签不一致，导致假阴性。测试数据必须覆盖真实协议格式，不能仅证明自选返回可用。</w:t>
+      </w:r>
+    </w:p>
+    <w:p>
+      <w:r>
+        <w:t>维护记录仅追加；本机缺少LibreOffice，页面渲染未验证。发布与线上版本以实际Git及部署检查为准。</w:t>
       </w:r>
     </w:p>
     <w:sectPr>

</xml_diff>

<commit_message>
fix: preserve last valid mood and keep enabled header visible
</commit_message>
<xml_diff>
--- a/docs/maintenance/AI开发项目_Bug修改规范.docx
+++ b/docs/maintenance/AI开发项目_Bug修改规范.docx
@@ -10239,6 +10239,34 @@
     <w:p>
       <w:r>
         <w:t>维护记录仅追加；本机缺少LibreOffice，页面渲染未验证。发布与线上版本以实际Git及部署检查为准。</w:t>
+      </w:r>
+    </w:p>
+    <w:p>
+      <w:pPr>
+        <w:pStyle w:val="Heading2"/>
+      </w:pPr>
+      <w:r>
+        <w:t>2026-09-06 · v1194 顶部心情有效内容保留</w:t>
+      </w:r>
+    </w:p>
+    <w:p>
+      <w:r>
+        <w:t>2026-09-06 网页 v1194：用户确认顶部心情整栏消失，重开显示开关无效，要求错误格式保留上一条有效内心。旧逻辑仅在提取失败时不清空当前字段，但没有独立有效副本，显示还依赖当前字段非空；测试注入字段变空即可复现整栏隐藏。实际用户存档的清空来源未确定，不夸大为已取得设备现场。</w:t>
+      </w:r>
+    </w:p>
+    <w:p>
+      <w:r>
+        <w:t>新增内心格式校验与角色内独立 innerThoughtLastValid / innerThoughtLastValidAt。空值、非字符串、标签碎片、推理标记、仅不可见字符和无效占位词不覆盖有效内心。已有有效显示自动建立可持久化副本，顶部及详情统一读取当前有效值或最后有效值。显示开关开启时不再因缺内容隐藏整栏；完全没有可恢复历史时只显示省略号，不编造心情、不伪造更新时间。下一条有效生成更新副本；关闭开关仍完全隐藏。</w:t>
+      </w:r>
+    </w:p>
+    <w:p>
+      <w:r>
+        <w:t>范围仅网页v1194；私人保持v1190/iOS316/桥35，未修改未打包。聊天监管10–60秒、软件20–60秒及v1193标准内心解析均保留。新增6项运行时回归；全仓Windows1508/1508通过。scripts/check_v1194_mood.cjs通过：实际解析器遇到嵌套错误标签保留旧内容；空字段保持栏框；通过真实saveNowAsync写存档后退出预览、正常启动重载仍恢复；详情、开关及新有效内容一致；无历史只显示省略号。零页面错误。此为浏览器故障注入验证，不等于用户真机原始故障已复现。</w:t>
+      </w:r>
+    </w:p>
+    <w:p>
+      <w:r>
+        <w:t>规则：无效候选、最新字段和最后有效显示分开处理；开关显隐不得被生成失败隐式关闭。保留真实历史时间；不能通过固定情绪文本掩盖存档缺失。文档仅追加，旧段落已核对；本机缺少LibreOffice，页面渲染仍未验证。Git推送和线上版本以实际检查为准。</w:t>
       </w:r>
     </w:p>
     <w:sectPr>

</xml_diff>

<commit_message>
fix: count supervision triggers and recover suspended cohab replies
</commit_message>
<xml_diff>
--- a/docs/maintenance/AI开发项目_Bug修改规范.docx
+++ b/docs/maintenance/AI开发项目_Bug修改规范.docx
@@ -10267,6 +10267,39 @@
     <w:p>
       <w:r>
         <w:t>规则：无效候选、最新字段和最后有效显示分开处理；开关显隐不得被生成失败隐式关闭。保留真实历史时间；不能通过固定情绪文本掩盖存档缺失。文档仅追加，旧段落已核对；本机缺少LibreOffice，页面渲染仍未验证。Git推送和线上版本以实际检查为准。</w:t>
+      </w:r>
+    </w:p>
+    <w:p>
+      <w:pPr>
+        <w:pStyle w:val="Heading2"/>
+      </w:pPr>
+      <w:r>
+        <w:t>2026-09-06 · v1195 触发计数与共同生活恢复</w:t>
+      </w:r>
+    </w:p>
+    <w:p>
+      <w:r>
+        <w:t>2026-09-06 两边共有 v1195 / 私人 iOS1.0.317 (317) / 桥35。按用户新要求，聊天和软件从进入计数改为触发计数：达到阈值、必要互斥放行及授权有效时只加一次；短暂进入、重绘、恢复本身不计数。旧watchDaily没有triggers模式标记则一次性重置，不能把历史打开次数冒充触发次数；每天当地午夜重置。角色提示明确为第几次发现，不是第几次实际打开。已触发但模型失败仍属于一次触发，不自动重发。聊天10–60秒、软件20–60秒保持。</w:t>
+      </w:r>
+    </w:p>
+    <w:p>
+      <w:r>
+        <w:t>用户补充共同生活后台回来让TA回失效、强退恢复。复核发现网络超时只覆盖取得响应头，正文等待可以无限悬挂；多人剧场配角先答的异常路径仅清理目标，没有完整释放busy。新增整次模型调用的有界等待及后台恢复取消，取消错误不能被网络重试、副模型回退或保留旧候选吞掉。沿原finally释放忙碌，迟到结果不进入对话，用户重新点击后发新请求；不手工清空真实聊天，不强制刷新。支持方先失败也清理busy与activeActor。真实手机挂起尚待验收。</w:t>
+      </w:r>
+    </w:p>
+    <w:p>
+      <w:r>
+        <w:t>本次同步私人包v1191–v1194的监管标准内心解析与有效心情保留，清除私人仍存在的innerThoughtMissingAt隐藏判断；保留私人键盘坐标、旁白点击保护、原生能力与旧包。只做明确共享功能的定点同步，未用网页app.js整份覆盖私人适配。网页推送与源码包制作按用户授权进行；新包从干净提交归档，不覆盖旧包。包内双入口、共享监管/剧场脚本、心情及请求生命周期函数均须核对。Mac/Xcode编译、签名、真实iPhone安装仍未进行，此包仅Mac待编译源码候选，不是IPA。</w:t>
+      </w:r>
+    </w:p>
+    <w:p>
+      <w:r>
+        <w:t>新增触发计数及迁移回归、后台请求取消/迟到/墙钟超时测试、配角先答取消释放测试。Windows全仓最终目标1516项，实际通过结果以本轮执行为准。浏览器故障注入已证明网页及私人内置页后台恢复释放按钮、忽略旧结果、下一次点击送达；真实模型HTTP仅由测试替身控制，不等于真实网络或iPhone已通过。真实计时脚本 check_v1195_watch.cjs 同时检查两边聊天/抖音短停留不计数、第一次触发为1与标准内心送达。</w:t>
+      </w:r>
+    </w:p>
+    <w:p>
+      <w:r>
+        <w:t>工程规则：计数语义改变要迁移旧账本；请求生命周期必须覆盖正文读取并在恢复前台处理悬挂任务；取消不能进入自动重试，busy必须由任务最终清理。维护文档仅追加旧记录，段落已校验；本机缺少LibreOffice，未完成页面渲染。</w:t>
       </w:r>
     </w:p>
     <w:sectPr>

</xml_diff>

<commit_message>
fix: avoid extra model calls for missing inner thoughts (v1196)
</commit_message>
<xml_diff>
--- a/docs/maintenance/AI开发项目_Bug修改规范.docx
+++ b/docs/maintenance/AI开发项目_Bug修改规范.docx
@@ -10300,6 +10300,24 @@
     <w:p>
       <w:r>
         <w:t>工程规则：计数语义改变要迁移旧账本；请求生命周期必须覆盖正文读取并在恢复前台处理悬挂任务；取消不能进入自动重试，busy必须由任务最终清理。维护文档仅追加旧记录，段落已校验；本机缺少LibreOffice，未完成页面渲染。</w:t>
+      </w:r>
+    </w:p>
+    <w:p>
+      <w:pPr>
+        <w:pStyle w:val="Heading2"/>
+      </w:pPr>
+      <w:r>
+        <w:t>2026-09-06 v1196：内心格式与请求成本边界</w:t>
+      </w:r>
+    </w:p>
+    <w:p>
+      <w:r>
+        <w:t>角色内心属于可缺失的附属显示；正文已正常时不得为了补齐内心再调用模型。先本地解析明确格式变体，无效值保留上一有效值；不得伪造角色内心。格式规范不能承诺模型百分之百遵守。</w:t>
+      </w:r>
+    </w:p>
+    <w:p>
+      <w:r>
+        <w:t>通用拦截诊断不等于格式错误，必须对照原始候选、处理分支和实际请求数量定位原因。涉及调用成本的回归必须运行完整回复链并等待真正的生成结束；按钮包装器返回不代表消息已经送达。版本更新应审查非版本数字与颜色，不能仅全局替换后就发布。</w:t>
       </w:r>
     </w:p>
     <w:sectPr>

</xml_diff>

<commit_message>
feat: add model route diagnostics inside common-life settings (v1197)
</commit_message>
<xml_diff>
--- a/docs/maintenance/AI开发项目_Bug修改规范.docx
+++ b/docs/maintenance/AI开发项目_Bug修改规范.docx
@@ -10318,6 +10318,29 @@
     <w:p>
       <w:r>
         <w:t>通用拦截诊断不等于格式错误，必须对照原始候选、处理分支和实际请求数量定位原因。涉及调用成本的回归必须运行完整回复链并等待真正的生成结束；按钮包装器返回不代表消息已经送达。版本更新应审查非版本数字与颜色，不能仅全局替换后就发布。</w:t>
+      </w:r>
+    </w:p>
+    <w:p>
+      <w:pPr>
+        <w:pStyle w:val="Heading2"/>
+      </w:pPr>
+      <w:r>
+        <w:t>2026-09-06 · v1197 共同生活设置内模型与路线诊断</w:t>
+      </w:r>
+    </w:p>
+    <w:p>
+      <w:r>
+        <w:t>通道诊断必须跟随实际请求上下文，不能用微信诊断冒充共同生活，也不能把主角线路冒充配角线路。当前配置与请求时配置分别呈现；未返回结束原因或用量时不猜测。</w:t>
+      </w:r>
+    </w:p>
+    <w:p>
+      <w:r>
+        <w:t>诊断入口不得触发测试模型、重试或变更路线。记录必须白名单化，保留模型名、状态与规模即可，不记录正文、Key、接口地址或未经清洗的错误原文。</w:t>
+      </w:r>
+    </w:p>
+    <w:p>
+      <w:r>
+        <w:t>共同生活设置会被私人拦截和多人剧场组件依次包装。新增入口必须验证最终DOM位于details内部且折叠隐藏，不能只对单一基础HTML字符串做位置断言。</w:t>
       </w:r>
     </w:p>
     <w:sectPr>

</xml_diff>

<commit_message>
feat: show per-section request size details online and in common life (v1198)
</commit_message>
<xml_diff>
--- a/docs/maintenance/AI开发项目_Bug修改规范.docx
+++ b/docs/maintenance/AI开发项目_Bug修改规范.docx
@@ -10341,6 +10341,29 @@
     <w:p>
       <w:r>
         <w:t>共同生活设置会被私人拦截和多人剧场组件依次包装。新增入口必须验证最终DOM位于details内部且折叠隐藏，不能只对单一基础HTML字符串做位置断言。</w:t>
+      </w:r>
+    </w:p>
+    <w:p>
+      <w:pPr>
+        <w:pStyle w:val="Heading2"/>
+      </w:pPr>
+      <w:r>
+        <w:t>2026-09-06 · v1198 线上与共同生活请求规模详情</w:t>
+      </w:r>
+    </w:p>
+    <w:p>
+      <w:r>
+        <w:t>请求规模详情必须与现有统计口径对账；字符、字节、tokens与费用不可混称。JSON格式和转义必须计入，不得让分项合计小于或大于总数。</w:t>
+      </w:r>
+    </w:p>
+    <w:p>
+      <w:r>
+        <w:t>统计必须在请求生成时取得快照，旧记录缺明细时明确不可恢复，不能用当前人设/设置伪造旧占比。分类若按章节判断，应明确口径并保留其他类别，不能假装精确追踪了每个原始字段。</w:t>
+      </w:r>
+    </w:p>
+    <w:p>
+      <w:r>
+        <w:t>诊断只存分类/数值，详情中不要复制原始提示词、聊天原文或任意用户章节标题。验证线上和共同生活各自实际入口，详情只观察，不触发模型测试或重试。</w:t>
       </w:r>
     </w:p>
     <w:sectPr>

</xml_diff>

<commit_message>
fix: avoid spurious delivery repair calls and clarify private diagnostics v1199
</commit_message>
<xml_diff>
--- a/docs/maintenance/AI开发项目_Bug修改规范.docx
+++ b/docs/maintenance/AI开发项目_Bug修改规范.docx
@@ -10364,6 +10364,29 @@
     <w:p>
       <w:r>
         <w:t>诊断只存分类/数值，详情中不要复制原始提示词、聊天原文或任意用户章节标题。验证线上和共同生活各自实际入口，详情只观察，不触发模型测试或重试。</w:t>
+      </w:r>
+    </w:p>
+    <w:p>
+      <w:pPr>
+        <w:pStyle w:val="Heading2"/>
+      </w:pPr>
+      <w:r>
+        <w:t>2026-09-06 v1199 外卖补判误触发及私人诊断归因</w:t>
+      </w:r>
+    </w:p>
+    <w:p>
+      <w:r>
+        <w:t>诊断必须区分隐藏标签的正常处理、模型辅助动作判断和真正重写聊天。正常内心/记忆标签不能作为额外请求依据；不能把所有较早候选默认认定为未展示。补判按当前用户请求或当前可见承诺判断，隐藏元数据及未来回顾不构成当前外卖意图。保留付款/订单事实校验，不能为降耗而伪造动作或移除授权。</w:t>
+      </w:r>
+    </w:p>
+    <w:p>
+      <w:r>
+        <w:t>Windows全仓1544/1544通过。浏览器实际网页及私人内置入口六组模拟HTTP流程：用户原话加截图回复各一次模型调用、四条正文送达；标准内心/记忆各一次调用；当前真实点餐承诺仍可进行第二次补判，私人只记录辅助结果且明确用途。打开诊断没有追加模型调用。保留有效内心及顶部栏框，未改共同生活、监管、请求规模详情及私人键盘。首次完整测试1543通过、1失败为安装指南路径期待旧名称，更新指南引用后通过；一次短记忆测试出现本地记忆不采纳记录，仍仅一次模型调用，不当作额外请求或改坏事实校验。</w:t>
+      </w:r>
+    </w:p>
+    <w:p>
+      <w:r>
+        <w:t>此为本地代码复现与模拟HTTP验证，未取得用户上游调用日志，不保证所有其他校验场景都只有一次请求。私人包是Mac待编译源码候选，未Mac编译、签名或真实iPhone验证。新版本只从干净提交归档，不覆盖旧包；网页按授权推送一次，线上生效另行核实。维护资料仅追加，历史保留。Windows没有LibreOffice，DOCX段落及历史保留已复查，视觉渲染未完成。</w:t>
       </w:r>
     </w:p>
     <w:sectPr>

</xml_diff>

<commit_message>
fix: make foreground and background reply handoff mutually exclusive v1200
</commit_message>
<xml_diff>
--- a/docs/maintenance/AI开发项目_Bug修改规范.docx
+++ b/docs/maintenance/AI开发项目_Bug修改规范.docx
@@ -10387,6 +10387,39 @@
     <w:p>
       <w:r>
         <w:t>此为本地代码复现与模拟HTTP验证，未取得用户上游调用日志，不保证所有其他校验场景都只有一次请求。私人包是Mac待编译源码候选，未Mac编译、签名或真实iPhone验证。新版本只从干净提交归档，不覆盖旧包；网页按授权推送一次，线上生效另行核实。维护资料仅追加，历史保留。Windows没有LibreOffice，DOCX段落及历史保留已复查，视觉渲染未完成。</w:t>
+      </w:r>
+    </w:p>
+    <w:p>
+      <w:pPr>
+        <w:pStyle w:val="Heading2"/>
+      </w:pPr>
+      <w:r>
+        <w:t>2026-09-06 v1200 前后台回复接力互斥</w:t>
+      </w:r>
+    </w:p>
+    <w:p>
+      <w:r>
+        <w:t>两边共有：网页与私人内置网页 v1200，私人 iOS 1.0.322 (322)，原生桥 35。用户报告退后台约一两分钟后先收到标为后台的回复，数秒后同一用户消息又被近似回答。用实际网页与私人内置入口、模拟模型 HTTP 和后台回包复现：后台先入聊，本地旧请求继续发送。此为代码路径复现，用户现场具体 triggerKind 尚未取得，不把泛称后台主动消息等同 scheduled。</w:t>
+      </w:r>
+    </w:p>
+    <w:p>
+      <w:r>
+        <w:t>修复仅关联普通微信 reply_handoff 与原用户消息 ID。本地模型等待不占用结果锁；真正开始处理候选或后台结果时取得同轮归属，完成标记存于原用户消息。后台先完成阻止本地旧结果，本地先完成阻止后台改写结果；不按文字相似度删除。正常正文入聊标注回复源。失败或空输出释放归属，保留接力；保存失败不确认收件、不发布完成活动和不取消后台，已暂存后台结果可再次保存。排队旧轮次在开始前核对完成标记，手动继续聊仍可用；不同消息、账号、角色互不取消。</w:t>
+      </w:r>
+    </w:p>
+    <w:p>
+      <w:r>
+        <w:t>新增 phone_role_push_pull 只读返回 replyToMessageId/replyToAccountId，按已有 task:&lt;id&gt; 关联同 target、role 的 reply_handoff 任务；不改数据表与模型策略。新增 phone_role_background_complete_turn 在原所有者鉴权下仅取消对应消息 ID 的主账号接力，保留新消息与设备任务。202609060001_reply_handoff_source_identity 已独立事务部署并登记，未重放旧迁移、未重新部署其他云函数；正式接口再做事务回滚数据验证，来源关联、取消范围、拒绝错误鉴权通过，测试记录残留0。</w:t>
+      </w:r>
+    </w:p>
+    <w:p>
+      <w:r>
+        <w:t>Windows全仓1562/1562通过。实际双入口十组浏览器模拟HTTP验证覆盖后台先回、本地先回、保存失败再收件、独立scheduled不被接管、旧后台到达时新的用户回复继续；另外覆盖空结果回退、账号隔离、相同文字不同消息、持久化后重新建运行时、队列旧轮与继续聊。首次扩大回归出现的失败来自隔离测试未加载新依赖或期待旧的直接push/finally文本，已更新实际辅助函数与断言并通过；不以修改预期掩盖行为失败。保留外卖降耗、请求规模明细、心情、监管、共同生活与私人键盘适配。</w:t>
+      </w:r>
+    </w:p>
+    <w:p>
+      <w:r>
+        <w:t>已发往上游的旧模型请求可能继续计费，不能宣称消除全部双请求费用；已送达的系统通知也不能保证撤回。身份不明的历史回包和scheduled/device等独立事件沿用原流程，未用模糊去重扩大拦截。私人包只为干净提交的Mac待编译源码候选，未Mac编译、签名和真实iPhone验证。维护文档仅追加并核对历史保留；本机无LibreOffice，DOCX视觉渲染尚未完成。</w:t>
       </w:r>
     </w:p>
     <w:sectPr>

</xml_diff>

<commit_message>
feat: add pixel girl care and prepare private v1202 iOS323
</commit_message>
<xml_diff>
--- a/docs/maintenance/AI开发项目_Bug修改规范.docx
+++ b/docs/maintenance/AI开发项目_Bug修改规范.docx
@@ -10420,6 +10420,83 @@
     <w:p>
       <w:r>
         <w:t>已发往上游的旧模型请求可能继续计费，不能宣称消除全部双请求费用；已送达的系统通知也不能保证撤回。身份不明的历史回包和scheduled/device等独立事件沿用原流程，未用模糊去重扩大拦截。私人包只为干净提交的Mac待编译源码候选，未Mac编译、签名和真实iPhone验证。维护文档仅追加并核对历史保留；本机无LibreOffice，DOCX视觉渲染尚未完成。</w:t>
+      </w:r>
+    </w:p>
+    <w:p>
+      <w:pPr>
+        <w:pageBreakBefore/>
+        <w:keepNext/>
+      </w:pPr>
+      <w:r>
+        <w:t xml:space="preserve">2026年9月6日 本地养成预览计时与恢复规则</w:t>
+      </w:r>
+    </w:p>
+    <w:p>
+      <w:r>
+        <w:t xml:space="preserve">经过时间只能由专用结算器推进，持久化函数不能重置结算起点。状态或睡眠灯光模式切换前先按旧模式结算；累计结果应通过一次结算与分多次结算等价测试，保留离线结算上限和时间回拨高水位。</w:t>
+      </w:r>
+    </w:p>
+    <w:p>
+      <w:r>
+        <w:t xml:space="preserve">健康惩罚或睡眠锁不能拦截恢复动作。用药、休息和食物耗尽后的恢复途径都应从实际界面验证可达；不能以强制点击绕过状态栏等遮挡来让测试通过。自动照顾取消后不得继续迟到喂食。</w:t>
+      </w:r>
+    </w:p>
+    <w:p>
+      <w:r>
+        <w:t xml:space="preserve">本地演示明确标为演示，不冒充真实绑定角色；验证只能使用隔离测试存档，不能清空用户正在试玩的存档。整个人物画面验收优先于服装数量，未经视觉验收的拼接资产不标为完成。</w:t>
+      </w:r>
+    </w:p>
+    <w:p>
+      <w:pPr>
+        <w:pageBreakBefore/>
+        <w:keepNext/>
+      </w:pPr>
+      <w:r>
+        <w:t xml:space="preserve">2026年9月6日 像素少女 P07 互动洗漱与用户音频</w:t>
+      </w:r>
+    </w:p>
+    <w:p>
+      <w:r>
+        <w:t xml:space="preserve">演示中的可见鼠标只是本地可视动作执行器，应调用和手动相同的动作函数，不能只演动画而直接改最终状态；每段等待与拖拽检查取消令牌和页面可见性。镜子近景保持同一原人物素材，不独立换脸。</w:t>
+      </w:r>
+    </w:p>
+    <w:p>
+      <w:r>
+        <w:t xml:space="preserve">普通上床动作不隐式改变灯光；如要自动关灯，应作为明确独立动作展示。默认音乐与用户歌单播放互斥，声音池有界；后台暂停，恢复时尊重用户暂停和静音设置。用户提供音频原样保留，不转传。</w:t>
+      </w:r>
+    </w:p>
+    <w:p>
+      <w:pPr>
+        <w:pageBreakBefore/>
+        <w:keepNext/>
+      </w:pPr>
+      <w:r>
+        <w:t xml:space="preserve">2026年9月7日 像素少女接入边界</w:t>
+      </w:r>
+    </w:p>
+    <w:p>
+      <w:r>
+        <w:t xml:space="preserve">动作随机不能打乱必要先后顺序，也不能绕过饱腹、库存、睡眠、低健康等门槛。随机药水或自动付费购买不属于普通喂食。执行中使用当前数值复验，不只相信生成时快照。</w:t>
+      </w:r>
+    </w:p>
+    <w:p>
+      <w:r>
+        <w:t xml:space="preserve">iframe接入必须检查来源窗口、源站、会话、账号和绑定角色；普通界面刷新不应重建正在玩的子页，失效后必须提供可退出路径。沿用游戏时长统计，并排除绑定伴侣正在参与时的监管误触发。</w:t>
+      </w:r>
+    </w:p>
+    <w:p>
+      <w:r>
+        <w:t xml:space="preserve">模型请求失败不自动多轮纠正；普通照顾错误与未来穿搭计划错误分别记录，周期检查不得反复覆盖当前反馈。自动安排与手动照顾同时发生要复用等待中的请求。</w:t>
+      </w:r>
+    </w:p>
+    <w:p>
+      <w:r>
+        <w:t xml:space="preserve">任何网页关闭时的定时动作，必须明确预生成计划与重新打开补执行的边界；本地模拟模型和源文件一致不等于后台在线、真实模型、Mac编译或iPhone通过。用户暂停上传后不得提交推送。</w:t>
+      </w:r>
+    </w:p>
+    <w:p>
+      <w:r>
+        <w:t xml:space="preserve">2026年9月7日 私人源码包归档规则：新增子目录不能仅靠顶层script标签校验；必须遍历已提交小游戏文件并与私人包逐个比对。打包只使用明确提交的源码，禁止用git add .带入本地预览、截图、旧安装包或临时目录。用户只授权私人打包时允许必要本地归档提交，但不能据此推送网页。原生Target和诊断版本均须一致，仍不得将源码ZIP称为可安装IPA。</w:t>
       </w:r>
     </w:p>
     <w:sectPr>

</xml_diff>

<commit_message>
fix(pixel-home): restore care and photo interactions for private iOS324
</commit_message>
<xml_diff>
--- a/docs/maintenance/AI开发项目_Bug修改规范.docx
+++ b/docs/maintenance/AI开发项目_Bug修改规范.docx
@@ -10497,6 +10497,11 @@
     <w:p>
       <w:r>
         <w:t xml:space="preserve">2026年9月7日 私人源码包归档规则：新增子目录不能仅靠顶层script标签校验；必须遍历已提交小游戏文件并与私人包逐个比对。打包只使用明确提交的源码，禁止用git add .带入本地预览、截图、旧安装包或临时目录。用户只授权私人打包时允许必要本地归档提交，但不能据此推送网页。原生Target和诊断版本均须一致，仍不得将源码ZIP称为可安装IPA。</w:t>
+      </w:r>
+    </w:p>
+    <w:p>
+      <w:r>
+        <w:t xml:space="preserve">2026-09-07 新规则：小游戏独立模型请求不得隐式启用complete自动续写。整轮请求必须涵盖HTTP正文等待，超时后保留未结束任务互斥，丢弃迟到结果；不能仅靠iframe超时假装取消上游。后台存档失败必须提示，不把存档排队与交互响应串行绑定。file来源canvas导出必须验证实际照片生成；不得为局部相机功能扩大WebView全局文件访问权限。生成编码素材须逐字节核对原图，记录包体代价。睡姿/立绘等图像必须采用来源宽高比，不能分别按屏幕宽高任意拉伸。DOCX本次仅追加原XML并核对历史保留；本机无LibreOffice，视觉渲染未验证。</w:t>
       </w:r>
     </w:p>
     <w:sectPr>

</xml_diff>

<commit_message>
feat(pixel-home): integrate approved wardrobe for private iOS325
</commit_message>
<xml_diff>
--- a/docs/maintenance/AI开发项目_Bug修改规范.docx
+++ b/docs/maintenance/AI开发项目_Bug修改规范.docx
@@ -10502,6 +10502,16 @@
     <w:p>
       <w:r>
         <w:t xml:space="preserve">2026-09-07 新规则：小游戏独立模型请求不得隐式启用complete自动续写。整轮请求必须涵盖HTTP正文等待，超时后保留未结束任务互斥，丢弃迟到结果；不能仅靠iframe超时假装取消上游。后台存档失败必须提示，不把存档排队与交互响应串行绑定。file来源canvas导出必须验证实际照片生成；不得为局部相机功能扩大WebView全局文件访问权限。生成编码素材须逐字节核对原图，记录包体代价。睡姿/立绘等图像必须采用来源宽高比，不能分别按屏幕宽高任意拉伸。DOCX本次仅追加原XML并核对历史保留；本机无LibreOffice，视觉渲染未验证。</w:t>
+      </w:r>
+    </w:p>
+    <w:p>
+      <w:r>
+        <w:t xml:space="preserve">2026年9月7日 v1204 私人衣柜整体试玩</w:t>
+      </w:r>
+    </w:p>
+    <w:p>
+      <w:r>
+        <w:t xml:space="preserve">像素素材的透明杂点不能作为可见轮廓边界；先量实际alpha可见范围，修局部线头时禁止整体缩短眼线。独立预览接入正式小游戏必须逐项保留角色桥、账号隔离、持久化和file素材读取，不能用演示入口替换正式逻辑。必须从用户页面实际导出的配置生成默认值，并在包内核对每份素材和入口字节。</w:t>
       </w:r>
     </w:p>
     <w:sectPr>

</xml_diff>

<commit_message>
fix(pixel-home): refine hair and add named persona-based outfits
</commit_message>
<xml_diff>
--- a/docs/maintenance/AI开发项目_Bug修改规范.docx
+++ b/docs/maintenance/AI开发项目_Bug修改规范.docx
@@ -10512,6 +10512,36 @@
     <w:p>
       <w:r>
         <w:t xml:space="preserve">像素素材的透明杂点不能作为可见轮廓边界；先量实际alpha可见范围，修局部线头时禁止整体缩短眼线。独立预览接入正式小游戏必须逐项保留角色桥、账号隔离、持久化和file素材读取，不能用演示入口替换正式逻辑。必须从用户页面实际导出的配置生成默认值，并在包内核对每份素材和入口字节。</w:t>
+      </w:r>
+    </w:p>
+    <w:p>
+      <w:r>
+        <w:t xml:space="preserve">2026年9月7日 v1205 自定义套装和发型白边修复</w:t>
+      </w:r>
+    </w:p>
+    <w:p>
+      <w:r>
+        <w:t xml:space="preserve">修白边要区分透明边缘残底、浅色发圈和发丝高光，禁止统一删除浅色或整体缩小素材；保留原画布、锚点、RGB，记录alpha变化和保护区。自定义套装保存选中装扮的独立快照，禁止快照里嵌套整份套装列表；更新和删除必须有明确目标，不能按同名覆盖。原素材清单仅做白边修复时须显式兼容旧完整hash清单，不放开任意不匹配配置。</w:t>
+      </w:r>
+    </w:p>
+    <w:p>
+      <w:r>
+        <w:t xml:space="preserve">嵌套iframe上的关闭按钮必须检查遮挡和未保存状态。自动换装不能盖掉用户正在编辑的搭配；只存实际执行记录，不把旧固定两套计划或随机执行结果冒充角色新生成的发言。真实模型上下文仅传当前绑定账号与角色的套装名字/事实。网页8点任务必须说明关闭App时不能准点执行。</w:t>
+      </w:r>
+    </w:p>
+    <w:p>
+      <w:r>
+        <w:t xml:space="preserve">2026年9月7日 v1205 晚间睡衣补充：用户新增每天19点换睡衣。实现19点至次日8点为夜间时段，使用已确认粉格兔兔睡衣、兔兔拖鞋和配套发饰，保留当前头发、五官及身体比例。早晚分别保存day与period标记；夜间首次打开只补夜间，不先换日装。凌晨算上一晚，直到8点再选日装。衣柜编辑期间推迟到退出，后续手动换装不被同一时段重复覆盖。角色上下文区分morning、evening与current，记录真实发生时间；未后台运行不称准点执行。新增19:00边界、凌晨跨日及实际父子桥应用睡衣检查，两边通过。</w:t>
+      </w:r>
+    </w:p>
+    <w:p>
+      <w:r>
+        <w:t xml:space="preserve">2026-09-07 v1205 自动角色选衣的边界</w:t>
+      </w:r>
+    </w:p>
+    <w:p>
+      <w:r>
+        <w:t xml:space="preserve">按人设选择必须使用已绑定角色的真实模型线路与persona，所有资产白名单ID必须验证；程序随机结果不能冒充角色偏好。聊天上下文构建只读事实，不能嵌套触发另一次模型请求。异步父子层衣柜同步须用时段确认保护新状态，防初始化旧存档回写；正在编辑、账号变化、越过时段或用户微调后拒绝迟到结果。模型结果只改变服装和发型，不能重置用户五官及身体比例。</w:t>
       </w:r>
     </w:p>
     <w:sectPr>

</xml_diff>

<commit_message>
release: package v1205 iOS326 and authorize web publication
</commit_message>
<xml_diff>
--- a/docs/maintenance/AI开发项目_Bug修改规范.docx
+++ b/docs/maintenance/AI开发项目_Bug修改规范.docx
@@ -10542,6 +10542,11 @@
     <w:p>
       <w:r>
         <w:t xml:space="preserve">按人设选择必须使用已绑定角色的真实模型线路与persona，所有资产白名单ID必须验证；程序随机结果不能冒充角色偏好。聊天上下文构建只读事实，不能嵌套触发另一次模型请求。异步父子层衣柜同步须用时段确认保护新状态，防初始化旧存档回写；正在编辑、账号变化、越过时段或用户微调后拒绝迟到结果。模型结果只改变服装和发型，不能重置用户五官及身体比例。</w:t>
+      </w:r>
+    </w:p>
+    <w:p>
+      <w:r>
+        <w:t xml:space="preserve">2026年9月7日 v1205发布边界：已验收的完全相同运行内容从本地转上线可保留其候选版本；新源包首次使用新包名并拒绝覆盖。打包必须从干净提交归档，比对全部嵌套游戏资源及新增顶层metadata。Git推送成功不等于网站部署成功，应再核实远端流水线及正式入口。</w:t>
       </w:r>
     </w:p>
     <w:sectPr>

</xml_diff>

<commit_message>
fix(pixel-home): show bound nickname while waiting; package v1206
</commit_message>
<xml_diff>
--- a/docs/maintenance/AI开发项目_Bug修改规范.docx
+++ b/docs/maintenance/AI开发项目_Bug修改规范.docx
@@ -10547,6 +10547,11 @@
     <w:p>
       <w:r>
         <w:t xml:space="preserve">2026年9月7日 v1205发布边界：已验收的完全相同运行内容从本地转上线可保留其候选版本；新源包首次使用新包名并拒绝覆盖。打包必须从干净提交归档，比对全部嵌套游戏资源及新增顶层metadata。Git推送成功不等于网站部署成功，应再核实远端流水线及正式入口。</w:t>
+      </w:r>
+    </w:p>
+    <w:p>
+      <w:r>
+        <w:t xml:space="preserve">2026年9月7日 昵称提示：已有认证桥提供角色显示名称时直接复用，避免硬编码示例名或另建角色状态；名称作为纯文本写入，并检查初始提示与后续计时提示一致。小范围文案修改不改变照顾请求或持久化逻辑；网页与私人版本都应同步并给新版本号。网页ZIP与私人源码ZIP应分别核对真实运行资源，不能互相替代。</w:t>
       </w:r>
     </w:p>
     <w:sectPr>

</xml_diff>

<commit_message>
release: v1209 shared reply fixes with isolated private HomeKit and performance updates
</commit_message>
<xml_diff>
--- a/docs/maintenance/AI开发项目_Bug修改规范.docx
+++ b/docs/maintenance/AI开发项目_Bug修改规范.docx
@@ -10552,6 +10552,80 @@
     <w:p>
       <w:r>
         <w:t xml:space="preserve">2026年9月7日 昵称提示：已有认证桥提供角色显示名称时直接复用，避免硬编码示例名或另建角色状态；名称作为纯文本写入，并检查初始提示与后续计时提示一致。小范围文案修改不改变照顾请求或持久化逻辑；网页与私人版本都应同步并给新版本号。网页ZIP与私人源码ZIP应分别核对真实运行资源，不能互相替代。</w:t>
+      </w:r>
+    </w:p>
+    <w:p>
+      <w:r>
+        <w:br w:type="page"/>
+      </w:r>
+    </w:p>
+    <w:p>
+      <w:pPr>
+        <w:pStyle w:val="Heading1"/>
+      </w:pPr>
+      <w:r>
+        <w:rPr>
+          <w:sz w:val="30"/>
+        </w:rPr>
+        <w:t>2026年9月8日 消息与小事簿修复 本地未发布</w:t>
+      </w:r>
+    </w:p>
+    <w:p>
+      <w:r>
+        <w:t>状态与范围：两边共有，网页 app.js、cohab-theater.js 与私人 PhoneWeb.bundle 对应逻辑分别修改，保留私人原有性能与恢复实现；后台 phone-role-push 仅改本地源码。用户要求先完成修改，等待明确授权再打包。本次没有提交、推送、部署服务器或生成安装包，不提升或复用发布版本号；正式发布必须重新分配唯一网页版本并核对私人资源包含关系。</w:t>
+      </w:r>
+    </w:p>
+    <w:p>
+      <w:r>
+        <w:t>原文实验不是取消功能权限。正文重复与格式过滤可关闭，真实设备授权、支付校验、会话/账号归属、后台消息或任务 ID 去重不得关闭。配置快照只传入需要展示给用户的角色请求，不能全局放开 JSON 动作决策、外卖、图片规划等辅助请求。后台功能须显式同步配置并另行部署，前端本地修改不等于已影响线上后台。</w:t>
+      </w:r>
+    </w:p>
+    <w:p>
+      <w:r>
+        <w:t>涉及自主角色动作，生成入口必须固定角色人设和其独立模型路线；等待模型和媒体期间切账号、删除角色、替换对象时不得发布到新角色。不用当前页面选中人或错误回落弥补迟到结果。</w:t>
+      </w:r>
+    </w:p>
+    <w:p>
+      <w:r>
+        <w:t>隐藏总结必须有本轮证据、正确说话者和作者归属。不能把用户愿望记成角色承诺；角色未实际说出的候选内容不得作为已承诺事实。只在消息已进入对应对话后收录，保留旧记录，不以未经核实的旧来源声称用户亲写。</w:t>
+      </w:r>
+    </w:p>
+    <w:p>
+      <w:r>
+        <w:t>修改共享回复管线前列出网页与私人消费者，分别检查旧实现差异，不能把网页整文件覆盖私人性能或恢复逻辑。回归同时跑默认关闭与开启，并覆盖合法标签、未知正文、长重复文本、后台未完成回复、异步切号以及持久化。并行打包或 staging 可能覆盖本次逻辑，收尾必须复查实际文件，不能凭一次测试声明当前产物仍一致。</w:t>
+      </w:r>
+    </w:p>
+    <w:p>
+      <w:r>
+        <w:t>已验证与限制：完全隔离外网的浏览器夹具覆盖网页和私人网页入口的开关关闭、开启、再次关闭，微信、电话字幕、单次约会、共同生活、多人配角、合法内心/发推/来电标签及设置持久化。新增 Node 运行时测试覆盖 X 异步角色和账号归属、小事簿证据与落地时序、后台原文及待回复/锁定边界、查手机后回复。没有调用真实模型、真实 Supabase、真实支付或真实设备，不称 iPhone 音频播放及后台定时行为已验收。全量测试最终结果见同目录消息与小事簿现场记录的收尾章节。</w:t>
+      </w:r>
+    </w:p>
+    <w:p>
+      <w:r>
+        <w:br w:type="page"/>
+      </w:r>
+    </w:p>
+    <w:p>
+      <w:pPr>
+        <w:pStyle w:val="Heading1"/>
+      </w:pPr>
+      <w:r>
+        <w:t>2026年9月8日 v1209 分离网页与私人功能的汇总发布</w:t>
+      </w:r>
+    </w:p>
+    <w:p>
+      <w:r>
+        <w:t>跨任务发布以当前有效成果为单位，不以“所有工作区”作为把旧整树覆盖最新版本的理由。私人源码可与网页源码一同入仓，但网页入口和静态网页包必须不包含私人功能。仓库公开性与运行功能隔离是两件事，不将 native 目录误称保密。</w:t>
+      </w:r>
+    </w:p>
+    <w:p>
+      <w:r>
+        <w:t>打包前检查 ignored-but-required 文件。工作区文件存在和本地测试通过，不能代替 git 跟踪清单及最终 ZIP 的包含证明。所有用户可见共享脚本、样式、嵌套素材和双入口必须反向核对；保留私人核心的性能、恢复及原生差异，禁止用旧 staging 脚本从网页整包覆盖私人核心。</w:t>
+      </w:r>
+    </w:p>
+    <w:p>
+      <w:r>
+        <w:t>新网页和私人产物都使用唯一新版本、新包名。Windows 产物仅为 Mac 待编译源码候选，尚无 Mac 编译签名和真实 iPhone 验收，不可称可运行私人交付。推送只自动尝试一次，线上 Pages 与单独的后台函数部署分别核实，不混淆提交、包生成与上线状态。</w:t>
       </w:r>
     </w:p>
     <w:sectPr>

</xml_diff>

<commit_message>
fix: restore authorized-phone chat on web and private v1210
</commit_message>
<xml_diff>
--- a/docs/maintenance/AI开发项目_Bug修改规范.docx
+++ b/docs/maintenance/AI开发项目_Bug修改规范.docx
@@ -10626,6 +10626,29 @@
     <w:p>
       <w:r>
         <w:t>新网页和私人产物都使用唯一新版本、新包名。Windows 产物仅为 Mac 待编译源码候选，尚无 Mac 编译签名和真实 iPhone 验收，不可称可运行私人交付。推送只自动尝试一次，线上 Pages 与单独的后台函数部署分别核实，不混淆提交、包生成与上线状态。</w:t>
+      </w:r>
+    </w:p>
+    <w:p>
+      <w:r>
+        <w:br w:type="page"/>
+      </w:r>
+    </w:p>
+    <w:p>
+      <w:pPr>
+        <w:pStyle w:val="Heading1"/>
+      </w:pPr>
+      <w:r>
+        <w:t>2026年9月8日 v1210 核心聊天中断热修复</w:t>
+      </w:r>
+    </w:p>
+    <w:p>
+      <w:r>
+        <w:t>用户于此次严重事故后明确要求保存长期规则：发布必须保护核心功能。每次修改先界定共享消费者；核心聊天必须跑真实入口并覆盖已有权限和已有存档、角色与账号隔离、默认及实验模式、可见送达、忙碌释放与状态恢复。测试必须先能捕获原故障，不能只凭语法通过、源码正则、默认空存档或测试总数宣布可发布。</w:t>
+      </w:r>
+    </w:p>
+    <w:p>
+      <w:r>
+        <w:t>变量重命名和新上下文引用必须在实际函数作用域验证。共享函数的普通聊天、电话上下文、手动刷新及自动查看都要列入回归，网页和私人入口分别检查。最终包与线上资源另行反向验证；无法验证的真机路径必须披露，不能以绝对无Bug承诺替代证据。</w:t>
       </w:r>
     </w:p>
     <w:sectPr>

</xml_diff>

<commit_message>
release: v1211 Beijing timestamps and isolated private iOS336 updates
</commit_message>
<xml_diff>
--- a/docs/maintenance/AI开发项目_Bug修改规范.docx
+++ b/docs/maintenance/AI开发项目_Bug修改规范.docx
@@ -10649,6 +10649,52 @@
     <w:p>
       <w:r>
         <w:t>变量重命名和新上下文引用必须在实际函数作用域验证。共享函数的普通聊天、电话上下文、手动刷新及自动查看都要列入回归，网页和私人入口分别检查。最终包与线上资源另行反向验证；无法验证的真机路径必须披露，不能以绝对无Bug承诺替代证据。</w:t>
+      </w:r>
+    </w:p>
+    <w:p>
+      <w:r>
+        <w:br w:type="page"/>
+      </w:r>
+    </w:p>
+    <w:p>
+      <w:pPr>
+        <w:pStyle w:val="Heading1"/>
+      </w:pPr>
+      <w:r>
+        <w:t>2026年9月8日 私人版后台模型拒绝说明隔离</w:t>
+      </w:r>
+    </w:p>
+    <w:p>
+      <w:r>
+        <w:t>私人专属策略不得通过共享服务器默认分支影响网页：由私人入口明确同步标记，后端严格按 true 执行；同时测试无标记旧 profile 与网页原行为。新后台防护必须检查生成、动作、通知、收件、确认和持久化，不可只改气泡渲染。</w:t>
+      </w:r>
+    </w:p>
+    <w:p>
+      <w:r>
+        <w:t>区分技术调用失败与角色本人的拒绝。明确的模型安全拒绝保留系统诊断，不制造角色台词，不以无限重试、供应商轮换或提示模型改写作为绕过手段。缺少触发请求时，分别记录已复现的漏投递原因和未确认的模型拒绝原因。</w:t>
+      </w:r>
+    </w:p>
+    <w:p>
+      <w:r>
+        <w:br w:type="page"/>
+      </w:r>
+    </w:p>
+    <w:p>
+      <w:pPr>
+        <w:pStyle w:val="Heading1"/>
+      </w:pPr>
+      <w:r>
+        <w:t>2026年9月8日 v1211 北京时间与私人更新发布</w:t>
+      </w:r>
+    </w:p>
+    <w:p>
+      <w:r>
+        <w:t>版本更新不可使用无上下文的纯数字替换：iOS编号可能与RGB色相、尺寸比例和业务测试数字碰撞。只更新明确版本字段与资源查询参数；同时核验私人源副本一致和历史安装文档不被错误提升。</w:t>
+      </w:r>
+    </w:p>
+    <w:p>
+      <w:r>
+        <w:t>未完成草稿可以留在原位，但发布脚本必须列出精确排除文件，仅从已提交树生成产物，不能用宽泛忽略允许任意未跟踪文件混入。后台列表版本与记录不符时应下载实际源码核对，既不能盲覆盖，也不能仅以旧记录声明当前线上状态。</w:t>
       </w:r>
     </w:p>
     <w:sectPr>

</xml_diff>

<commit_message>
release: v1212 request diagnostics, compact timestamps and private iOS338 updates
</commit_message>
<xml_diff>
--- a/docs/maintenance/AI开发项目_Bug修改规范.docx
+++ b/docs/maintenance/AI开发项目_Bug修改规范.docx
@@ -10695,6 +10695,52 @@
     <w:p>
       <w:r>
         <w:t>未完成草稿可以留在原位，但发布脚本必须列出精确排除文件，仅从已提交树生成产物，不能用宽泛忽略允许任意未跟踪文件混入。后台列表版本与记录不符时应下载实际源码核对，既不能盲覆盖，也不能仅以旧记录声明当前线上状态。</w:t>
+      </w:r>
+    </w:p>
+    <w:p>
+      <w:r>
+        <w:br w:type="page"/>
+      </w:r>
+    </w:p>
+    <w:p>
+      <w:pPr>
+        <w:pStyle w:val="Heading1"/>
+      </w:pPr>
+      <w:r>
+        <w:t>2026年9月8日 纯英文拦截与心情格式 未发布</w:t>
+      </w:r>
+    </w:p>
+    <w:p>
+      <w:r>
+        <w:t>正文语言过滤必须与原文开关独立，但不能全局套在所有模型请求上，避免误拦总结、模型连通测试、图像提示词或 JSON 字段。判断时排除心情和功能元数据，合法译文必须能参与正文判定。拦截须早于动作及通知；手动释放和后台旧队列也须核对。</w:t>
+      </w:r>
+    </w:p>
+    <w:p>
+      <w:r>
+        <w:t>网页与私人入口可能同名不同路径，必须以实际请求与可见结果验证覆盖。只加强标签提示词不能宣称已保证模型永不格式出错；不能顺手修复用户明确暂缓的空回复、替换心情解析器或扩大中文出戏策略。</w:t>
+      </w:r>
+    </w:p>
+    <w:p>
+      <w:r>
+        <w:br w:type="page"/>
+      </w:r>
+    </w:p>
+    <w:p>
+      <w:pPr>
+        <w:pStyle w:val="Heading1"/>
+      </w:pPr>
+      <w:r>
+        <w:t>2026年9月8日 v1212 请求故障诊断与简洁时间</w:t>
+      </w:r>
+    </w:p>
+    <w:p>
+      <w:r>
+        <w:t>请求日志必须在发送前建立，失败和空响应保留原因；只记录成功结果不足以诊断。传输成功、正文提取成功和实际角色送达是不同阶段，不得互相替代。副作用观察不可增加调用或改变错误回退，存储配额失败不能中断核心聊天。复制诊断采用最小元数据，不自动包含聊天正文、响应片段和密钥。</w:t>
+      </w:r>
+    </w:p>
+    <w:p>
+      <w:r>
+        <w:t>时间标签不能参与气泡正文的内在宽度计算。共享代码新增要核对私人真实入口，机械补丁必须带准确上下文；新增JS须显式入库并检查双入口和Service Worker引用。新版本同时核对所有资源查询、启动身份和恢复入口，再从干净提交打包。</w:t>
       </w:r>
     </w:p>
     <w:sectPr>

</xml_diff>

<commit_message>
release: v1213 public North companion, cloud shortcuts and pixel loading recovery
</commit_message>
<xml_diff>
--- a/docs/maintenance/AI开发项目_Bug修改规范.docx
+++ b/docs/maintenance/AI开发项目_Bug修改规范.docx
@@ -10741,6 +10741,34 @@
     <w:p>
       <w:r>
         <w:t>时间标签不能参与气泡正文的内在宽度计算。共享代码新增要核对私人真实入口，机械补丁必须带准确上下文；新增JS须显式入库并检查双入口和Service Worker引用。新版本同时核对所有资源查询、启动身份和恢复入口，再从干净提交打包。</w:t>
+      </w:r>
+    </w:p>
+    <w:p>
+      <w:r>
+        <w:br w:type="page"/>
+      </w:r>
+    </w:p>
+    <w:p>
+      <w:pPr>
+        <w:pStyle w:val="Heading1"/>
+      </w:pPr>
+      <w:r>
+        <w:t>2026年9月8日 v1213 公开North迁移、云端快捷指令与素材恢复</w:t>
+      </w:r>
+    </w:p>
+    <w:p>
+      <w:r>
+        <w:t>跨公开/私人迁移必须以实际商店二进制能力为边界，允许旧协议适配但不补造缺失元数据。新增共享模块必须镜像私人包并缓存校验；任一可选适配未加载时不得阻断核心聊天。</w:t>
+      </w:r>
+    </w:p>
+    <w:p>
+      <w:r>
+        <w:t>云自动化需服务器幂等领取、事件去重、配额、独立主人鉴权、加密凭据和撤销检查。响应不确定不可自动再次生成扣费。入聊成功持久化后才能确认云收件，用户后来删除的消息不能被旧记录复活。</w:t>
+      </w:r>
+    </w:p>
+    <w:p>
+      <w:r>
+        <w:t>SQL上线前在事务回滚中执行真实函数，不能以语法或源代码正则代替数据库执行验证。新增代码的浏览器测试应验证实际运行标志、隔离状态和失败回退。没有Mac/Xcode与真机证据，私人ZIP只能称待编译源码包。</w:t>
       </w:r>
     </w:p>
     <w:sectPr>

</xml_diff>

<commit_message>
fix: hide mood metadata in public and private background notifications
</commit_message>
<xml_diff>
--- a/docs/maintenance/AI开发项目_Bug修改规范.docx
+++ b/docs/maintenance/AI开发项目_Bug修改规范.docx
@@ -10769,6 +10769,29 @@
     <w:p>
       <w:r>
         <w:t>SQL上线前在事务回滚中执行真实函数，不能以语法或源代码正则代替数据库执行验证。新增代码的浏览器测试应验证实际运行标志、隔离状态和失败回退。没有Mac/Xcode与真机证据，私人ZIP只能称待编译源码包。</w:t>
+      </w:r>
+    </w:p>
+    <w:p>
+      <w:r>
+        <w:br w:type="page"/>
+      </w:r>
+    </w:p>
+    <w:p>
+      <w:pPr>
+        <w:pStyle w:val="Heading1"/>
+      </w:pPr>
+      <w:r>
+        <w:t>2026年9月9日 后台通知隐藏心情标签</w:t>
+      </w:r>
+    </w:p>
+    <w:p>
+      <w:r>
+        <w:t>通知展示和同步原文必须分离。隐藏元数据应在通知拆句、条数限制和预览生成之前执行，不能删除 outbox 原文来解决锁屏泄漏，也不能只把预览清空后保留空通知。元数据独占结果应显式记录为无提示完成，不得误计为 APNs 实际发送或触发重复模型计费。</w:t>
+      </w:r>
+    </w:p>
+    <w:p>
+      <w:r>
+        <w:t>只改变服务端通知时核对所有 sendAPNs / persistAndPush 调用者，并分别核对公开与私人云的现行源码。来电、普通动作预览、传输失败、幂等和前台心情同步都需回归。客户端字节未变则保持已发布版本与包，不制造无关新安装包。</w:t>
       </w:r>
     </w:p>
     <w:sectPr>

</xml_diff>

<commit_message>
fix: private v1214 iOS340 battery and companion health freshness
</commit_message>
<xml_diff>
--- a/docs/maintenance/AI开发项目_Bug修改规范.docx
+++ b/docs/maintenance/AI开发项目_Bug修改规范.docx
@@ -10792,6 +10792,29 @@
     <w:p>
       <w:r>
         <w:t>只改变服务端通知时核对所有 sendAPNs / persistAndPush 调用者，并分别核对公开与私人云的现行源码。来电、普通动作预览、传输失败、幂等和前台心情同步都需回归。客户端字节未变则保持已发布版本与包，不制造无关新安装包。</w:t>
+      </w:r>
+    </w:p>
+    <w:p>
+      <w:r>
+        <w:br w:type="page"/>
+      </w:r>
+    </w:p>
+    <w:p>
+      <w:pPr>
+        <w:pStyle w:val="Heading1"/>
+      </w:pPr>
+      <w:r>
+        <w:t>2026年9月9日 私人电量与睡眠刷新 v1214</w:t>
+      </w:r>
+    </w:p>
+    <w:p>
+      <w:r>
+        <w:t>轻量快照内可以刷新UIDevice电量，不能把HealthKit、定位或Screen Time全量查询一起加入高频状态轮询。缓存的采集时间不能因传输包装而变新。被动页面刷新不得替用户开启健康权限；健康查询要保留频率限制、超时和失败旧值边界。</w:t>
+      </w:r>
+    </w:p>
+    <w:p>
+      <w:r>
+        <w:t>不得把同步修复等同于健康统计差值修复。先区分读取时刻、样本来源与区间合计，不能固定补分钟。私人独立升级必须同时核对壳启动标识、APP_VER、核心资源URL、原生所有Target版本；未变共享资源继续采用原版本，公开版本不跟随私人升级。</w:t>
       </w:r>
     </w:p>
     <w:sectPr>

</xml_diff>

<commit_message>
release: v1216 web delivery and private iOS341 lock notifications
</commit_message>
<xml_diff>
--- a/docs/maintenance/AI开发项目_Bug修改规范.docx
+++ b/docs/maintenance/AI开发项目_Bug修改规范.docx
@@ -10815,6 +10815,110 @@
     <w:p>
       <w:r>
         <w:t>不得把同步修复等同于健康统计差值修复。先区分读取时刻、样本来源与区间合计，不能固定补分钟。私人独立升级必须同时核对壳启动标识、APP_VER、核心资源URL、原生所有Target版本；未变共享资源继续采用原版本，公开版本不跟随私人升级。</w:t>
+      </w:r>
+    </w:p>
+    <w:p>
+      <w:pPr>
+        <w:pStyle w:val="Heading2"/>
+      </w:pPr>
+      <w:r>
+        <w:t>2026-09-09 公开版 DeviceActivityReport 同步规则</w:t>
+      </w:r>
+    </w:p>
+    <w:p>
+      <w:pPr>
+        <w:spacing w:after="120"/>
+      </w:pPr>
+      <w:r>
+        <w:t>1. 普通 App Store 授权为 approved 时，必须使用 DeviceActivityReport 扩展读取当日使用数据；不得因没有 approvedWithDataAccess 就把真实数据宣称为不可用。</w:t>
+      </w:r>
+    </w:p>
+    <w:p>
+      <w:pPr>
+        <w:spacing w:after="120"/>
+      </w:pPr>
+      <w:r>
+        <w:t>2. 主 App 只能接受 requestID 与当次请求一致且 generatedAt 不早于 requestedAt 的报告，不得把旧报告当成新同步成功。</w:t>
+      </w:r>
+    </w:p>
+    <w:p>
+      <w:pPr>
+        <w:spacing w:after="120"/>
+      </w:pPr>
+      <w:r>
+        <w:t>3. 可被情侣空间接受的屏幕时长载荷必须包含 usageDay、timeZone、usageRevision、generatedAt；缺失时不得用 0 充当真实值。</w:t>
+      </w:r>
+    </w:p>
+    <w:p>
+      <w:pPr>
+        <w:spacing w:after="120"/>
+      </w:pPr>
+      <w:r>
+        <w:t>4. APNs 后台命令必须优先处理；命令拉取失败不应无条件阻断已有当日快照的上传。可重试操作必须幂等，并在 iOS 后台时间窗内有界完成。</w:t>
+      </w:r>
+    </w:p>
+    <w:p>
+      <w:pPr>
+        <w:spacing w:after="120"/>
+      </w:pPr>
+      <w:r>
+        <w:t>5. 远程限额必须先确认 Family Controls 授权，启动监控时应明确决定当日已有使用时长是否计入；本项目的“每日限额”使用 includesPastActivity=true。</w:t>
+      </w:r>
+    </w:p>
+    <w:p>
+      <w:pPr>
+        <w:pStyle w:val="Heading2"/>
+      </w:pPr>
+      <w:r>
+        <w:t>2026年9月9日 私人锁定角色名字与批量解锁修复</w:t>
+      </w:r>
+    </w:p>
+    <w:p>
+      <w:r>
+        <w:t>显示锁定发起人必须沿真实命令来源传递；不得只凭 actor 非空把主人操作归因角色，不凭空补旧事件来源。共享存储先写名字再应用锁定，并保留原子回滚和解锁清理。</w:t>
+      </w:r>
+    </w:p>
+    <w:p>
+      <w:r>
+        <w:t>批量按钮语义必须在事件产生处保留：一次操作一个事件 ID，成员 ID 可审计；不可按相近时间合并多次独立操作。前后台投递应复用同一事件去重，提示回应整体而非名单，生成失败不以固定台词冒充批量角色回复。</w:t>
+      </w:r>
+    </w:p>
+    <w:p>
+      <w:r>
+        <w:t>Word 本次仅追加并验证旧段落保留；缺少 soffice，未完成视觉渲染。项目说明、Bug记录、规范均已核对更新；启动说明没有新的入口规则，未改。</w:t>
+      </w:r>
+    </w:p>
+    <w:p>
+      <w:pPr>
+        <w:pStyle w:val="Heading2"/>
+      </w:pPr>
+      <w:r>
+        <w:t>2026年9月9日 v1216 网页与私人汇总发布</w:t>
+      </w:r>
+    </w:p>
+    <w:p>
+      <w:r>
+        <w:t>用户授权将未打包修复及外卖新改动一起打包推送网页和私人，公开 North App 不打包。网页及私人内置 v1216，私人 iOS1.0.341（341），桥36。公开原生两文件及三个专属测试保留现场，不混入本次发布提交或包。</w:t>
+      </w:r>
+    </w:p>
+    <w:p>
+      <w:r>
+        <w:t>外卖店内搜索和连续对话为两边共有；私人保留电量健康刷新、角色锁定名字、批量解锁一次事件及自然回应，以及智能家居、门锁和手表健康。私人 phone-role-push 已部署 ACTIVE34，下载源码与本地一致，verify_jwt仍为false。公开通知后台不动。</w:t>
+      </w:r>
+    </w:p>
+    <w:p>
+      <w:r>
+        <w:t>完整1709项及外卖服务160项通过；双入口既有授权和笔记的正常聊天门禁通过，页面错误0。线上外卖指向本机8788，经确认无进行中连接后仅重启该服务加载当前代码；本机和公网health均返回ok。没有真实下单、支付或调用真实模型。</w:t>
+      </w:r>
+    </w:p>
+    <w:p>
+      <w:r>
+        <w:t>版本机械更新曾误碰非版本340数值，已按差异还原婚书宽度与测试数据；打包检查捕获旧入口版本断言和Mac说明未对齐，现已逐一核对修正。源码ZIP必须从选定干净提交生成并逐文件反向核验；不覆盖旧包。实际提交、Pages和包哈希见发布结果。</w:t>
+      </w:r>
+    </w:p>
+    <w:p>
+      <w:r>
+        <w:t>本次私人仍为Mac待编译源码，不是IPA，尚未Mac编译签名或真实iPhone验收。Word仅追加并保留历史，环境无soffice，视觉渲染未完成。</w:t>
       </w:r>
     </w:p>
     <w:sectPr>

</xml_diff>

<commit_message>
release: v1223 chat regeneration and private iOS346 home integration
</commit_message>
<xml_diff>
--- a/docs/maintenance/AI开发项目_Bug修改规范.docx
+++ b/docs/maintenance/AI开发项目_Bug修改规范.docx
@@ -10919,6 +10919,42 @@
     <w:p>
       <w:r>
         <w:t>本次私人仍为Mac待编译源码，不是IPA，尚未Mac编译签名或真实iPhone验收。Word仅追加并保留历史，环境无soffice，视觉渲染未完成。</w:t>
+      </w:r>
+    </w:p>
+    <w:p>
+      <w:pPr>
+        <w:pStyle w:val="Heading2"/>
+      </w:pPr>
+      <w:r>
+        <w:t>2026年9月9日 重新生成与前后台防重复规则</w:t>
+      </w:r>
+    </w:p>
+    <w:p>
+      <w:r>
+        <w:t>凡涉及回复完成标记、源消息所有权或接力去重，必须额外验证重新生成、删除回复后手动恢复、失败重试及重载旧存档；首次回复成功不能代替完整生命周期验收。</w:t>
+      </w:r>
+    </w:p>
+    <w:p>
+      <w:r>
+        <w:t>显式重新生成与后台旧消息重放必须区分。不应直接清空完成标记、改写用户消息ID或关闭全局去重。保留旧任务完成事实，只允许受限的新本地尝试；同时覆盖同源并发、迟到outbox、旧队列和账号/角色边界。真实夹具必须只计算模型HTTP请求，不混入取消后台任务等RPC。</w:t>
+      </w:r>
+    </w:p>
+    <w:p>
+      <w:pPr>
+        <w:pStyle w:val="Heading2"/>
+      </w:pPr>
+      <w:r>
+        <w:t>2026年9月9日 汇总发布的前置依赖和智能家居隔离</w:t>
+      </w:r>
+    </w:p>
+    <w:p>
+      <w:r>
+        <w:t>私人通知头像客户端保护依赖私人数据库trigger。新包交付前必须先验证正式后台前置已经应用，不把SQL在ZIP内当成云端已生效。核对原RPC定义不变，并以临时数据事务回滚验证，禁止跨账号照片回退。</w:t>
+      </w:r>
+    </w:p>
+    <w:p>
+      <w:r>
+        <w:t>家居汇总必须核对真实私人入口的灯、锁、空调按钮、加载脚本、桥注册与角色提示词，同时确认网页不加载私人扩展；文件存在和测试总数不能代替入口可见性。公开North未完成原生现场不得混入。</w:t>
       </w:r>
     </w:p>
     <w:sectPr>

</xml_diff>

<commit_message>
release: v1225 daily events and offline control fixes for private iOS348
</commit_message>
<xml_diff>
--- a/docs/maintenance/AI开发项目_Bug修改规范.docx
+++ b/docs/maintenance/AI开发项目_Bug修改规范.docx
@@ -10955,6 +10955,29 @@
     <w:p>
       <w:r>
         <w:t>家居汇总必须核对真实私人入口的灯、锁、空调按钮、加载脚本、桥注册与角色提示词，同时确认网页不加载私人扩展；文件存在和测试总数不能代替入口可见性。公开North未完成原生现场不得混入。</w:t>
+      </w:r>
+    </w:p>
+    <w:p>
+      <w:pPr>
+        <w:pStyle w:val="Heading2"/>
+      </w:pPr>
+      <w:r>
+        <w:t>2026年9月9日 事件记录与角色控制边界</w:t>
+      </w:r>
+    </w:p>
+    <w:p>
+      <w:r>
+        <w:t>隐藏模型元数据须同时覆盖正常解析、原文显示、旧档渲染和格式判断；只隐藏角色侧元数据，不改写用户原话。自然语言控制不得先删除问号再判断意图，用户全量要求不能扩大角色实际局部指令；执行路径及回退路径均应保留拒绝和条件语义。</w:t>
+      </w:r>
+    </w:p>
+    <w:p>
+      <w:r>
+        <w:t>新记忆模块必须默认可关闭、账号角色隔离、限制存储与注入长度，保留原话证据及不同时间含义，未知不得补造。只能在可见回复提交后记账；切号、清理、编辑与关闭使旧草稿失效。验证额外请求时隔离既有定时任务，不能为了测试通过删改其他功能。</w:t>
+      </w:r>
+    </w:p>
+    <w:p>
+      <w:r>
+        <w:t>新脚本处于被忽略的私人bundle目录时，后续发布必须显式核对归档/跟踪白名单，不能靠git status判断齐全；禁止用网页整份脚本覆盖私人差异。并行空调与公开North现场保留。维护Word仅追加且历史核验，当前缺少捆绑LibreOffice，未完成视觉渲染。</w:t>
       </w:r>
     </w:p>
     <w:sectPr>

</xml_diff>

<commit_message>
release: v1229 voice delivery and event ledger icon for private iOS351
</commit_message>
<xml_diff>
--- a/docs/maintenance/AI开发项目_Bug修改规范.docx
+++ b/docs/maintenance/AI开发项目_Bug修改规范.docx
@@ -10978,6 +10978,62 @@
     <w:p>
       <w:r>
         <w:t>新脚本处于被忽略的私人bundle目录时，后续发布必须显式核对归档/跟踪白名单，不能靠git status判断齐全；禁止用网页整份脚本覆盖私人差异。并行空调与公开North现场保留。维护Word仅追加且历史核验，当前缺少捆绑LibreOffice，未完成视觉渲染。</w:t>
+      </w:r>
+    </w:p>
+    <w:p>
+      <w:r>
+        <w:br w:type="page"/>
+      </w:r>
+    </w:p>
+    <w:p>
+      <w:pPr>
+        <w:pStyle w:val="Heading1"/>
+      </w:pPr>
+      <w:r>
+        <w:t>v1228 语音格式回归核验 2026年9月9日</w:t>
+      </w:r>
+    </w:p>
+    <w:p>
+      <w:r>
+        <w:t>语音修复必须覆盖截图原话及无标点称呼、主动与明确两入口、原样输出两态、自动频率0、缺译文、纠正仍失败、普通聊天和否定语句。测试必须使用实际标签解析与消息落库，不用返回空对象的假解析器证明语音可用。</w:t>
+      </w:r>
+    </w:p>
+    <w:p>
+      <w:r>
+        <w:t>旧版可用是现场线索而非整版正确的证明。逐函数核对历史版本，明确哪些函数未变、哪些后处理改变及设置变量差异。保留TTS base/key/model/voice，不伪造翻译和语音成功；修复请求有界并告知额外成本。</w:t>
+      </w:r>
+    </w:p>
+    <w:p>
+      <w:r>
+        <w:t>跨网页/私人同步须逐一核对作用域和现有诊断包装层，不能假设同名变量都存在；先语法检查，再实际双入口聊天，失败即阻止发布。</w:t>
+      </w:r>
+    </w:p>
+    <w:p>
+      <w:r>
+        <w:t>详见 docs/maintenance/v1228_语音格式回归核验_未发布.md。本轮仅本地候选，未提交、打包或推送；真实模型与语音服务、Mac编译签名及真实iPhone播放尚未验证。</w:t>
+      </w:r>
+    </w:p>
+    <w:p>
+      <w:r>
+        <w:br w:type="page"/>
+      </w:r>
+    </w:p>
+    <w:p>
+      <w:pPr>
+        <w:pStyle w:val="Heading1"/>
+      </w:pPr>
+      <w:r>
+        <w:t>v1229 语音与日常事件簿汇总 2026年9月9日</w:t>
+      </w:r>
+    </w:p>
+    <w:p>
+      <w:r>
+        <w:t>判断漏包应核验用户对应ZIP的脚本、入口引用、UI路由和实际运行版本，不用源码存在代替包内证据。图标复用既有SVG映射；新包须从提交HEAD制作，逐文件哈希验证并用解压后的入口进行实际浏览器检查。安装说明需明确当前版含哪些功能，将旧不适用说明标为历史。</w:t>
+      </w:r>
+    </w:p>
+    <w:p>
+      <w:r>
+        <w:t>详见v1229_语音与事件簿发布核验.md。实际打包推送结果另记，未完成前不能称已上线。模型、音频及原生传输为隔离测试，Mac签名编译、真实iPhone和真实声音未验证；维护文档已保留历史正文，缺少捆绑LibreOffice，版式渲染未验收。</w:t>
       </w:r>
     </w:p>
     <w:sectPr>

</xml_diff>

<commit_message>
fix(private-ios): sequence screen-time report refresh and coalesce reads (352)
</commit_message>
<xml_diff>
--- a/docs/maintenance/AI开发项目_Bug修改规范.docx
+++ b/docs/maintenance/AI开发项目_Bug修改规范.docx
@@ -11034,6 +11034,29 @@
     <w:p>
       <w:r>
         <w:t>详见v1229_语音与事件簿发布核验.md。实际打包推送结果另记，未完成前不能称已上线。模型、音频及原生传输为隔离测试，Mac签名编译、真实iPhone和真实声音未验证；维护文档已保留历史正文，缺少捆绑LibreOffice，版式渲染未验收。</w:t>
+      </w:r>
+    </w:p>
+    <w:p>
+      <w:r>
+        <w:br w:type="page"/>
+      </w:r>
+    </w:p>
+    <w:p>
+      <w:pPr>
+        <w:pStyle w:val="Heading1"/>
+      </w:pPr>
+      <w:r>
+        <w:t>私人 iOS352 屏幕同步修复候选 2026年9月10日</w:t>
+      </w:r>
+    </w:p>
+    <w:p>
+      <w:r>
+        <w:t>可见报告数字不代表主App已收到当前快照，更不代表云端同步成功。写请求必须先于触发刷新，多入口读取须合并，严格保留请求编号与时间校验，不用旧值或零值伪装成功。纠正历史资料中过强的全球回传假设：Apple DTS明确报告扩展沙箱限制导出；既有App Group兼容行为不能保证所有系统环境支持。缺少真机证据时标记修复候选，检查系统、Team、各Target签名与匿名诊断，不盲目重置权限或清空数据。</w:t>
+      </w:r>
+    </w:p>
+    <w:p>
+      <w:r>
+        <w:t>完整证据见私人_iOS352_屏幕同步修复核验.md。Apple DTS：https://developer.apple.com/forums/thread/817516 。打包与推送状态以实际发布结果为准；源码包不是可直接安装IPA。维护历史正文逐节点保留，捆绑LibreOffice缺失，文档版式未完成渲染验收。</w:t>
       </w:r>
     </w:p>
     <w:sectPr>

</xml_diff>

<commit_message>
fix(chat): separate cohab request deadlines and release v1232 iOS355
</commit_message>
<xml_diff>
--- a/docs/maintenance/AI开发项目_Bug修改规范.docx
+++ b/docs/maintenance/AI开发项目_Bug修改规范.docx
@@ -11057,6 +11057,38 @@
     <w:p>
       <w:r>
         <w:t>完整证据见私人_iOS352_屏幕同步修复核验.md。Apple DTS：https://developer.apple.com/forums/thread/817516 。打包与推送状态以实际发布结果为准；源码包不是可直接安装IPA。维护历史正文逐节点保留，捆绑LibreOffice缺失，文档版式未完成渲染验收。</w:t>
+      </w:r>
+    </w:p>
+    <w:p>
+      <w:pPr>
+        <w:spacing w:after="120"/>
+      </w:pPr>
+      <w:r>
+        <w:t xml:space="preserve">2026年9月11日 v1232 共同生活回复等待修复 私人 iOS355 原生桥37</w:t>
+      </w:r>
+    </w:p>
+    <w:p>
+      <w:pPr>
+        <w:spacing w:after="120"/>
+      </w:pPr>
+      <w:r>
+        <w:t xml:space="preserve">异步回复规则：单次网络请求及完整响应正文的超时，必须与页面后台恢复取消使用不同错误码。前台超时可依已有配置进入一次辅助模型兜底；后台取消不能触发后台重试或迟到内容落地。</w:t>
+      </w:r>
+    </w:p>
+    <w:p>
+      <w:pPr>
+        <w:spacing w:after="120"/>
+      </w:pPr>
+      <w:r>
+        <w:t xml:space="preserve">分段续写规则：首段和续写各自遵守有限等待，不以一个外层总计时误杀仍在期限内的续写，也不得以无限等待替代修复。共享chatAPI默认调用仍保持原行为，只有指定线下请求启用相应生命周期管理。</w:t>
+      </w:r>
+    </w:p>
+    <w:p>
+      <w:pPr>
+        <w:spacing w:after="120"/>
+      </w:pPr>
+      <w:r>
+        <w:t xml:space="preserve">证据规则：测试连接的短请求和HTTP成功状态不代表真实长上下文回复成功。区分客户端到期、后台取消、HTTP失败及内容拦截；诊断只保存错误类别和耗时，不记录密钥或完整用户内容。</w:t>
       </w:r>
     </w:p>
     <w:sectPr>

</xml_diff>

<commit_message>
fix: make full backup saving explicit and bound imported image cache (v1233)
</commit_message>
<xml_diff>
--- a/docs/maintenance/AI开发项目_Bug修改规范.docx
+++ b/docs/maintenance/AI开发项目_Bug修改规范.docx
@@ -11089,6 +11089,16 @@
       </w:pPr>
       <w:r>
         <w:t xml:space="preserve">证据规则：测试连接的短请求和HTTP成功状态不代表真实长上下文回复成功。区分客户端到期、后台取消、HTTP失败及内容拦截；诊断只保存错误类别和耗时，不记录密钥或完整用户内容。</w:t>
+      </w:r>
+    </w:p>
+    <w:p>
+      <w:r>
+        <w:t>2026-09-11 完整备份兼容性规则</w:t>
+      </w:r>
+    </w:p>
+    <w:p>
+      <w:r>
+        <w:t>异步生成完整备份后，应提供明确的用户保存动作与失败反馈；download属性不是系统已经保存的证明。移动浏览器文件分享必须检测文件分享能力并在用户点击中调用。导入大图写入成功才替换原文，避免缓存整个备份后才释放；不得删除持久化图片以解决内存压力。</w:t>
       </w:r>
     </w:p>
     <w:sectPr>

</xml_diff>

<commit_message>
fix: add Huawei Edge backup export fallbacks (v1234)
</commit_message>
<xml_diff>
--- a/docs/maintenance/AI开发项目_Bug修改规范.docx
+++ b/docs/maintenance/AI开发项目_Bug修改规范.docx
@@ -11099,6 +11099,16 @@
     <w:p>
       <w:r>
         <w:t>异步生成完整备份后，应提供明确的用户保存动作与失败反馈；download属性不是系统已经保存的证明。移动浏览器文件分享必须检测文件分享能力并在用户点击中调用。导入大图写入成功才替换原文，避免缓存整个备份后才释放；不得删除持久化图片以解决内存压力。</w:t>
+      </w:r>
+    </w:p>
+    <w:p>
+      <w:r>
+        <w:t xml:space="preserve">2026-09-11 移动浏览器完整备份导出规则</w:t>
+      </w:r>
+    </w:p>
+    <w:p>
+      <w:r>
+        <w:t xml:space="preserve">完整备份不能只依赖 blob URL 和 download 属性。异步生成期间必须显示持续状态；生成后应在新的用户点击中调用经过 canShare 检测的系统文件分享。面向 Chromium 移动端的分享文件优先使用公开允许的 text/plain 和 .txt，导入端必须接受同一格式。测试线上入口时必须保留 Service Worker 控制状态；northPreview 只能验证页面逻辑，不能证明正式下载链路。含模型密钥的整包备份不得为下载方便长期写入 Cache Storage。</w:t>
       </w:r>
     </w:p>
     <w:sectPr>

</xml_diff>

<commit_message>
fix: restore one-tap full backup download (v1236)
</commit_message>
<xml_diff>
--- a/docs/maintenance/AI开发项目_Bug修改规范.docx
+++ b/docs/maintenance/AI开发项目_Bug修改规范.docx
@@ -11109,6 +11109,34 @@
     <w:p>
       <w:r>
         <w:t xml:space="preserve">完整备份不能只依赖 blob URL 和 download 属性。异步生成期间必须显示持续状态；生成后应在新的用户点击中调用经过 canShare 检测的系统文件分享。面向 Chromium 移动端的分享文件优先使用公开允许的 text/plain 和 .txt，导入端必须接受同一格式。测试线上入口时必须保留 Service Worker 控制状态；northPreview 只能验证页面逻辑，不能证明正式下载链路。含模型密钥的整包备份不得为下载方便长期写入 Cache Storage。</w:t>
+      </w:r>
+    </w:p>
+    <w:p>
+      <w:pPr>
+        <w:pStyle w:val="Heading1"/>
+      </w:pPr>
+      <w:r>
+        <w:t xml:space="preserve">2026-09-11 v1236 华为 Edge 完整备份导出回归</w:t>
+      </w:r>
+    </w:p>
+    <w:p>
+      <w:r>
+        <w:t xml:space="preserve">本次按真实时间边界回溯：先核对同设备上午成功时的线上版本，再比较 v1232、v1233、v1234 导出实现。已被真机证明的 v1232 自动下载路径优先于桌面用户代理模拟结论。</w:t>
+      </w:r>
+    </w:p>
+    <w:p>
+      <w:r>
+        <w:t xml:space="preserve">失败方案必须保留记录：v1233 二次点击弹窗、v1234 TXT/系统分享以及已撤销的 Cache Storage 下载都不能作为华为 Edge 真机已修复的证据。</w:t>
+      </w:r>
+    </w:p>
+    <w:p>
+      <w:r>
+        <w:t xml:space="preserve">发布保护：在独立 Git 工作区从线上提交构建 v1236，不复制、不暂存、不覆盖主工作区并行的 v1235/iOS356 改动。网页可见逻辑同步到私人内置源码，但不生成私人包，原生版本仍为 iOS 1.0.355（355）、桥 37。</w:t>
+      </w:r>
+    </w:p>
+    <w:p>
+      <w:r>
+        <w:t xml:space="preserve">v1236 发布前验证：全量 Node 测试 1811/1811 通过，授权聊天发布闸门和两个入口的完整备份浏览器回归通过。目标华为真机落盘仍是发布后的独立验收项。</w:t>
       </w:r>
     </w:p>
     <w:sectPr>

</xml_diff>

<commit_message>
fix: stream large backup files without whole JSON strings (v1237)
</commit_message>
<xml_diff>
--- a/docs/maintenance/AI开发项目_Bug修改规范.docx
+++ b/docs/maintenance/AI开发项目_Bug修改规范.docx
@@ -11137,6 +11137,21 @@
     <w:p>
       <w:r>
         <w:t xml:space="preserve">v1236 发布前验证：全量 Node 测试 1811/1811 通过，授权聊天发布闸门和两个入口的完整备份浏览器回归通过。目标华为真机落盘仍是发布后的独立验收项。</w:t>
+      </w:r>
+    </w:p>
+    <w:p>
+      <w:r>
+        <w:t>2026-09-12 大备份内存边界与证据纠正规则</w:t>
+      </w:r>
+    </w:p>
+    <w:p>
+      <w:r>
+        <w:t>发生 Invalid string length 时先区分备份生成和下载阶段。禁止把完整媒体备份拼成一个 JSON 字符串，也不要先读整份文件再在保存期间持有原始文本。分段编码与读取必须保留旧 JSON 语义、Unicode边界、失败不替换原状态及未提交图片的GC保护。</w:t>
+      </w:r>
+    </w:p>
+    <w:p>
+      <w:r>
+        <w:t>移动端备份验收必须覆盖超过旧路径实际字符串上限的输出、真实文件选择器、全新存储导入及重载数据验证；16 MB 小样本与直接调用 applyFullBackupData 不能证明真实大文件导入入口安全。时间先后不能排除数据量、内容、运行内存等变量；旧结论被新证据推翻时追加明确更正，不能继续称目标设备已修好。</w:t>
       </w:r>
     </w:p>
     <w:sectPr>

</xml_diff>

<commit_message>
fix: budget backup yielding and wait for archive restoration (v1238)
</commit_message>
<xml_diff>
--- a/docs/maintenance/AI开发项目_Bug修改规范.docx
+++ b/docs/maintenance/AI开发项目_Bug修改规范.docx
@@ -11152,6 +11152,21 @@
     <w:p>
       <w:r>
         <w:t>移动端备份验收必须覆盖超过旧路径实际字符串上限的输出、真实文件选择器、全新存储导入及重载数据验证；16 MB 小样本与直接调用 applyFullBackupData 不能证明真实大文件导入入口安全。时间先后不能排除数据量、内容、运行内存等变量；旧结论被新证据推翻时追加明确更正，不能继续称目标设备已修好。</w:t>
+      </w:r>
+    </w:p>
+    <w:p>
+      <w:r>
+        <w:t>2026-09-12 分段算法必须覆盖字段密度与加载阶段</w:t>
+      </w:r>
+    </w:p>
+    <w:p>
+      <w:r>
+        <w:t>分段处理不能按少量短字段就无条件setTimeout；移动浏览器的定时器等待会累积到几十秒。让出线程应按累计工作耗时控制，同时测试少字段大媒体和多字段聊天存档。页面ready不等于归档恢复完成，导入、验收和数据数量核对必须区分这两个阶段。测试必须确认导入成功，不能把失败后仍留在内存的旧夹具当成功。</w:t>
+      </w:r>
+    </w:p>
+    <w:p>
+      <w:r>
+        <w:t>再次失败时记录被否定版本和测试盲区，保留真实设备未验证边界。原本正确的分块输出与JSON兼容应保留，不能用回退整份JSON.stringify重新引入已证实的字符串上限错误。</w:t>
       </w:r>
     </w:p>
     <w:sectPr>

</xml_diff>

<commit_message>
feat: add bounded browser runtime diagnostics (v1239)
</commit_message>
<xml_diff>
--- a/docs/maintenance/AI开发项目_Bug修改规范.docx
+++ b/docs/maintenance/AI开发项目_Bug修改规范.docx
@@ -11167,6 +11167,41 @@
     <w:p>
       <w:r>
         <w:t>再次失败时记录被否定版本和测试盲区，保留真实设备未验证边界。原本正确的分块输出与JSON兼容应保留，不能用回退整份JSON.stringify重新引入已证实的字符串上限错误。</w:t>
+      </w:r>
+    </w:p>
+    <w:p>
+      <w:r>
+        <w:t>2026-09-12 v1239 浏览器运行诊断 仅诊断</w:t>
+      </w:r>
+    </w:p>
+    <w:p>
+      <w:r>
+        <w:t>用户反馈多人网页卡顿、桌面图标显示异常，以及共同生活入口提示 Maximum call stack size exceeded。该提示证明入口调用栈溢出，但截图不能给出具体递归函数；不能将所有卡顿、图片缺失或页面消失归结为同一个错误，也不能把用户自己的v1238成功推广为其他存档成功。</w:t>
+      </w:r>
+    </w:p>
+    <w:p>
+      <w:r>
+        <w:t>本次采用先取证的不同方案，未改变共同生活业务、桌面布局、模型请求或存档格式。新增设置→授权与数据→浏览器运行诊断，可复制本机错误分类和经过白名单提取的脚本行号与调用帧、版本、图片状态、桌面几何、前台定时器延迟与备份阶段。入口捕获的异常需显式记录，不能仅依赖全局error。</w:t>
+      </w:r>
+    </w:p>
+    <w:p>
+      <w:r>
+        <w:t>记录最多64项，持久文本上限48000字符；不读取聊天正文、角色名字、密钥、完整网址或图片内容，不全量扫描S。大量图片阶段切换仅在内存更新，最多安排一次延迟写入；诊断存储失败不影响业务。重开读取上次记录，但多标签页可能覆盖，系统直接关闭和内存回收不一定留下证据，缺少正常结束记录不能当作已证实崩溃。</w:t>
+      </w:r>
+    </w:p>
+    <w:p>
+      <w:r>
+        <w:t>验证：v1238实际页面缺少诊断入口，新浏览器回归在旧版失败。Edge和桌面WebKit的网页及私人内置入口通过：实际共同生活入口注入递归异常后留下分类、重载保留记录、剪贴板拒绝时可长按复制、敏感错误文本不进入报告。另测64项与48000字符上限、前后台延迟区分和高频图片阶段零同步写入。</w:t>
+      </w:r>
+    </w:p>
+    <w:p>
+      <w:r>
+        <w:t>回归：网页和私人内置授权聊天闸门通过。1万条聊天48张不同图片，Edge导出684ms、导入并重载1349ms，WebKit导出2646ms、导入并重载7182ms，10000条与48张完整保留；启用Service Worker的文件备份检查也通过。目标手机具体根因尚未取得诊断，真实iPhone、安卓、模型及Mac编译未验证。</w:t>
+      </w:r>
+    </w:p>
+    <w:p>
+      <w:r>
+        <w:t>发布身份：网页及私人内置源码v1239，原生iOS1.0.355（355）、桥37不变，不制作私人包。全量测试与实际Pages发布结果见v1239_浏览器运行诊断核验.md。DOCX仅追加并验证历史正文与其余ZIP成员保留；缺少LibreOffice，未完成页面渲染验收。</w:t>
       </w:r>
     </w:p>
     <w:sectPr>

</xml_diff>